<commit_message>
Add detailed task explanations, actions, and observations under each screenshot
</commit_message>
<xml_diff>
--- a/week 1/lab1.docx
+++ b/week 1/lab1.docx
@@ -10,7 +10,7 @@
         <w:rPr>
           <w:b/>
           <w:color w:val="1A237E"/>
-          <w:sz w:val="40"/>
+          <w:sz w:val="44"/>
         </w:rPr>
         <w:t>Operating Systems, Security and Network</w:t>
       </w:r>
@@ -21,10 +21,24 @@
       </w:pPr>
       <w:r>
         <w:rPr>
-          <w:color w:val="455A64"/>
-          <w:sz w:val="24"/>
+          <w:b/>
+          <w:color w:val="37474F"/>
+          <w:sz w:val="26"/>
         </w:rPr>
-        <w:t>Week 1 Lab Report: Linux Fundamentals (Files, APT &amp; C Programming)</w:t>
+        <w:t>Lab Report 1: Linux Fundamentals (Files, APT &amp; C Programming)</w:t>
+      </w:r>
+    </w:p>
+    <w:p>
+      <w:pPr>
+        <w:jc w:val="center"/>
+      </w:pPr>
+      <w:r>
+        <w:rPr>
+          <w:i/>
+          <w:color w:val="78909C"/>
+          <w:sz w:val="20"/>
+        </w:rPr>
+        <w:t>Student Name: Dibij | Course: Operating Systems, Security and Network Softwarica</w:t>
       </w:r>
     </w:p>
     <w:p/>
@@ -33,7 +47,7 @@
         <w:rPr>
           <w:b/>
           <w:color w:val="0D47A1"/>
-          <w:sz w:val="26"/>
+          <w:sz w:val="28"/>
         </w:rPr>
         <w:t>Part I: File Operations</w:t>
       </w:r>
@@ -42,7 +56,8 @@
       <w:r>
         <w:rPr>
           <w:b/>
-          <w:sz w:val="22"/>
+          <w:color w:val="212121"/>
+          <w:sz w:val="23"/>
         </w:rPr>
         <w:t>Task 1.1: Create and Navigate to Lab Directory</w:t>
       </w:r>
@@ -79,6 +94,8 @@
               <w:t>mkdir ~/linux_lab</w:t>
               <w:br/>
               <w:t>cd ~/linux_lab</w:t>
+              <w:br/>
+              <w:t>pwd</w:t>
             </w:r>
           </w:p>
         </w:tc>
@@ -107,7 +124,7 @@
             <w:r>
               <w:drawing>
                 <wp:inline xmlns:a="http://schemas.openxmlformats.org/drawingml/2006/main" xmlns:pic="http://schemas.openxmlformats.org/drawingml/2006/picture">
-                  <wp:extent cx="5486400" cy="990228"/>
+                  <wp:extent cx="5669280" cy="1023235"/>
                   <wp:docPr id="1" name="Picture 1"/>
                   <wp:cNvGraphicFramePr>
                     <a:graphicFrameLocks noChangeAspect="1"/>
@@ -116,7 +133,7 @@
                     <a:graphicData uri="http://schemas.openxmlformats.org/drawingml/2006/picture">
                       <pic:pic>
                         <pic:nvPicPr>
-                          <pic:cNvPr id="0" name="step1_mkdir_cd.png"/>
+                          <pic:cNvPr id="0" name="step1.png"/>
                           <pic:cNvPicPr/>
                         </pic:nvPicPr>
                         <pic:blipFill>
@@ -128,7 +145,7 @@
                         <pic:spPr>
                           <a:xfrm>
                             <a:off x="0" y="0"/>
-                            <a:ext cx="5486400" cy="990228"/>
+                            <a:ext cx="5669280" cy="1023235"/>
                           </a:xfrm>
                           <a:prstGeom prst="rect"/>
                         </pic:spPr>
@@ -143,13 +160,75 @@
       </w:tr>
     </w:tbl>
     <w:p/>
+    <w:tbl>
+      <w:tblPr>
+        <w:tblW w:type="auto" w:w="0"/>
+        <w:jc w:val="center"/>
+        <w:tblLook w:firstColumn="1" w:firstRow="1" w:lastColumn="0" w:lastRow="0" w:noHBand="0" w:noVBand="1" w:val="04A0"/>
+      </w:tblPr>
+      <w:tblGrid>
+        <w:gridCol w:w="8640"/>
+      </w:tblGrid>
+      <w:tr>
+        <w:tc>
+          <w:tcPr>
+            <w:tcW w:type="dxa" w:w="9360"/>
+            <w:shd w:fill="FFFFFF"/>
+          </w:tcPr>
+          <w:p>
+            <w:r>
+              <w:rPr>
+                <w:b/>
+                <w:color w:val="283593"/>
+                <w:sz w:val="19"/>
+              </w:rPr>
+              <w:t xml:space="preserve">• Action Performed: </w:t>
+            </w:r>
+            <w:r>
+              <w:rPr>
+                <w:color w:val="424242"/>
+                <w:sz w:val="19"/>
+              </w:rPr>
+              <w:t>Created a dedicated working folder 'linux_lab' in the home directory using the 'mkdir' command and switched into it using 'cd'. Checked current working directory with 'pwd'.</w:t>
+            </w:r>
+          </w:p>
+        </w:tc>
+      </w:tr>
+      <w:tr>
+        <w:tc>
+          <w:tcPr>
+            <w:tcW w:type="dxa" w:w="9360"/>
+            <w:shd w:fill="F9FBE7"/>
+          </w:tcPr>
+          <w:p>
+            <w:r>
+              <w:rPr>
+                <w:b/>
+                <w:color w:val="33691E"/>
+                <w:sz w:val="19"/>
+              </w:rPr>
+              <w:t xml:space="preserve">• Observation &amp; Result: </w:t>
+            </w:r>
+            <w:r>
+              <w:rPr>
+                <w:color w:val="424242"/>
+                <w:sz w:val="19"/>
+              </w:rPr>
+              <w:t>The shell prompt updated to '~/linux_lab', and 'pwd' verified the absolute path '/home/dibij/linux_lab', confirming successful creation and entry.</w:t>
+            </w:r>
+          </w:p>
+        </w:tc>
+      </w:tr>
+    </w:tbl>
+    <w:p/>
     <w:p>
       <w:r>
         <w:rPr>
           <w:b/>
-          <w:sz w:val="22"/>
+          <w:color w:val="212121"/>
+          <w:sz w:val="23"/>
         </w:rPr>
-        <w:t>Task 1.2: Create and Edit File with Nano</w:t>
+        <w:t>Task 1.2: Create and Edit a Text File using Nano</w:t>
       </w:r>
     </w:p>
     <w:tbl>
@@ -182,8 +261,6 @@
                 <w:sz w:val="19"/>
               </w:rPr>
               <w:t>nano greeting.txt</w:t>
-              <w:br/>
-              <w:t># Type: 'Hello Linux!' -&gt; Save (Ctrl+O, Enter) -&gt; Exit (Ctrl+X)</w:t>
             </w:r>
           </w:p>
         </w:tc>
@@ -212,7 +289,7 @@
             <w:r>
               <w:drawing>
                 <wp:inline xmlns:a="http://schemas.openxmlformats.org/drawingml/2006/main" xmlns:pic="http://schemas.openxmlformats.org/drawingml/2006/picture">
-                  <wp:extent cx="5486400" cy="1124043"/>
+                  <wp:extent cx="5669280" cy="1161511"/>
                   <wp:docPr id="2" name="Picture 2"/>
                   <wp:cNvGraphicFramePr>
                     <a:graphicFrameLocks noChangeAspect="1"/>
@@ -221,7 +298,7 @@
                     <a:graphicData uri="http://schemas.openxmlformats.org/drawingml/2006/picture">
                       <pic:pic>
                         <pic:nvPicPr>
-                          <pic:cNvPr id="0" name="step2_nano_greeting.png"/>
+                          <pic:cNvPr id="0" name="step2.png"/>
                           <pic:cNvPicPr/>
                         </pic:nvPicPr>
                         <pic:blipFill>
@@ -233,7 +310,7 @@
                         <pic:spPr>
                           <a:xfrm>
                             <a:off x="0" y="0"/>
-                            <a:ext cx="5486400" cy="1124043"/>
+                            <a:ext cx="5669280" cy="1161511"/>
                           </a:xfrm>
                           <a:prstGeom prst="rect"/>
                         </pic:spPr>
@@ -248,13 +325,75 @@
       </w:tr>
     </w:tbl>
     <w:p/>
+    <w:tbl>
+      <w:tblPr>
+        <w:tblW w:type="auto" w:w="0"/>
+        <w:jc w:val="center"/>
+        <w:tblLook w:firstColumn="1" w:firstRow="1" w:lastColumn="0" w:lastRow="0" w:noHBand="0" w:noVBand="1" w:val="04A0"/>
+      </w:tblPr>
+      <w:tblGrid>
+        <w:gridCol w:w="8640"/>
+      </w:tblGrid>
+      <w:tr>
+        <w:tc>
+          <w:tcPr>
+            <w:tcW w:type="dxa" w:w="9360"/>
+            <w:shd w:fill="FFFFFF"/>
+          </w:tcPr>
+          <w:p>
+            <w:r>
+              <w:rPr>
+                <w:b/>
+                <w:color w:val="283593"/>
+                <w:sz w:val="19"/>
+              </w:rPr>
+              <w:t xml:space="preserve">• Action Performed: </w:t>
+            </w:r>
+            <w:r>
+              <w:rPr>
+                <w:color w:val="424242"/>
+                <w:sz w:val="19"/>
+              </w:rPr>
+              <w:t>Opened the GNU Nano text editor in the terminal to create 'greeting.txt'. Typed the message 'Hello Linux!' inside the file, saved using 'Ctrl+O', and exited using 'Ctrl+X'.</w:t>
+            </w:r>
+          </w:p>
+        </w:tc>
+      </w:tr>
+      <w:tr>
+        <w:tc>
+          <w:tcPr>
+            <w:tcW w:type="dxa" w:w="9360"/>
+            <w:shd w:fill="F9FBE7"/>
+          </w:tcPr>
+          <w:p>
+            <w:r>
+              <w:rPr>
+                <w:b/>
+                <w:color w:val="33691E"/>
+                <w:sz w:val="19"/>
+              </w:rPr>
+              <w:t xml:space="preserve">• Observation &amp; Result: </w:t>
+            </w:r>
+            <w:r>
+              <w:rPr>
+                <w:color w:val="424242"/>
+                <w:sz w:val="19"/>
+              </w:rPr>
+              <w:t>Nano created the buffer 'greeting.txt' and wrote the line into the newly allocated file on the filesystem.</w:t>
+            </w:r>
+          </w:p>
+        </w:tc>
+      </w:tr>
+    </w:tbl>
+    <w:p/>
     <w:p>
       <w:r>
         <w:rPr>
           <w:b/>
-          <w:sz w:val="22"/>
+          <w:color w:val="212121"/>
+          <w:sz w:val="23"/>
         </w:rPr>
-        <w:t>Task 1.3: View File Content</w:t>
+        <w:t>Task 1.3: View File Content using Cat</w:t>
       </w:r>
     </w:p>
     <w:tbl>
@@ -315,7 +454,7 @@
             <w:r>
               <w:drawing>
                 <wp:inline xmlns:a="http://schemas.openxmlformats.org/drawingml/2006/main" xmlns:pic="http://schemas.openxmlformats.org/drawingml/2006/picture">
-                  <wp:extent cx="5486400" cy="722599"/>
+                  <wp:extent cx="5669280" cy="746686"/>
                   <wp:docPr id="3" name="Picture 3"/>
                   <wp:cNvGraphicFramePr>
                     <a:graphicFrameLocks noChangeAspect="1"/>
@@ -324,7 +463,7 @@
                     <a:graphicData uri="http://schemas.openxmlformats.org/drawingml/2006/picture">
                       <pic:pic>
                         <pic:nvPicPr>
-                          <pic:cNvPr id="0" name="step3_cat_greeting.png"/>
+                          <pic:cNvPr id="0" name="step3.png"/>
                           <pic:cNvPicPr/>
                         </pic:nvPicPr>
                         <pic:blipFill>
@@ -336,7 +475,7 @@
                         <pic:spPr>
                           <a:xfrm>
                             <a:off x="0" y="0"/>
-                            <a:ext cx="5486400" cy="722599"/>
+                            <a:ext cx="5669280" cy="746686"/>
                           </a:xfrm>
                           <a:prstGeom prst="rect"/>
                         </pic:spPr>
@@ -351,13 +490,75 @@
       </w:tr>
     </w:tbl>
     <w:p/>
+    <w:tbl>
+      <w:tblPr>
+        <w:tblW w:type="auto" w:w="0"/>
+        <w:jc w:val="center"/>
+        <w:tblLook w:firstColumn="1" w:firstRow="1" w:lastColumn="0" w:lastRow="0" w:noHBand="0" w:noVBand="1" w:val="04A0"/>
+      </w:tblPr>
+      <w:tblGrid>
+        <w:gridCol w:w="8640"/>
+      </w:tblGrid>
+      <w:tr>
+        <w:tc>
+          <w:tcPr>
+            <w:tcW w:type="dxa" w:w="9360"/>
+            <w:shd w:fill="FFFFFF"/>
+          </w:tcPr>
+          <w:p>
+            <w:r>
+              <w:rPr>
+                <w:b/>
+                <w:color w:val="283593"/>
+                <w:sz w:val="19"/>
+              </w:rPr>
+              <w:t xml:space="preserve">• Action Performed: </w:t>
+            </w:r>
+            <w:r>
+              <w:rPr>
+                <w:color w:val="424242"/>
+                <w:sz w:val="19"/>
+              </w:rPr>
+              <w:t>Used the standard 'cat' (concatenate) utility to read and output the contents of 'greeting.txt' directly to standard output (terminal).</w:t>
+            </w:r>
+          </w:p>
+        </w:tc>
+      </w:tr>
+      <w:tr>
+        <w:tc>
+          <w:tcPr>
+            <w:tcW w:type="dxa" w:w="9360"/>
+            <w:shd w:fill="F9FBE7"/>
+          </w:tcPr>
+          <w:p>
+            <w:r>
+              <w:rPr>
+                <w:b/>
+                <w:color w:val="33691E"/>
+                <w:sz w:val="19"/>
+              </w:rPr>
+              <w:t xml:space="preserve">• Observation &amp; Result: </w:t>
+            </w:r>
+            <w:r>
+              <w:rPr>
+                <w:color w:val="424242"/>
+                <w:sz w:val="19"/>
+              </w:rPr>
+              <w:t>The terminal displayed 'Hello Linux!', verifying that the file was properly saved with the intended content.</w:t>
+            </w:r>
+          </w:p>
+        </w:tc>
+      </w:tr>
+    </w:tbl>
+    <w:p/>
     <w:p>
       <w:r>
         <w:rPr>
           <w:b/>
-          <w:sz w:val="22"/>
+          <w:color w:val="212121"/>
+          <w:sz w:val="23"/>
         </w:rPr>
-        <w:t>Task 1.4: Copy and Rename File</w:t>
+        <w:t>Task 1.4: Copy and Rename Files</w:t>
       </w:r>
     </w:p>
     <w:tbl>
@@ -392,6 +593,8 @@
               <w:t>cp greeting.txt backup.txt</w:t>
               <w:br/>
               <w:t>mv backup.txt old_greeting.txt</w:t>
+              <w:br/>
+              <w:t>ls -l</w:t>
             </w:r>
           </w:p>
         </w:tc>
@@ -420,7 +623,7 @@
             <w:r>
               <w:drawing>
                 <wp:inline xmlns:a="http://schemas.openxmlformats.org/drawingml/2006/main" xmlns:pic="http://schemas.openxmlformats.org/drawingml/2006/picture">
-                  <wp:extent cx="5486400" cy="1257858"/>
+                  <wp:extent cx="5669280" cy="1299786"/>
                   <wp:docPr id="4" name="Picture 4"/>
                   <wp:cNvGraphicFramePr>
                     <a:graphicFrameLocks noChangeAspect="1"/>
@@ -429,7 +632,7 @@
                     <a:graphicData uri="http://schemas.openxmlformats.org/drawingml/2006/picture">
                       <pic:pic>
                         <pic:nvPicPr>
-                          <pic:cNvPr id="0" name="step4_cp_mv.png"/>
+                          <pic:cNvPr id="0" name="step4.png"/>
                           <pic:cNvPicPr/>
                         </pic:nvPicPr>
                         <pic:blipFill>
@@ -441,7 +644,7 @@
                         <pic:spPr>
                           <a:xfrm>
                             <a:off x="0" y="0"/>
-                            <a:ext cx="5486400" cy="1257858"/>
+                            <a:ext cx="5669280" cy="1299786"/>
                           </a:xfrm>
                           <a:prstGeom prst="rect"/>
                         </pic:spPr>
@@ -456,11 +659,73 @@
       </w:tr>
     </w:tbl>
     <w:p/>
+    <w:tbl>
+      <w:tblPr>
+        <w:tblW w:type="auto" w:w="0"/>
+        <w:jc w:val="center"/>
+        <w:tblLook w:firstColumn="1" w:firstRow="1" w:lastColumn="0" w:lastRow="0" w:noHBand="0" w:noVBand="1" w:val="04A0"/>
+      </w:tblPr>
+      <w:tblGrid>
+        <w:gridCol w:w="8640"/>
+      </w:tblGrid>
+      <w:tr>
+        <w:tc>
+          <w:tcPr>
+            <w:tcW w:type="dxa" w:w="9360"/>
+            <w:shd w:fill="FFFFFF"/>
+          </w:tcPr>
+          <w:p>
+            <w:r>
+              <w:rPr>
+                <w:b/>
+                <w:color w:val="283593"/>
+                <w:sz w:val="19"/>
+              </w:rPr>
+              <w:t xml:space="preserve">• Action Performed: </w:t>
+            </w:r>
+            <w:r>
+              <w:rPr>
+                <w:color w:val="424242"/>
+                <w:sz w:val="19"/>
+              </w:rPr>
+              <w:t>Created a duplicate copy of 'greeting.txt' named 'backup.txt' using 'cp'. Then used 'mv' to rename 'backup.txt' to 'old_greeting.txt'. Checked with 'ls -l'.</w:t>
+            </w:r>
+          </w:p>
+        </w:tc>
+      </w:tr>
+      <w:tr>
+        <w:tc>
+          <w:tcPr>
+            <w:tcW w:type="dxa" w:w="9360"/>
+            <w:shd w:fill="F9FBE7"/>
+          </w:tcPr>
+          <w:p>
+            <w:r>
+              <w:rPr>
+                <w:b/>
+                <w:color w:val="33691E"/>
+                <w:sz w:val="19"/>
+              </w:rPr>
+              <w:t xml:space="preserve">• Observation &amp; Result: </w:t>
+            </w:r>
+            <w:r>
+              <w:rPr>
+                <w:color w:val="424242"/>
+                <w:sz w:val="19"/>
+              </w:rPr>
+              <w:t>'ls -l' confirms that 'greeting.txt' and 'old_greeting.txt' now both exist as distinct files with identical size (13 bytes).</w:t>
+            </w:r>
+          </w:p>
+        </w:tc>
+      </w:tr>
+    </w:tbl>
+    <w:p/>
     <w:p>
       <w:r>
         <w:rPr>
           <w:b/>
-          <w:sz w:val="22"/>
+          <w:color w:val="212121"/>
+          <w:sz w:val="23"/>
         </w:rPr>
         <w:t>Task 1.5: Remove Files and Directories</w:t>
       </w:r>
@@ -527,7 +792,7 @@
             <w:r>
               <w:drawing>
                 <wp:inline xmlns:a="http://schemas.openxmlformats.org/drawingml/2006/main" xmlns:pic="http://schemas.openxmlformats.org/drawingml/2006/picture">
-                  <wp:extent cx="5486400" cy="1257858"/>
+                  <wp:extent cx="5669280" cy="1299786"/>
                   <wp:docPr id="5" name="Picture 5"/>
                   <wp:cNvGraphicFramePr>
                     <a:graphicFrameLocks noChangeAspect="1"/>
@@ -536,7 +801,7 @@
                     <a:graphicData uri="http://schemas.openxmlformats.org/drawingml/2006/picture">
                       <pic:pic>
                         <pic:nvPicPr>
-                          <pic:cNvPr id="0" name="step5_rm_rmdir.png"/>
+                          <pic:cNvPr id="0" name="step5.png"/>
                           <pic:cNvPicPr/>
                         </pic:nvPicPr>
                         <pic:blipFill>
@@ -548,7 +813,7 @@
                         <pic:spPr>
                           <a:xfrm>
                             <a:off x="0" y="0"/>
-                            <a:ext cx="5486400" cy="1257858"/>
+                            <a:ext cx="5669280" cy="1299786"/>
                           </a:xfrm>
                           <a:prstGeom prst="rect"/>
                         </pic:spPr>
@@ -563,13 +828,75 @@
       </w:tr>
     </w:tbl>
     <w:p/>
+    <w:tbl>
+      <w:tblPr>
+        <w:tblW w:type="auto" w:w="0"/>
+        <w:jc w:val="center"/>
+        <w:tblLook w:firstColumn="1" w:firstRow="1" w:lastColumn="0" w:lastRow="0" w:noHBand="0" w:noVBand="1" w:val="04A0"/>
+      </w:tblPr>
+      <w:tblGrid>
+        <w:gridCol w:w="8640"/>
+      </w:tblGrid>
+      <w:tr>
+        <w:tc>
+          <w:tcPr>
+            <w:tcW w:type="dxa" w:w="9360"/>
+            <w:shd w:fill="FFFFFF"/>
+          </w:tcPr>
+          <w:p>
+            <w:r>
+              <w:rPr>
+                <w:b/>
+                <w:color w:val="283593"/>
+                <w:sz w:val="19"/>
+              </w:rPr>
+              <w:t xml:space="preserve">• Action Performed: </w:t>
+            </w:r>
+            <w:r>
+              <w:rPr>
+                <w:color w:val="424242"/>
+                <w:sz w:val="19"/>
+              </w:rPr>
+              <w:t>Deleted the file 'old_greeting.txt' using 'rm'. Created an empty temporary directory 'temp_dir' with 'mkdir', and cleanly deleted it using 'rmdir'.</w:t>
+            </w:r>
+          </w:p>
+        </w:tc>
+      </w:tr>
+      <w:tr>
+        <w:tc>
+          <w:tcPr>
+            <w:tcW w:type="dxa" w:w="9360"/>
+            <w:shd w:fill="F9FBE7"/>
+          </w:tcPr>
+          <w:p>
+            <w:r>
+              <w:rPr>
+                <w:b/>
+                <w:color w:val="33691E"/>
+                <w:sz w:val="19"/>
+              </w:rPr>
+              <w:t xml:space="preserve">• Observation &amp; Result: </w:t>
+            </w:r>
+            <w:r>
+              <w:rPr>
+                <w:color w:val="424242"/>
+                <w:sz w:val="19"/>
+              </w:rPr>
+              <w:t>'old_greeting.txt' and 'temp_dir' were deleted without errors. Only 'greeting.txt' remains in the directory.</w:t>
+            </w:r>
+          </w:p>
+        </w:tc>
+      </w:tr>
+    </w:tbl>
+    <w:p/>
     <w:p>
       <w:r>
         <w:rPr>
           <w:b/>
-          <w:sz w:val="22"/>
+          <w:color w:val="212121"/>
+          <w:sz w:val="23"/>
         </w:rPr>
-        <w:t>Task 1.6: Check Permissions</w:t>
+        <w:t>Task 1.6: Inspect File Permissions</w:t>
       </w:r>
     </w:p>
     <w:tbl>
@@ -630,7 +957,7 @@
             <w:r>
               <w:drawing>
                 <wp:inline xmlns:a="http://schemas.openxmlformats.org/drawingml/2006/main" xmlns:pic="http://schemas.openxmlformats.org/drawingml/2006/picture">
-                  <wp:extent cx="5486400" cy="722599"/>
+                  <wp:extent cx="5669280" cy="746686"/>
                   <wp:docPr id="6" name="Picture 6"/>
                   <wp:cNvGraphicFramePr>
                     <a:graphicFrameLocks noChangeAspect="1"/>
@@ -639,7 +966,7 @@
                     <a:graphicData uri="http://schemas.openxmlformats.org/drawingml/2006/picture">
                       <pic:pic>
                         <pic:nvPicPr>
-                          <pic:cNvPr id="0" name="step6_ls_l.png"/>
+                          <pic:cNvPr id="0" name="step6.png"/>
                           <pic:cNvPicPr/>
                         </pic:nvPicPr>
                         <pic:blipFill>
@@ -651,7 +978,7 @@
                         <pic:spPr>
                           <a:xfrm>
                             <a:off x="0" y="0"/>
-                            <a:ext cx="5486400" cy="722599"/>
+                            <a:ext cx="5669280" cy="746686"/>
                           </a:xfrm>
                           <a:prstGeom prst="rect"/>
                         </pic:spPr>
@@ -666,12 +993,73 @@
       </w:tr>
     </w:tbl>
     <w:p/>
+    <w:tbl>
+      <w:tblPr>
+        <w:tblW w:type="auto" w:w="0"/>
+        <w:jc w:val="center"/>
+        <w:tblLook w:firstColumn="1" w:firstRow="1" w:lastColumn="0" w:lastRow="0" w:noHBand="0" w:noVBand="1" w:val="04A0"/>
+      </w:tblPr>
+      <w:tblGrid>
+        <w:gridCol w:w="8640"/>
+      </w:tblGrid>
+      <w:tr>
+        <w:tc>
+          <w:tcPr>
+            <w:tcW w:type="dxa" w:w="9360"/>
+            <w:shd w:fill="FFFFFF"/>
+          </w:tcPr>
+          <w:p>
+            <w:r>
+              <w:rPr>
+                <w:b/>
+                <w:color w:val="283593"/>
+                <w:sz w:val="19"/>
+              </w:rPr>
+              <w:t xml:space="preserve">• Action Performed: </w:t>
+            </w:r>
+            <w:r>
+              <w:rPr>
+                <w:color w:val="424242"/>
+                <w:sz w:val="19"/>
+              </w:rPr>
+              <w:t>Ran 'ls -l' on 'greeting.txt' to inspect its Linux POSIX permission string, user ownership, group ownership, byte size, and last modification timestamp.</w:t>
+            </w:r>
+          </w:p>
+        </w:tc>
+      </w:tr>
+      <w:tr>
+        <w:tc>
+          <w:tcPr>
+            <w:tcW w:type="dxa" w:w="9360"/>
+            <w:shd w:fill="F9FBE7"/>
+          </w:tcPr>
+          <w:p>
+            <w:r>
+              <w:rPr>
+                <w:b/>
+                <w:color w:val="33691E"/>
+                <w:sz w:val="19"/>
+              </w:rPr>
+              <w:t xml:space="preserve">• Observation &amp; Result: </w:t>
+            </w:r>
+            <w:r>
+              <w:rPr>
+                <w:color w:val="424242"/>
+                <w:sz w:val="19"/>
+              </w:rPr>
+              <w:t>Output shows '-rw-rw-r-- 1 dibij dibij 13', meaning the owner and group have read-write access, while others have read-only access.</w:t>
+            </w:r>
+          </w:p>
+        </w:tc>
+      </w:tr>
+    </w:tbl>
+    <w:p/>
     <w:p>
       <w:r>
         <w:rPr>
           <w:b/>
           <w:color w:val="0D47A1"/>
-          <w:sz w:val="26"/>
+          <w:sz w:val="28"/>
         </w:rPr>
         <w:t>Part II: APT Package Management</w:t>
       </w:r>
@@ -680,9 +1068,10 @@
       <w:r>
         <w:rPr>
           <w:b/>
-          <w:sz w:val="22"/>
+          <w:color w:val="212121"/>
+          <w:sz w:val="23"/>
         </w:rPr>
-        <w:t>Task 2.1: Update Package List</w:t>
+        <w:t>Task 2.1: Update Package Index</w:t>
       </w:r>
     </w:p>
     <w:tbl>
@@ -743,7 +1132,7 @@
             <w:r>
               <w:drawing>
                 <wp:inline xmlns:a="http://schemas.openxmlformats.org/drawingml/2006/main" xmlns:pic="http://schemas.openxmlformats.org/drawingml/2006/picture">
-                  <wp:extent cx="5486400" cy="1391672"/>
+                  <wp:extent cx="5669280" cy="1438061"/>
                   <wp:docPr id="7" name="Picture 7"/>
                   <wp:cNvGraphicFramePr>
                     <a:graphicFrameLocks noChangeAspect="1"/>
@@ -752,7 +1141,7 @@
                     <a:graphicData uri="http://schemas.openxmlformats.org/drawingml/2006/picture">
                       <pic:pic>
                         <pic:nvPicPr>
-                          <pic:cNvPr id="0" name="step7_apt_update.png"/>
+                          <pic:cNvPr id="0" name="step7.png"/>
                           <pic:cNvPicPr/>
                         </pic:nvPicPr>
                         <pic:blipFill>
@@ -764,7 +1153,7 @@
                         <pic:spPr>
                           <a:xfrm>
                             <a:off x="0" y="0"/>
-                            <a:ext cx="5486400" cy="1391672"/>
+                            <a:ext cx="5669280" cy="1438061"/>
                           </a:xfrm>
                           <a:prstGeom prst="rect"/>
                         </pic:spPr>
@@ -779,13 +1168,75 @@
       </w:tr>
     </w:tbl>
     <w:p/>
+    <w:tbl>
+      <w:tblPr>
+        <w:tblW w:type="auto" w:w="0"/>
+        <w:jc w:val="center"/>
+        <w:tblLook w:firstColumn="1" w:firstRow="1" w:lastColumn="0" w:lastRow="0" w:noHBand="0" w:noVBand="1" w:val="04A0"/>
+      </w:tblPr>
+      <w:tblGrid>
+        <w:gridCol w:w="8640"/>
+      </w:tblGrid>
+      <w:tr>
+        <w:tc>
+          <w:tcPr>
+            <w:tcW w:type="dxa" w:w="9360"/>
+            <w:shd w:fill="FFFFFF"/>
+          </w:tcPr>
+          <w:p>
+            <w:r>
+              <w:rPr>
+                <w:b/>
+                <w:color w:val="283593"/>
+                <w:sz w:val="19"/>
+              </w:rPr>
+              <w:t xml:space="preserve">• Action Performed: </w:t>
+            </w:r>
+            <w:r>
+              <w:rPr>
+                <w:color w:val="424242"/>
+                <w:sz w:val="19"/>
+              </w:rPr>
+              <w:t>Invoked 'sudo apt update' to refresh the local package cache against the official Ubuntu software repositories.</w:t>
+            </w:r>
+          </w:p>
+        </w:tc>
+      </w:tr>
+      <w:tr>
+        <w:tc>
+          <w:tcPr>
+            <w:tcW w:type="dxa" w:w="9360"/>
+            <w:shd w:fill="F9FBE7"/>
+          </w:tcPr>
+          <w:p>
+            <w:r>
+              <w:rPr>
+                <w:b/>
+                <w:color w:val="33691E"/>
+                <w:sz w:val="19"/>
+              </w:rPr>
+              <w:t xml:space="preserve">• Observation &amp; Result: </w:t>
+            </w:r>
+            <w:r>
+              <w:rPr>
+                <w:color w:val="424242"/>
+                <w:sz w:val="19"/>
+              </w:rPr>
+              <w:t>APT queried archive mirrors, updated package metadata, and verified all index definitions are synchronized and up-to-date.</w:t>
+            </w:r>
+          </w:p>
+        </w:tc>
+      </w:tr>
+    </w:tbl>
+    <w:p/>
     <w:p>
       <w:r>
         <w:rPr>
           <w:b/>
-          <w:sz w:val="22"/>
+          <w:color w:val="212121"/>
+          <w:sz w:val="23"/>
         </w:rPr>
-        <w:t>Task 2.2: Install C Compiler (GCC / build-essential)</w:t>
+        <w:t>Task 2.2: Install GCC Compiler &amp; Build Essentials</w:t>
       </w:r>
     </w:p>
     <w:tbl>
@@ -846,7 +1297,7 @@
             <w:r>
               <w:drawing>
                 <wp:inline xmlns:a="http://schemas.openxmlformats.org/drawingml/2006/main" xmlns:pic="http://schemas.openxmlformats.org/drawingml/2006/picture">
-                  <wp:extent cx="5486400" cy="1124043"/>
+                  <wp:extent cx="5669280" cy="1161511"/>
                   <wp:docPr id="8" name="Picture 8"/>
                   <wp:cNvGraphicFramePr>
                     <a:graphicFrameLocks noChangeAspect="1"/>
@@ -855,7 +1306,7 @@
                     <a:graphicData uri="http://schemas.openxmlformats.org/drawingml/2006/picture">
                       <pic:pic>
                         <pic:nvPicPr>
-                          <pic:cNvPr id="0" name="step8_apt_install.png"/>
+                          <pic:cNvPr id="0" name="step8.png"/>
                           <pic:cNvPicPr/>
                         </pic:nvPicPr>
                         <pic:blipFill>
@@ -867,7 +1318,7 @@
                         <pic:spPr>
                           <a:xfrm>
                             <a:off x="0" y="0"/>
-                            <a:ext cx="5486400" cy="1124043"/>
+                            <a:ext cx="5669280" cy="1161511"/>
                           </a:xfrm>
                           <a:prstGeom prst="rect"/>
                         </pic:spPr>
@@ -882,13 +1333,75 @@
       </w:tr>
     </w:tbl>
     <w:p/>
+    <w:tbl>
+      <w:tblPr>
+        <w:tblW w:type="auto" w:w="0"/>
+        <w:jc w:val="center"/>
+        <w:tblLook w:firstColumn="1" w:firstRow="1" w:lastColumn="0" w:lastRow="0" w:noHBand="0" w:noVBand="1" w:val="04A0"/>
+      </w:tblPr>
+      <w:tblGrid>
+        <w:gridCol w:w="8640"/>
+      </w:tblGrid>
+      <w:tr>
+        <w:tc>
+          <w:tcPr>
+            <w:tcW w:type="dxa" w:w="9360"/>
+            <w:shd w:fill="FFFFFF"/>
+          </w:tcPr>
+          <w:p>
+            <w:r>
+              <w:rPr>
+                <w:b/>
+                <w:color w:val="283593"/>
+                <w:sz w:val="19"/>
+              </w:rPr>
+              <w:t xml:space="preserve">• Action Performed: </w:t>
+            </w:r>
+            <w:r>
+              <w:rPr>
+                <w:color w:val="424242"/>
+                <w:sz w:val="19"/>
+              </w:rPr>
+              <w:t>Used APT package manager to ensure essential compilation toolchains ('build-essential' including gcc, g++, make, libc) are installed.</w:t>
+            </w:r>
+          </w:p>
+        </w:tc>
+      </w:tr>
+      <w:tr>
+        <w:tc>
+          <w:tcPr>
+            <w:tcW w:type="dxa" w:w="9360"/>
+            <w:shd w:fill="F9FBE7"/>
+          </w:tcPr>
+          <w:p>
+            <w:r>
+              <w:rPr>
+                <w:b/>
+                <w:color w:val="33691E"/>
+                <w:sz w:val="19"/>
+              </w:rPr>
+              <w:t xml:space="preserve">• Observation &amp; Result: </w:t>
+            </w:r>
+            <w:r>
+              <w:rPr>
+                <w:color w:val="424242"/>
+                <w:sz w:val="19"/>
+              </w:rPr>
+              <w:t>The system confirmed 'build-essential is already the newest version (12.10ubuntu1)', ensuring the C compiler toolchain is ready for use.</w:t>
+            </w:r>
+          </w:p>
+        </w:tc>
+      </w:tr>
+    </w:tbl>
+    <w:p/>
     <w:p>
       <w:r>
         <w:rPr>
           <w:b/>
-          <w:sz w:val="22"/>
+          <w:color w:val="212121"/>
+          <w:sz w:val="23"/>
         </w:rPr>
-        <w:t>Task 2.3: Verify GCC Installation</w:t>
+        <w:t>Task 2.3: Verify GCC Compiler Installation</w:t>
       </w:r>
     </w:p>
     <w:tbl>
@@ -949,7 +1462,7 @@
             <w:r>
               <w:drawing>
                 <wp:inline xmlns:a="http://schemas.openxmlformats.org/drawingml/2006/main" xmlns:pic="http://schemas.openxmlformats.org/drawingml/2006/picture">
-                  <wp:extent cx="5486400" cy="1124043"/>
+                  <wp:extent cx="5669280" cy="1161511"/>
                   <wp:docPr id="9" name="Picture 9"/>
                   <wp:cNvGraphicFramePr>
                     <a:graphicFrameLocks noChangeAspect="1"/>
@@ -958,7 +1471,7 @@
                     <a:graphicData uri="http://schemas.openxmlformats.org/drawingml/2006/picture">
                       <pic:pic>
                         <pic:nvPicPr>
-                          <pic:cNvPr id="0" name="step9_gcc_version.png"/>
+                          <pic:cNvPr id="0" name="step9.png"/>
                           <pic:cNvPicPr/>
                         </pic:nvPicPr>
                         <pic:blipFill>
@@ -970,7 +1483,7 @@
                         <pic:spPr>
                           <a:xfrm>
                             <a:off x="0" y="0"/>
-                            <a:ext cx="5486400" cy="1124043"/>
+                            <a:ext cx="5669280" cy="1161511"/>
                           </a:xfrm>
                           <a:prstGeom prst="rect"/>
                         </pic:spPr>
@@ -985,13 +1498,75 @@
       </w:tr>
     </w:tbl>
     <w:p/>
+    <w:tbl>
+      <w:tblPr>
+        <w:tblW w:type="auto" w:w="0"/>
+        <w:jc w:val="center"/>
+        <w:tblLook w:firstColumn="1" w:firstRow="1" w:lastColumn="0" w:lastRow="0" w:noHBand="0" w:noVBand="1" w:val="04A0"/>
+      </w:tblPr>
+      <w:tblGrid>
+        <w:gridCol w:w="8640"/>
+      </w:tblGrid>
+      <w:tr>
+        <w:tc>
+          <w:tcPr>
+            <w:tcW w:type="dxa" w:w="9360"/>
+            <w:shd w:fill="FFFFFF"/>
+          </w:tcPr>
+          <w:p>
+            <w:r>
+              <w:rPr>
+                <w:b/>
+                <w:color w:val="283593"/>
+                <w:sz w:val="19"/>
+              </w:rPr>
+              <w:t xml:space="preserve">• Action Performed: </w:t>
+            </w:r>
+            <w:r>
+              <w:rPr>
+                <w:color w:val="424242"/>
+                <w:sz w:val="19"/>
+              </w:rPr>
+              <w:t>Queried the GNU Compiler Collection (GCC) binary to inspect its version and target architecture.</w:t>
+            </w:r>
+          </w:p>
+        </w:tc>
+      </w:tr>
+      <w:tr>
+        <w:tc>
+          <w:tcPr>
+            <w:tcW w:type="dxa" w:w="9360"/>
+            <w:shd w:fill="F9FBE7"/>
+          </w:tcPr>
+          <w:p>
+            <w:r>
+              <w:rPr>
+                <w:b/>
+                <w:color w:val="33691E"/>
+                <w:sz w:val="19"/>
+              </w:rPr>
+              <w:t xml:space="preserve">• Observation &amp; Result: </w:t>
+            </w:r>
+            <w:r>
+              <w:rPr>
+                <w:color w:val="424242"/>
+                <w:sz w:val="19"/>
+              </w:rPr>
+              <w:t>The output displayed 'gcc (Ubuntu 13.3.0-6ubuntu2~24.04) 13.3.0 x86_64-linux-gnu', confirming GCC version 13 is fully functional.</w:t>
+            </w:r>
+          </w:p>
+        </w:tc>
+      </w:tr>
+    </w:tbl>
+    <w:p/>
     <w:p>
       <w:r>
         <w:rPr>
           <w:b/>
-          <w:sz w:val="22"/>
+          <w:color w:val="212121"/>
+          <w:sz w:val="23"/>
         </w:rPr>
-        <w:t>Task 2.4: Search for Packages</w:t>
+        <w:t>Task 2.4: Search for Available Packages with APT</w:t>
       </w:r>
     </w:p>
     <w:tbl>
@@ -1023,7 +1598,7 @@
                 <w:rFonts w:ascii="Courier New" w:hAnsi="Courier New"/>
                 <w:sz w:val="19"/>
               </w:rPr>
-              <w:t>apt search python3</w:t>
+              <w:t>apt search python3 | head -n 8</w:t>
             </w:r>
           </w:p>
         </w:tc>
@@ -1052,7 +1627,7 @@
             <w:r>
               <w:drawing>
                 <wp:inline xmlns:a="http://schemas.openxmlformats.org/drawingml/2006/main" xmlns:pic="http://schemas.openxmlformats.org/drawingml/2006/picture">
-                  <wp:extent cx="5486400" cy="1525487"/>
+                  <wp:extent cx="5669280" cy="1576336"/>
                   <wp:docPr id="10" name="Picture 10"/>
                   <wp:cNvGraphicFramePr>
                     <a:graphicFrameLocks noChangeAspect="1"/>
@@ -1061,7 +1636,7 @@
                     <a:graphicData uri="http://schemas.openxmlformats.org/drawingml/2006/picture">
                       <pic:pic>
                         <pic:nvPicPr>
-                          <pic:cNvPr id="0" name="step10_apt_search.png"/>
+                          <pic:cNvPr id="0" name="step10.png"/>
                           <pic:cNvPicPr/>
                         </pic:nvPicPr>
                         <pic:blipFill>
@@ -1073,7 +1648,7 @@
                         <pic:spPr>
                           <a:xfrm>
                             <a:off x="0" y="0"/>
-                            <a:ext cx="5486400" cy="1525487"/>
+                            <a:ext cx="5669280" cy="1576336"/>
                           </a:xfrm>
                           <a:prstGeom prst="rect"/>
                         </pic:spPr>
@@ -1088,12 +1663,73 @@
       </w:tr>
     </w:tbl>
     <w:p/>
+    <w:tbl>
+      <w:tblPr>
+        <w:tblW w:type="auto" w:w="0"/>
+        <w:jc w:val="center"/>
+        <w:tblLook w:firstColumn="1" w:firstRow="1" w:lastColumn="0" w:lastRow="0" w:noHBand="0" w:noVBand="1" w:val="04A0"/>
+      </w:tblPr>
+      <w:tblGrid>
+        <w:gridCol w:w="8640"/>
+      </w:tblGrid>
+      <w:tr>
+        <w:tc>
+          <w:tcPr>
+            <w:tcW w:type="dxa" w:w="9360"/>
+            <w:shd w:fill="FFFFFF"/>
+          </w:tcPr>
+          <w:p>
+            <w:r>
+              <w:rPr>
+                <w:b/>
+                <w:color w:val="283593"/>
+                <w:sz w:val="19"/>
+              </w:rPr>
+              <w:t xml:space="preserve">• Action Performed: </w:t>
+            </w:r>
+            <w:r>
+              <w:rPr>
+                <w:color w:val="424242"/>
+                <w:sz w:val="19"/>
+              </w:rPr>
+              <w:t>Used the 'apt search' command to look for packages matching 'python3' in the repository database.</w:t>
+            </w:r>
+          </w:p>
+        </w:tc>
+      </w:tr>
+      <w:tr>
+        <w:tc>
+          <w:tcPr>
+            <w:tcW w:type="dxa" w:w="9360"/>
+            <w:shd w:fill="F9FBE7"/>
+          </w:tcPr>
+          <w:p>
+            <w:r>
+              <w:rPr>
+                <w:b/>
+                <w:color w:val="33691E"/>
+                <w:sz w:val="19"/>
+              </w:rPr>
+              <w:t xml:space="preserve">• Observation &amp; Result: </w:t>
+            </w:r>
+            <w:r>
+              <w:rPr>
+                <w:color w:val="424242"/>
+                <w:sz w:val="19"/>
+              </w:rPr>
+              <w:t>APT returned matching entries along with descriptions, demonstrating package discovery capabilities via command line.</w:t>
+            </w:r>
+          </w:p>
+        </w:tc>
+      </w:tr>
+    </w:tbl>
+    <w:p/>
     <w:p>
       <w:r>
         <w:rPr>
           <w:b/>
           <w:color w:val="0D47A1"/>
-          <w:sz w:val="26"/>
+          <w:sz w:val="28"/>
         </w:rPr>
         <w:t>Part III: C Compilation &amp; Iterative Development</w:t>
       </w:r>
@@ -1102,7 +1738,8 @@
       <w:r>
         <w:rPr>
           <w:b/>
-          <w:sz w:val="22"/>
+          <w:color w:val="212121"/>
+          <w:sz w:val="23"/>
         </w:rPr>
         <w:t>Task 3.1: Write C Source Code (hello.c)</w:t>
       </w:r>
@@ -1137,20 +1774,6 @@
                 <w:sz w:val="19"/>
               </w:rPr>
               <w:t>nano hello.c</w:t>
-              <w:br/>
-              <w:t>#include &lt;stdio.h&gt;</w:t>
-              <w:br/>
-              <w:t>int main() {</w:t>
-              <w:br/>
-              <w:t xml:space="preserve">    int a = 10, b = 5;</w:t>
-              <w:br/>
-              <w:t xml:space="preserve">    printf("Hello, Linux Lab!\n");</w:t>
-              <w:br/>
-              <w:t xml:space="preserve">    printf("Sum of %d and %d is %d\n", a, b, a + b);</w:t>
-              <w:br/>
-              <w:t xml:space="preserve">    return 0;</w:t>
-              <w:br/>
-              <w:t>}</w:t>
             </w:r>
           </w:p>
         </w:tc>
@@ -1179,7 +1802,7 @@
             <w:r>
               <w:drawing>
                 <wp:inline xmlns:a="http://schemas.openxmlformats.org/drawingml/2006/main" xmlns:pic="http://schemas.openxmlformats.org/drawingml/2006/picture">
-                  <wp:extent cx="5486400" cy="2060745"/>
+                  <wp:extent cx="5669280" cy="2129437"/>
                   <wp:docPr id="11" name="Picture 11"/>
                   <wp:cNvGraphicFramePr>
                     <a:graphicFrameLocks noChangeAspect="1"/>
@@ -1188,7 +1811,7 @@
                     <a:graphicData uri="http://schemas.openxmlformats.org/drawingml/2006/picture">
                       <pic:pic>
                         <pic:nvPicPr>
-                          <pic:cNvPr id="0" name="step11_hello_c.png"/>
+                          <pic:cNvPr id="0" name="step11.png"/>
                           <pic:cNvPicPr/>
                         </pic:nvPicPr>
                         <pic:blipFill>
@@ -1200,7 +1823,7 @@
                         <pic:spPr>
                           <a:xfrm>
                             <a:off x="0" y="0"/>
-                            <a:ext cx="5486400" cy="2060745"/>
+                            <a:ext cx="5669280" cy="2129437"/>
                           </a:xfrm>
                           <a:prstGeom prst="rect"/>
                         </pic:spPr>
@@ -1215,13 +1838,75 @@
       </w:tr>
     </w:tbl>
     <w:p/>
+    <w:tbl>
+      <w:tblPr>
+        <w:tblW w:type="auto" w:w="0"/>
+        <w:jc w:val="center"/>
+        <w:tblLook w:firstColumn="1" w:firstRow="1" w:lastColumn="0" w:lastRow="0" w:noHBand="0" w:noVBand="1" w:val="04A0"/>
+      </w:tblPr>
+      <w:tblGrid>
+        <w:gridCol w:w="8640"/>
+      </w:tblGrid>
+      <w:tr>
+        <w:tc>
+          <w:tcPr>
+            <w:tcW w:type="dxa" w:w="9360"/>
+            <w:shd w:fill="FFFFFF"/>
+          </w:tcPr>
+          <w:p>
+            <w:r>
+              <w:rPr>
+                <w:b/>
+                <w:color w:val="283593"/>
+                <w:sz w:val="19"/>
+              </w:rPr>
+              <w:t xml:space="preserve">• Action Performed: </w:t>
+            </w:r>
+            <w:r>
+              <w:rPr>
+                <w:color w:val="424242"/>
+                <w:sz w:val="19"/>
+              </w:rPr>
+              <w:t>Created 'hello.c' using nano. Wrote standard C source code defining integers a=10, b=5, printing 'Hello, Linux Lab!' and calculating their sum (a + b).</w:t>
+            </w:r>
+          </w:p>
+        </w:tc>
+      </w:tr>
+      <w:tr>
+        <w:tc>
+          <w:tcPr>
+            <w:tcW w:type="dxa" w:w="9360"/>
+            <w:shd w:fill="F9FBE7"/>
+          </w:tcPr>
+          <w:p>
+            <w:r>
+              <w:rPr>
+                <w:b/>
+                <w:color w:val="33691E"/>
+                <w:sz w:val="19"/>
+              </w:rPr>
+              <w:t xml:space="preserve">• Observation &amp; Result: </w:t>
+            </w:r>
+            <w:r>
+              <w:rPr>
+                <w:color w:val="424242"/>
+                <w:sz w:val="19"/>
+              </w:rPr>
+              <w:t>The C source code was structured with standard '#include &lt;stdio.h&gt;' and saved cleanly into the lab folder.</w:t>
+            </w:r>
+          </w:p>
+        </w:tc>
+      </w:tr>
+    </w:tbl>
+    <w:p/>
     <w:p>
       <w:r>
         <w:rPr>
           <w:b/>
-          <w:sz w:val="22"/>
+          <w:color w:val="212121"/>
+          <w:sz w:val="23"/>
         </w:rPr>
-        <w:t>Task 3.2: Compile and Run Program</w:t>
+        <w:t>Task 3.2: Compile and Execute C Program</w:t>
       </w:r>
     </w:p>
     <w:tbl>
@@ -1286,7 +1971,7 @@
             <w:r>
               <w:drawing>
                 <wp:inline xmlns:a="http://schemas.openxmlformats.org/drawingml/2006/main" xmlns:pic="http://schemas.openxmlformats.org/drawingml/2006/picture">
-                  <wp:extent cx="5486400" cy="1257858"/>
+                  <wp:extent cx="5669280" cy="1299786"/>
                   <wp:docPr id="12" name="Picture 12"/>
                   <wp:cNvGraphicFramePr>
                     <a:graphicFrameLocks noChangeAspect="1"/>
@@ -1295,7 +1980,7 @@
                     <a:graphicData uri="http://schemas.openxmlformats.org/drawingml/2006/picture">
                       <pic:pic>
                         <pic:nvPicPr>
-                          <pic:cNvPr id="0" name="step12_compile_run.png"/>
+                          <pic:cNvPr id="0" name="step12.png"/>
                           <pic:cNvPicPr/>
                         </pic:nvPicPr>
                         <pic:blipFill>
@@ -1307,7 +1992,7 @@
                         <pic:spPr>
                           <a:xfrm>
                             <a:off x="0" y="0"/>
-                            <a:ext cx="5486400" cy="1257858"/>
+                            <a:ext cx="5669280" cy="1299786"/>
                           </a:xfrm>
                           <a:prstGeom prst="rect"/>
                         </pic:spPr>
@@ -1322,13 +2007,75 @@
       </w:tr>
     </w:tbl>
     <w:p/>
+    <w:tbl>
+      <w:tblPr>
+        <w:tblW w:type="auto" w:w="0"/>
+        <w:jc w:val="center"/>
+        <w:tblLook w:firstColumn="1" w:firstRow="1" w:lastColumn="0" w:lastRow="0" w:noHBand="0" w:noVBand="1" w:val="04A0"/>
+      </w:tblPr>
+      <w:tblGrid>
+        <w:gridCol w:w="8640"/>
+      </w:tblGrid>
+      <w:tr>
+        <w:tc>
+          <w:tcPr>
+            <w:tcW w:type="dxa" w:w="9360"/>
+            <w:shd w:fill="FFFFFF"/>
+          </w:tcPr>
+          <w:p>
+            <w:r>
+              <w:rPr>
+                <w:b/>
+                <w:color w:val="283593"/>
+                <w:sz w:val="19"/>
+              </w:rPr>
+              <w:t xml:space="preserve">• Action Performed: </w:t>
+            </w:r>
+            <w:r>
+              <w:rPr>
+                <w:color w:val="424242"/>
+                <w:sz w:val="19"/>
+              </w:rPr>
+              <w:t>Compiled 'hello.c' using GCC with the '-o' flag specifying binary output name 'hello_program'. Verified executable permissions and ran './hello_program'.</w:t>
+            </w:r>
+          </w:p>
+        </w:tc>
+      </w:tr>
+      <w:tr>
+        <w:tc>
+          <w:tcPr>
+            <w:tcW w:type="dxa" w:w="9360"/>
+            <w:shd w:fill="F9FBE7"/>
+          </w:tcPr>
+          <w:p>
+            <w:r>
+              <w:rPr>
+                <w:b/>
+                <w:color w:val="33691E"/>
+                <w:sz w:val="19"/>
+              </w:rPr>
+              <w:t xml:space="preserve">• Observation &amp; Result: </w:t>
+            </w:r>
+            <w:r>
+              <w:rPr>
+                <w:color w:val="424242"/>
+                <w:sz w:val="19"/>
+              </w:rPr>
+              <w:t>GCC compiled the binary with executable flags ('-rwxrwxr-x'). Executing the binary printed: 'Hello, Linux Lab!' and 'Sum of 10 and 5 is 15'.</w:t>
+            </w:r>
+          </w:p>
+        </w:tc>
+      </w:tr>
+    </w:tbl>
+    <w:p/>
     <w:p>
       <w:r>
         <w:rPr>
           <w:b/>
-          <w:sz w:val="22"/>
+          <w:color w:val="212121"/>
+          <w:sz w:val="23"/>
         </w:rPr>
-        <w:t>Task 3.3: Compile with Warnings Enabled (-Wall)</w:t>
+        <w:t>Task 3.3: Compile with Warning Flags Enabled (-Wall)</w:t>
       </w:r>
     </w:p>
     <w:tbl>
@@ -1391,7 +2138,7 @@
             <w:r>
               <w:drawing>
                 <wp:inline xmlns:a="http://schemas.openxmlformats.org/drawingml/2006/main" xmlns:pic="http://schemas.openxmlformats.org/drawingml/2006/picture">
-                  <wp:extent cx="5486400" cy="990228"/>
+                  <wp:extent cx="5669280" cy="1023235"/>
                   <wp:docPr id="13" name="Picture 13"/>
                   <wp:cNvGraphicFramePr>
                     <a:graphicFrameLocks noChangeAspect="1"/>
@@ -1400,7 +2147,7 @@
                     <a:graphicData uri="http://schemas.openxmlformats.org/drawingml/2006/picture">
                       <pic:pic>
                         <pic:nvPicPr>
-                          <pic:cNvPr id="0" name="step13_wall_compile.png"/>
+                          <pic:cNvPr id="0" name="step13.png"/>
                           <pic:cNvPicPr/>
                         </pic:nvPicPr>
                         <pic:blipFill>
@@ -1412,7 +2159,7 @@
                         <pic:spPr>
                           <a:xfrm>
                             <a:off x="0" y="0"/>
-                            <a:ext cx="5486400" cy="990228"/>
+                            <a:ext cx="5669280" cy="1023235"/>
                           </a:xfrm>
                           <a:prstGeom prst="rect"/>
                         </pic:spPr>
@@ -1427,13 +2174,75 @@
       </w:tr>
     </w:tbl>
     <w:p/>
+    <w:tbl>
+      <w:tblPr>
+        <w:tblW w:type="auto" w:w="0"/>
+        <w:jc w:val="center"/>
+        <w:tblLook w:firstColumn="1" w:firstRow="1" w:lastColumn="0" w:lastRow="0" w:noHBand="0" w:noVBand="1" w:val="04A0"/>
+      </w:tblPr>
+      <w:tblGrid>
+        <w:gridCol w:w="8640"/>
+      </w:tblGrid>
+      <w:tr>
+        <w:tc>
+          <w:tcPr>
+            <w:tcW w:type="dxa" w:w="9360"/>
+            <w:shd w:fill="FFFFFF"/>
+          </w:tcPr>
+          <w:p>
+            <w:r>
+              <w:rPr>
+                <w:b/>
+                <w:color w:val="283593"/>
+                <w:sz w:val="19"/>
+              </w:rPr>
+              <w:t xml:space="preserve">• Action Performed: </w:t>
+            </w:r>
+            <w:r>
+              <w:rPr>
+                <w:color w:val="424242"/>
+                <w:sz w:val="19"/>
+              </w:rPr>
+              <w:t>Applied compilation best practice by enabling compiler warnings via '-Wall' (all warnings) to check for potential bugs or unhandled code paths.</w:t>
+            </w:r>
+          </w:p>
+        </w:tc>
+      </w:tr>
+      <w:tr>
+        <w:tc>
+          <w:tcPr>
+            <w:tcW w:type="dxa" w:w="9360"/>
+            <w:shd w:fill="F9FBE7"/>
+          </w:tcPr>
+          <w:p>
+            <w:r>
+              <w:rPr>
+                <w:b/>
+                <w:color w:val="33691E"/>
+                <w:sz w:val="19"/>
+              </w:rPr>
+              <w:t xml:space="preserve">• Observation &amp; Result: </w:t>
+            </w:r>
+            <w:r>
+              <w:rPr>
+                <w:color w:val="424242"/>
+                <w:sz w:val="19"/>
+              </w:rPr>
+              <w:t>The code compiled cleanly with zero warnings, and './hello_program_warn' executed with expected output.</w:t>
+            </w:r>
+          </w:p>
+        </w:tc>
+      </w:tr>
+    </w:tbl>
+    <w:p/>
     <w:p>
       <w:r>
         <w:rPr>
           <w:b/>
-          <w:sz w:val="22"/>
+          <w:color w:val="212121"/>
+          <w:sz w:val="23"/>
         </w:rPr>
-        <w:t>Task 3.4: Modify Values &amp; Recompile</w:t>
+        <w:t>Task 3.4: Modify Values and Recompile (Iterative Development)</w:t>
       </w:r>
     </w:p>
     <w:tbl>
@@ -1465,7 +2274,7 @@
                 <w:rFonts w:ascii="Courier New" w:hAnsi="Courier New"/>
                 <w:sz w:val="19"/>
               </w:rPr>
-              <w:t># nano hello.c (change a=100, b=200)</w:t>
+              <w:t># Edited hello.c (changed a=100, b=200)</w:t>
               <w:br/>
               <w:t>gcc -Wall hello.c -o hello_program</w:t>
               <w:br/>
@@ -1498,7 +2307,7 @@
             <w:r>
               <w:drawing>
                 <wp:inline xmlns:a="http://schemas.openxmlformats.org/drawingml/2006/main" xmlns:pic="http://schemas.openxmlformats.org/drawingml/2006/picture">
-                  <wp:extent cx="5486400" cy="1124043"/>
+                  <wp:extent cx="5669280" cy="1161511"/>
                   <wp:docPr id="14" name="Picture 14"/>
                   <wp:cNvGraphicFramePr>
                     <a:graphicFrameLocks noChangeAspect="1"/>
@@ -1507,7 +2316,7 @@
                     <a:graphicData uri="http://schemas.openxmlformats.org/drawingml/2006/picture">
                       <pic:pic>
                         <pic:nvPicPr>
-                          <pic:cNvPr id="0" name="step14_recompile_run.png"/>
+                          <pic:cNvPr id="0" name="step14.png"/>
                           <pic:cNvPicPr/>
                         </pic:nvPicPr>
                         <pic:blipFill>
@@ -1519,7 +2328,7 @@
                         <pic:spPr>
                           <a:xfrm>
                             <a:off x="0" y="0"/>
-                            <a:ext cx="5486400" cy="1124043"/>
+                            <a:ext cx="5669280" cy="1161511"/>
                           </a:xfrm>
                           <a:prstGeom prst="rect"/>
                         </pic:spPr>
@@ -1534,23 +2343,85 @@
       </w:tr>
     </w:tbl>
     <w:p/>
+    <w:tbl>
+      <w:tblPr>
+        <w:tblW w:type="auto" w:w="0"/>
+        <w:jc w:val="center"/>
+        <w:tblLook w:firstColumn="1" w:firstRow="1" w:lastColumn="0" w:lastRow="0" w:noHBand="0" w:noVBand="1" w:val="04A0"/>
+      </w:tblPr>
+      <w:tblGrid>
+        <w:gridCol w:w="8640"/>
+      </w:tblGrid>
+      <w:tr>
+        <w:tc>
+          <w:tcPr>
+            <w:tcW w:type="dxa" w:w="9360"/>
+            <w:shd w:fill="FFFFFF"/>
+          </w:tcPr>
+          <w:p>
+            <w:r>
+              <w:rPr>
+                <w:b/>
+                <w:color w:val="283593"/>
+                <w:sz w:val="19"/>
+              </w:rPr>
+              <w:t xml:space="preserve">• Action Performed: </w:t>
+            </w:r>
+            <w:r>
+              <w:rPr>
+                <w:color w:val="424242"/>
+                <w:sz w:val="19"/>
+              </w:rPr>
+              <w:t>Modified the integer variables in 'hello.c' to a=100 and b=200. Re-compiled using 'gcc -Wall' and executed './hello_program' to verify the updated build.</w:t>
+            </w:r>
+          </w:p>
+        </w:tc>
+      </w:tr>
+      <w:tr>
+        <w:tc>
+          <w:tcPr>
+            <w:tcW w:type="dxa" w:w="9360"/>
+            <w:shd w:fill="F9FBE7"/>
+          </w:tcPr>
+          <w:p>
+            <w:r>
+              <w:rPr>
+                <w:b/>
+                <w:color w:val="33691E"/>
+                <w:sz w:val="19"/>
+              </w:rPr>
+              <w:t xml:space="preserve">• Observation &amp; Result: </w:t>
+            </w:r>
+            <w:r>
+              <w:rPr>
+                <w:color w:val="424242"/>
+                <w:sz w:val="19"/>
+              </w:rPr>
+              <w:t>The output printed 'Sum of 100 and 200 is 300', demonstrating proper iterative code compilation and execution.</w:t>
+            </w:r>
+          </w:p>
+        </w:tc>
+      </w:tr>
+    </w:tbl>
+    <w:p/>
     <w:p>
       <w:r>
         <w:rPr>
           <w:b/>
           <w:color w:val="0D47A1"/>
-          <w:sz w:val="26"/>
+          <w:sz w:val="28"/>
         </w:rPr>
-        <w:t>Part IV: Cleanup &amp; Verification</w:t>
+        <w:t>Part IV: Cleanup &amp; Final Verification</w:t>
       </w:r>
     </w:p>
     <w:p>
       <w:r>
         <w:rPr>
           <w:b/>
-          <w:sz w:val="22"/>
+          <w:color w:val="212121"/>
+          <w:sz w:val="23"/>
         </w:rPr>
-        <w:t>Task 4.1: Return Home &amp; List Files with Details</w:t>
+        <w:t>Task 4.1: Return Home &amp; Inspect Lab Directory Structure</w:t>
       </w:r>
     </w:p>
     <w:tbl>
@@ -1613,7 +2484,7 @@
             <w:r>
               <w:drawing>
                 <wp:inline xmlns:a="http://schemas.openxmlformats.org/drawingml/2006/main" xmlns:pic="http://schemas.openxmlformats.org/drawingml/2006/picture">
-                  <wp:extent cx="5486400" cy="1391672"/>
+                  <wp:extent cx="5669280" cy="1438061"/>
                   <wp:docPr id="15" name="Picture 15"/>
                   <wp:cNvGraphicFramePr>
                     <a:graphicFrameLocks noChangeAspect="1"/>
@@ -1622,7 +2493,7 @@
                     <a:graphicData uri="http://schemas.openxmlformats.org/drawingml/2006/picture">
                       <pic:pic>
                         <pic:nvPicPr>
-                          <pic:cNvPr id="0" name="step15_ls_lh.png"/>
+                          <pic:cNvPr id="0" name="step15.png"/>
                           <pic:cNvPicPr/>
                         </pic:nvPicPr>
                         <pic:blipFill>
@@ -1634,7 +2505,7 @@
                         <pic:spPr>
                           <a:xfrm>
                             <a:off x="0" y="0"/>
-                            <a:ext cx="5486400" cy="1391672"/>
+                            <a:ext cx="5669280" cy="1438061"/>
                           </a:xfrm>
                           <a:prstGeom prst="rect"/>
                         </pic:spPr>
@@ -1649,13 +2520,75 @@
       </w:tr>
     </w:tbl>
     <w:p/>
+    <w:tbl>
+      <w:tblPr>
+        <w:tblW w:type="auto" w:w="0"/>
+        <w:jc w:val="center"/>
+        <w:tblLook w:firstColumn="1" w:firstRow="1" w:lastColumn="0" w:lastRow="0" w:noHBand="0" w:noVBand="1" w:val="04A0"/>
+      </w:tblPr>
+      <w:tblGrid>
+        <w:gridCol w:w="8640"/>
+      </w:tblGrid>
+      <w:tr>
+        <w:tc>
+          <w:tcPr>
+            <w:tcW w:type="dxa" w:w="9360"/>
+            <w:shd w:fill="FFFFFF"/>
+          </w:tcPr>
+          <w:p>
+            <w:r>
+              <w:rPr>
+                <w:b/>
+                <w:color w:val="283593"/>
+                <w:sz w:val="19"/>
+              </w:rPr>
+              <w:t xml:space="preserve">• Action Performed: </w:t>
+            </w:r>
+            <w:r>
+              <w:rPr>
+                <w:color w:val="424242"/>
+                <w:sz w:val="19"/>
+              </w:rPr>
+              <w:t>Navigated back to user home directory using 'cd ~' and ran 'ls -lh' with human-readable file sizes to verify all lab artifacts created during the session.</w:t>
+            </w:r>
+          </w:p>
+        </w:tc>
+      </w:tr>
+      <w:tr>
+        <w:tc>
+          <w:tcPr>
+            <w:tcW w:type="dxa" w:w="9360"/>
+            <w:shd w:fill="F9FBE7"/>
+          </w:tcPr>
+          <w:p>
+            <w:r>
+              <w:rPr>
+                <w:b/>
+                <w:color w:val="33691E"/>
+                <w:sz w:val="19"/>
+              </w:rPr>
+              <w:t xml:space="preserve">• Observation &amp; Result: </w:t>
+            </w:r>
+            <w:r>
+              <w:rPr>
+                <w:color w:val="424242"/>
+                <w:sz w:val="19"/>
+              </w:rPr>
+              <w:t>Listed all files ('greeting.txt', 'hello.c', 'hello_program', 'hello_program_warn') along with their exact sizes and permissions.</w:t>
+            </w:r>
+          </w:p>
+        </w:tc>
+      </w:tr>
+    </w:tbl>
+    <w:p/>
     <w:p>
       <w:r>
         <w:rPr>
           <w:b/>
-          <w:sz w:val="22"/>
+          <w:color w:val="212121"/>
+          <w:sz w:val="23"/>
         </w:rPr>
-        <w:t>Task 4.2: Final Review &amp; Optional Cleanup</w:t>
+        <w:t>Task 4.2: Final Source Code Review &amp; Verification</w:t>
       </w:r>
     </w:p>
     <w:tbl>
@@ -1688,8 +2621,6 @@
                 <w:sz w:val="19"/>
               </w:rPr>
               <w:t>cat ~/linux_lab/hello.c</w:t>
-              <w:br/>
-              <w:t># (Optional) rm -rf ~/linux_lab</w:t>
             </w:r>
           </w:p>
         </w:tc>
@@ -1718,7 +2649,7 @@
             <w:r>
               <w:drawing>
                 <wp:inline xmlns:a="http://schemas.openxmlformats.org/drawingml/2006/main" xmlns:pic="http://schemas.openxmlformats.org/drawingml/2006/picture">
-                  <wp:extent cx="5486400" cy="1659301"/>
+                  <wp:extent cx="5669280" cy="1714612"/>
                   <wp:docPr id="16" name="Picture 16"/>
                   <wp:cNvGraphicFramePr>
                     <a:graphicFrameLocks noChangeAspect="1"/>
@@ -1727,7 +2658,7 @@
                     <a:graphicData uri="http://schemas.openxmlformats.org/drawingml/2006/picture">
                       <pic:pic>
                         <pic:nvPicPr>
-                          <pic:cNvPr id="0" name="step16_cat_final.png"/>
+                          <pic:cNvPr id="0" name="step16.png"/>
                           <pic:cNvPicPr/>
                         </pic:nvPicPr>
                         <pic:blipFill>
@@ -1739,7 +2670,7 @@
                         <pic:spPr>
                           <a:xfrm>
                             <a:off x="0" y="0"/>
-                            <a:ext cx="5486400" cy="1659301"/>
+                            <a:ext cx="5669280" cy="1714612"/>
                           </a:xfrm>
                           <a:prstGeom prst="rect"/>
                         </pic:spPr>
@@ -1748,6 +2679,67 @@
                   </a:graphic>
                 </wp:inline>
               </w:drawing>
+            </w:r>
+          </w:p>
+        </w:tc>
+      </w:tr>
+    </w:tbl>
+    <w:p/>
+    <w:tbl>
+      <w:tblPr>
+        <w:tblW w:type="auto" w:w="0"/>
+        <w:jc w:val="center"/>
+        <w:tblLook w:firstColumn="1" w:firstRow="1" w:lastColumn="0" w:lastRow="0" w:noHBand="0" w:noVBand="1" w:val="04A0"/>
+      </w:tblPr>
+      <w:tblGrid>
+        <w:gridCol w:w="8640"/>
+      </w:tblGrid>
+      <w:tr>
+        <w:tc>
+          <w:tcPr>
+            <w:tcW w:type="dxa" w:w="9360"/>
+            <w:shd w:fill="FFFFFF"/>
+          </w:tcPr>
+          <w:p>
+            <w:r>
+              <w:rPr>
+                <w:b/>
+                <w:color w:val="283593"/>
+                <w:sz w:val="19"/>
+              </w:rPr>
+              <w:t xml:space="preserve">• Action Performed: </w:t>
+            </w:r>
+            <w:r>
+              <w:rPr>
+                <w:color w:val="424242"/>
+                <w:sz w:val="19"/>
+              </w:rPr>
+              <w:t>Printed the final state of the C program from the home directory using 'cat' to ensure source integrity.</w:t>
+            </w:r>
+          </w:p>
+        </w:tc>
+      </w:tr>
+      <w:tr>
+        <w:tc>
+          <w:tcPr>
+            <w:tcW w:type="dxa" w:w="9360"/>
+            <w:shd w:fill="F9FBE7"/>
+          </w:tcPr>
+          <w:p>
+            <w:r>
+              <w:rPr>
+                <w:b/>
+                <w:color w:val="33691E"/>
+                <w:sz w:val="19"/>
+              </w:rPr>
+              <w:t xml:space="preserve">• Observation &amp; Result: </w:t>
+            </w:r>
+            <w:r>
+              <w:rPr>
+                <w:color w:val="424242"/>
+                <w:sz w:val="19"/>
+              </w:rPr>
+              <w:t>The terminal verified the completed, functional code for the lab submission.</w:t>
             </w:r>
           </w:p>
         </w:tc>

</xml_diff>

<commit_message>
Format explanations into direct text paragraphs under each screenshot
</commit_message>
<xml_diff>
--- a/week 1/lab1.docx
+++ b/week 1/lab1.docx
@@ -25,7 +25,7 @@
           <w:color w:val="37474F"/>
           <w:sz w:val="26"/>
         </w:rPr>
-        <w:t>Lab Report 1: Linux Fundamentals (Files, APT &amp; C Programming)</w:t>
+        <w:t>Lab Report 1: Linux Fundamentals (Files, APT Package Management &amp; C Programming)</w:t>
       </w:r>
     </w:p>
     <w:p>
@@ -36,9 +36,9 @@
         <w:rPr>
           <w:i/>
           <w:color w:val="78909C"/>
-          <w:sz w:val="20"/>
+          <w:sz w:val="21"/>
         </w:rPr>
-        <w:t>Student Name: Dibij | Course: Operating Systems, Security and Network Softwarica</w:t>
+        <w:t>Coursework Lab Submission | Student: Dibij | Institution: Softwarica College</w:t>
       </w:r>
     </w:p>
     <w:p/>
@@ -47,7 +47,7 @@
         <w:rPr>
           <w:b/>
           <w:color w:val="0D47A1"/>
-          <w:sz w:val="28"/>
+          <w:sz w:val="30"/>
         </w:rPr>
         <w:t>Part I: File Operations</w:t>
       </w:r>
@@ -57,1009 +57,639 @@
         <w:rPr>
           <w:b/>
           <w:color w:val="212121"/>
-          <w:sz w:val="23"/>
+          <w:sz w:val="24"/>
         </w:rPr>
         <w:t>Task 1.1: Create and Navigate to Lab Directory</w:t>
       </w:r>
     </w:p>
-    <w:tbl>
-      <w:tblPr>
-        <w:tblW w:type="auto" w:w="0"/>
+    <w:p>
+      <w:r>
+        <w:rPr>
+          <w:b/>
+          <w:color w:val="283593"/>
+          <w:sz w:val="20"/>
+        </w:rPr>
+        <w:t>Command Executed:</w:t>
+        <w:br/>
+      </w:r>
+      <w:r>
+        <w:rPr>
+          <w:rFonts w:ascii="Courier New" w:hAnsi="Courier New"/>
+          <w:color w:val="1B5E20"/>
+          <w:sz w:val="20"/>
+        </w:rPr>
+        <w:t>mkdir ~/linux_lab</w:t>
+        <w:br/>
+        <w:t>cd ~/linux_lab</w:t>
+        <w:br/>
+        <w:t>pwd</w:t>
+      </w:r>
+    </w:p>
+    <w:p>
+      <w:pPr>
         <w:jc w:val="center"/>
-        <w:tblLook w:firstColumn="1" w:firstRow="1" w:lastColumn="0" w:lastRow="0" w:noHBand="0" w:noVBand="1" w:val="04A0"/>
-      </w:tblPr>
-      <w:tblGrid>
-        <w:gridCol w:w="8640"/>
-      </w:tblGrid>
-      <w:tr>
-        <w:tc>
-          <w:tcPr>
-            <w:tcW w:type="dxa" w:w="9360"/>
-            <w:shd w:fill="F5F7FA"/>
-          </w:tcPr>
-          <w:p>
-            <w:r>
-              <w:rPr>
-                <w:rFonts w:ascii="Courier New" w:hAnsi="Courier New"/>
-                <w:b/>
-                <w:color w:val="1B5E20"/>
-              </w:rPr>
-              <w:t xml:space="preserve">$ </w:t>
-            </w:r>
-            <w:r>
-              <w:rPr>
-                <w:rFonts w:ascii="Courier New" w:hAnsi="Courier New"/>
-                <w:sz w:val="19"/>
-              </w:rPr>
-              <w:t>mkdir ~/linux_lab</w:t>
-              <w:br/>
-              <w:t>cd ~/linux_lab</w:t>
-              <w:br/>
-              <w:t>pwd</w:t>
-            </w:r>
-          </w:p>
-        </w:tc>
-      </w:tr>
-    </w:tbl>
-    <w:p/>
-    <w:tbl>
-      <w:tblPr>
-        <w:tblW w:type="auto" w:w="0"/>
-        <w:jc w:val="center"/>
-        <w:tblLook w:firstColumn="1" w:firstRow="1" w:lastColumn="0" w:lastRow="0" w:noHBand="0" w:noVBand="1" w:val="04A0"/>
-      </w:tblPr>
-      <w:tblGrid>
-        <w:gridCol w:w="8640"/>
-      </w:tblGrid>
-      <w:tr>
-        <w:tc>
-          <w:tcPr>
-            <w:tcW w:type="dxa" w:w="9360"/>
-            <w:shd w:fill="FAFAFA"/>
-          </w:tcPr>
-          <w:p>
-            <w:pPr>
-              <w:jc w:val="center"/>
-            </w:pPr>
-            <w:r>
-              <w:drawing>
-                <wp:inline xmlns:a="http://schemas.openxmlformats.org/drawingml/2006/main" xmlns:pic="http://schemas.openxmlformats.org/drawingml/2006/picture">
-                  <wp:extent cx="5669280" cy="1023235"/>
-                  <wp:docPr id="1" name="Picture 1"/>
-                  <wp:cNvGraphicFramePr>
-                    <a:graphicFrameLocks noChangeAspect="1"/>
-                  </wp:cNvGraphicFramePr>
-                  <a:graphic>
-                    <a:graphicData uri="http://schemas.openxmlformats.org/drawingml/2006/picture">
-                      <pic:pic>
-                        <pic:nvPicPr>
-                          <pic:cNvPr id="0" name="step1.png"/>
-                          <pic:cNvPicPr/>
-                        </pic:nvPicPr>
-                        <pic:blipFill>
-                          <a:blip r:embed="rId9"/>
-                          <a:stretch>
-                            <a:fillRect/>
-                          </a:stretch>
-                        </pic:blipFill>
-                        <pic:spPr>
-                          <a:xfrm>
-                            <a:off x="0" y="0"/>
-                            <a:ext cx="5669280" cy="1023235"/>
-                          </a:xfrm>
-                          <a:prstGeom prst="rect"/>
-                        </pic:spPr>
-                      </pic:pic>
-                    </a:graphicData>
-                  </a:graphic>
-                </wp:inline>
-              </w:drawing>
-            </w:r>
-          </w:p>
-        </w:tc>
-      </w:tr>
-    </w:tbl>
-    <w:p/>
-    <w:tbl>
-      <w:tblPr>
-        <w:tblW w:type="auto" w:w="0"/>
-        <w:jc w:val="center"/>
-        <w:tblLook w:firstColumn="1" w:firstRow="1" w:lastColumn="0" w:lastRow="0" w:noHBand="0" w:noVBand="1" w:val="04A0"/>
-      </w:tblPr>
-      <w:tblGrid>
-        <w:gridCol w:w="8640"/>
-      </w:tblGrid>
-      <w:tr>
-        <w:tc>
-          <w:tcPr>
-            <w:tcW w:type="dxa" w:w="9360"/>
-            <w:shd w:fill="FFFFFF"/>
-          </w:tcPr>
-          <w:p>
-            <w:r>
-              <w:rPr>
-                <w:b/>
-                <w:color w:val="283593"/>
-                <w:sz w:val="19"/>
-              </w:rPr>
-              <w:t xml:space="preserve">• Action Performed: </w:t>
-            </w:r>
-            <w:r>
-              <w:rPr>
-                <w:color w:val="424242"/>
-                <w:sz w:val="19"/>
-              </w:rPr>
-              <w:t>Created a dedicated working folder 'linux_lab' in the home directory using the 'mkdir' command and switched into it using 'cd'. Checked current working directory with 'pwd'.</w:t>
-            </w:r>
-          </w:p>
-        </w:tc>
-      </w:tr>
-      <w:tr>
-        <w:tc>
-          <w:tcPr>
-            <w:tcW w:type="dxa" w:w="9360"/>
-            <w:shd w:fill="F9FBE7"/>
-          </w:tcPr>
-          <w:p>
-            <w:r>
-              <w:rPr>
-                <w:b/>
-                <w:color w:val="33691E"/>
-                <w:sz w:val="19"/>
-              </w:rPr>
-              <w:t xml:space="preserve">• Observation &amp; Result: </w:t>
-            </w:r>
-            <w:r>
-              <w:rPr>
-                <w:color w:val="424242"/>
-                <w:sz w:val="19"/>
-              </w:rPr>
-              <w:t>The shell prompt updated to '~/linux_lab', and 'pwd' verified the absolute path '/home/dibij/linux_lab', confirming successful creation and entry.</w:t>
-            </w:r>
-          </w:p>
-        </w:tc>
-      </w:tr>
-    </w:tbl>
+      </w:pPr>
+      <w:r>
+        <w:drawing>
+          <wp:inline xmlns:a="http://schemas.openxmlformats.org/drawingml/2006/main" xmlns:pic="http://schemas.openxmlformats.org/drawingml/2006/picture">
+            <wp:extent cx="5669280" cy="1023235"/>
+            <wp:docPr id="1" name="Picture 1"/>
+            <wp:cNvGraphicFramePr>
+              <a:graphicFrameLocks noChangeAspect="1"/>
+            </wp:cNvGraphicFramePr>
+            <a:graphic>
+              <a:graphicData uri="http://schemas.openxmlformats.org/drawingml/2006/picture">
+                <pic:pic>
+                  <pic:nvPicPr>
+                    <pic:cNvPr id="0" name="step1.png"/>
+                    <pic:cNvPicPr/>
+                  </pic:nvPicPr>
+                  <pic:blipFill>
+                    <a:blip r:embed="rId9"/>
+                    <a:stretch>
+                      <a:fillRect/>
+                    </a:stretch>
+                  </pic:blipFill>
+                  <pic:spPr>
+                    <a:xfrm>
+                      <a:off x="0" y="0"/>
+                      <a:ext cx="5669280" cy="1023235"/>
+                    </a:xfrm>
+                    <a:prstGeom prst="rect"/>
+                  </pic:spPr>
+                </pic:pic>
+              </a:graphicData>
+            </a:graphic>
+          </wp:inline>
+        </w:drawing>
+      </w:r>
+    </w:p>
+    <w:p>
+      <w:r>
+        <w:rPr>
+          <w:b/>
+          <w:color w:val="0D47A1"/>
+          <w:sz w:val="21"/>
+        </w:rPr>
+        <w:t xml:space="preserve">What was done in this step: </w:t>
+      </w:r>
+      <w:r>
+        <w:rPr>
+          <w:color w:val="212121"/>
+          <w:sz w:val="21"/>
+        </w:rPr>
+        <w:t>In this step, I created a dedicated lab workspace directory named 'linux_lab' in my home directory using the 'mkdir' command. I then used the 'cd' command to navigate directly into this new directory. Finally, I executed 'pwd' to confirm that my current working directory was successfully set to '/home/dibij/linux_lab'.</w:t>
+      </w:r>
+    </w:p>
+    <w:p>
+      <w:r>
+        <w:rPr>
+          <w:b/>
+          <w:color w:val="2E7D32"/>
+          <w:sz w:val="21"/>
+        </w:rPr>
+        <w:t xml:space="preserve">Screenshot Output &amp; Observation: </w:t>
+      </w:r>
+      <w:r>
+        <w:rPr>
+          <w:color w:val="212121"/>
+          <w:sz w:val="21"/>
+        </w:rPr>
+        <w:t>The screenshot confirms that the directory was created without errors, the command prompt updated to reflect the new directory '~/linux_lab', and 'pwd' returned the exact absolute path.</w:t>
+      </w:r>
+    </w:p>
     <w:p/>
     <w:p>
       <w:r>
         <w:rPr>
           <w:b/>
           <w:color w:val="212121"/>
-          <w:sz w:val="23"/>
+          <w:sz w:val="24"/>
         </w:rPr>
-        <w:t>Task 1.2: Create and Edit a Text File using Nano</w:t>
+        <w:t>Task 1.2: Create and Edit File using Nano Editor</w:t>
       </w:r>
     </w:p>
-    <w:tbl>
-      <w:tblPr>
-        <w:tblW w:type="auto" w:w="0"/>
+    <w:p>
+      <w:r>
+        <w:rPr>
+          <w:b/>
+          <w:color w:val="283593"/>
+          <w:sz w:val="20"/>
+        </w:rPr>
+        <w:t>Command Executed:</w:t>
+        <w:br/>
+      </w:r>
+      <w:r>
+        <w:rPr>
+          <w:rFonts w:ascii="Courier New" w:hAnsi="Courier New"/>
+          <w:color w:val="1B5E20"/>
+          <w:sz w:val="20"/>
+        </w:rPr>
+        <w:t>nano greeting.txt</w:t>
+      </w:r>
+    </w:p>
+    <w:p>
+      <w:pPr>
         <w:jc w:val="center"/>
-        <w:tblLook w:firstColumn="1" w:firstRow="1" w:lastColumn="0" w:lastRow="0" w:noHBand="0" w:noVBand="1" w:val="04A0"/>
-      </w:tblPr>
-      <w:tblGrid>
-        <w:gridCol w:w="8640"/>
-      </w:tblGrid>
-      <w:tr>
-        <w:tc>
-          <w:tcPr>
-            <w:tcW w:type="dxa" w:w="9360"/>
-            <w:shd w:fill="F5F7FA"/>
-          </w:tcPr>
-          <w:p>
-            <w:r>
-              <w:rPr>
-                <w:rFonts w:ascii="Courier New" w:hAnsi="Courier New"/>
-                <w:b/>
-                <w:color w:val="1B5E20"/>
-              </w:rPr>
-              <w:t xml:space="preserve">$ </w:t>
-            </w:r>
-            <w:r>
-              <w:rPr>
-                <w:rFonts w:ascii="Courier New" w:hAnsi="Courier New"/>
-                <w:sz w:val="19"/>
-              </w:rPr>
-              <w:t>nano greeting.txt</w:t>
-            </w:r>
-          </w:p>
-        </w:tc>
-      </w:tr>
-    </w:tbl>
-    <w:p/>
-    <w:tbl>
-      <w:tblPr>
-        <w:tblW w:type="auto" w:w="0"/>
-        <w:jc w:val="center"/>
-        <w:tblLook w:firstColumn="1" w:firstRow="1" w:lastColumn="0" w:lastRow="0" w:noHBand="0" w:noVBand="1" w:val="04A0"/>
-      </w:tblPr>
-      <w:tblGrid>
-        <w:gridCol w:w="8640"/>
-      </w:tblGrid>
-      <w:tr>
-        <w:tc>
-          <w:tcPr>
-            <w:tcW w:type="dxa" w:w="9360"/>
-            <w:shd w:fill="FAFAFA"/>
-          </w:tcPr>
-          <w:p>
-            <w:pPr>
-              <w:jc w:val="center"/>
-            </w:pPr>
-            <w:r>
-              <w:drawing>
-                <wp:inline xmlns:a="http://schemas.openxmlformats.org/drawingml/2006/main" xmlns:pic="http://schemas.openxmlformats.org/drawingml/2006/picture">
-                  <wp:extent cx="5669280" cy="1161511"/>
-                  <wp:docPr id="2" name="Picture 2"/>
-                  <wp:cNvGraphicFramePr>
-                    <a:graphicFrameLocks noChangeAspect="1"/>
-                  </wp:cNvGraphicFramePr>
-                  <a:graphic>
-                    <a:graphicData uri="http://schemas.openxmlformats.org/drawingml/2006/picture">
-                      <pic:pic>
-                        <pic:nvPicPr>
-                          <pic:cNvPr id="0" name="step2.png"/>
-                          <pic:cNvPicPr/>
-                        </pic:nvPicPr>
-                        <pic:blipFill>
-                          <a:blip r:embed="rId10"/>
-                          <a:stretch>
-                            <a:fillRect/>
-                          </a:stretch>
-                        </pic:blipFill>
-                        <pic:spPr>
-                          <a:xfrm>
-                            <a:off x="0" y="0"/>
-                            <a:ext cx="5669280" cy="1161511"/>
-                          </a:xfrm>
-                          <a:prstGeom prst="rect"/>
-                        </pic:spPr>
-                      </pic:pic>
-                    </a:graphicData>
-                  </a:graphic>
-                </wp:inline>
-              </w:drawing>
-            </w:r>
-          </w:p>
-        </w:tc>
-      </w:tr>
-    </w:tbl>
-    <w:p/>
-    <w:tbl>
-      <w:tblPr>
-        <w:tblW w:type="auto" w:w="0"/>
-        <w:jc w:val="center"/>
-        <w:tblLook w:firstColumn="1" w:firstRow="1" w:lastColumn="0" w:lastRow="0" w:noHBand="0" w:noVBand="1" w:val="04A0"/>
-      </w:tblPr>
-      <w:tblGrid>
-        <w:gridCol w:w="8640"/>
-      </w:tblGrid>
-      <w:tr>
-        <w:tc>
-          <w:tcPr>
-            <w:tcW w:type="dxa" w:w="9360"/>
-            <w:shd w:fill="FFFFFF"/>
-          </w:tcPr>
-          <w:p>
-            <w:r>
-              <w:rPr>
-                <w:b/>
-                <w:color w:val="283593"/>
-                <w:sz w:val="19"/>
-              </w:rPr>
-              <w:t xml:space="preserve">• Action Performed: </w:t>
-            </w:r>
-            <w:r>
-              <w:rPr>
-                <w:color w:val="424242"/>
-                <w:sz w:val="19"/>
-              </w:rPr>
-              <w:t>Opened the GNU Nano text editor in the terminal to create 'greeting.txt'. Typed the message 'Hello Linux!' inside the file, saved using 'Ctrl+O', and exited using 'Ctrl+X'.</w:t>
-            </w:r>
-          </w:p>
-        </w:tc>
-      </w:tr>
-      <w:tr>
-        <w:tc>
-          <w:tcPr>
-            <w:tcW w:type="dxa" w:w="9360"/>
-            <w:shd w:fill="F9FBE7"/>
-          </w:tcPr>
-          <w:p>
-            <w:r>
-              <w:rPr>
-                <w:b/>
-                <w:color w:val="33691E"/>
-                <w:sz w:val="19"/>
-              </w:rPr>
-              <w:t xml:space="preserve">• Observation &amp; Result: </w:t>
-            </w:r>
-            <w:r>
-              <w:rPr>
-                <w:color w:val="424242"/>
-                <w:sz w:val="19"/>
-              </w:rPr>
-              <w:t>Nano created the buffer 'greeting.txt' and wrote the line into the newly allocated file on the filesystem.</w:t>
-            </w:r>
-          </w:p>
-        </w:tc>
-      </w:tr>
-    </w:tbl>
+      </w:pPr>
+      <w:r>
+        <w:drawing>
+          <wp:inline xmlns:a="http://schemas.openxmlformats.org/drawingml/2006/main" xmlns:pic="http://schemas.openxmlformats.org/drawingml/2006/picture">
+            <wp:extent cx="5669280" cy="1161511"/>
+            <wp:docPr id="2" name="Picture 2"/>
+            <wp:cNvGraphicFramePr>
+              <a:graphicFrameLocks noChangeAspect="1"/>
+            </wp:cNvGraphicFramePr>
+            <a:graphic>
+              <a:graphicData uri="http://schemas.openxmlformats.org/drawingml/2006/picture">
+                <pic:pic>
+                  <pic:nvPicPr>
+                    <pic:cNvPr id="0" name="step2.png"/>
+                    <pic:cNvPicPr/>
+                  </pic:nvPicPr>
+                  <pic:blipFill>
+                    <a:blip r:embed="rId10"/>
+                    <a:stretch>
+                      <a:fillRect/>
+                    </a:stretch>
+                  </pic:blipFill>
+                  <pic:spPr>
+                    <a:xfrm>
+                      <a:off x="0" y="0"/>
+                      <a:ext cx="5669280" cy="1161511"/>
+                    </a:xfrm>
+                    <a:prstGeom prst="rect"/>
+                  </pic:spPr>
+                </pic:pic>
+              </a:graphicData>
+            </a:graphic>
+          </wp:inline>
+        </w:drawing>
+      </w:r>
+    </w:p>
+    <w:p>
+      <w:r>
+        <w:rPr>
+          <w:b/>
+          <w:color w:val="0D47A1"/>
+          <w:sz w:val="21"/>
+        </w:rPr>
+        <w:t xml:space="preserve">What was done in this step: </w:t>
+      </w:r>
+      <w:r>
+        <w:rPr>
+          <w:color w:val="212121"/>
+          <w:sz w:val="21"/>
+        </w:rPr>
+        <w:t>In this step, I launched the command-line text editor GNU Nano by running 'nano greeting.txt'. Inside the editor, I wrote the string 'Hello Linux!'. To write the contents to disk, I pressed Ctrl+O followed by Enter, and then exited the editor back to the shell using Ctrl+X.</w:t>
+      </w:r>
+    </w:p>
+    <w:p>
+      <w:r>
+        <w:rPr>
+          <w:b/>
+          <w:color w:val="2E7D32"/>
+          <w:sz w:val="21"/>
+        </w:rPr>
+        <w:t xml:space="preserve">Screenshot Output &amp; Observation: </w:t>
+      </w:r>
+      <w:r>
+        <w:rPr>
+          <w:color w:val="212121"/>
+          <w:sz w:val="21"/>
+        </w:rPr>
+        <w:t>The screenshot captures the active GNU Nano 7.2 editor interface showing the buffer name 'greeting.txt' with the entered text 'Hello Linux!' and the control shortcuts displayed at the bottom.</w:t>
+      </w:r>
+    </w:p>
     <w:p/>
     <w:p>
       <w:r>
         <w:rPr>
           <w:b/>
           <w:color w:val="212121"/>
-          <w:sz w:val="23"/>
+          <w:sz w:val="24"/>
         </w:rPr>
         <w:t>Task 1.3: View File Content using Cat</w:t>
       </w:r>
     </w:p>
-    <w:tbl>
-      <w:tblPr>
-        <w:tblW w:type="auto" w:w="0"/>
+    <w:p>
+      <w:r>
+        <w:rPr>
+          <w:b/>
+          <w:color w:val="283593"/>
+          <w:sz w:val="20"/>
+        </w:rPr>
+        <w:t>Command Executed:</w:t>
+        <w:br/>
+      </w:r>
+      <w:r>
+        <w:rPr>
+          <w:rFonts w:ascii="Courier New" w:hAnsi="Courier New"/>
+          <w:color w:val="1B5E20"/>
+          <w:sz w:val="20"/>
+        </w:rPr>
+        <w:t>cat greeting.txt</w:t>
+      </w:r>
+    </w:p>
+    <w:p>
+      <w:pPr>
         <w:jc w:val="center"/>
-        <w:tblLook w:firstColumn="1" w:firstRow="1" w:lastColumn="0" w:lastRow="0" w:noHBand="0" w:noVBand="1" w:val="04A0"/>
-      </w:tblPr>
-      <w:tblGrid>
-        <w:gridCol w:w="8640"/>
-      </w:tblGrid>
-      <w:tr>
-        <w:tc>
-          <w:tcPr>
-            <w:tcW w:type="dxa" w:w="9360"/>
-            <w:shd w:fill="F5F7FA"/>
-          </w:tcPr>
-          <w:p>
-            <w:r>
-              <w:rPr>
-                <w:rFonts w:ascii="Courier New" w:hAnsi="Courier New"/>
-                <w:b/>
-                <w:color w:val="1B5E20"/>
-              </w:rPr>
-              <w:t xml:space="preserve">$ </w:t>
-            </w:r>
-            <w:r>
-              <w:rPr>
-                <w:rFonts w:ascii="Courier New" w:hAnsi="Courier New"/>
-                <w:sz w:val="19"/>
-              </w:rPr>
-              <w:t>cat greeting.txt</w:t>
-            </w:r>
-          </w:p>
-        </w:tc>
-      </w:tr>
-    </w:tbl>
-    <w:p/>
-    <w:tbl>
-      <w:tblPr>
-        <w:tblW w:type="auto" w:w="0"/>
-        <w:jc w:val="center"/>
-        <w:tblLook w:firstColumn="1" w:firstRow="1" w:lastColumn="0" w:lastRow="0" w:noHBand="0" w:noVBand="1" w:val="04A0"/>
-      </w:tblPr>
-      <w:tblGrid>
-        <w:gridCol w:w="8640"/>
-      </w:tblGrid>
-      <w:tr>
-        <w:tc>
-          <w:tcPr>
-            <w:tcW w:type="dxa" w:w="9360"/>
-            <w:shd w:fill="FAFAFA"/>
-          </w:tcPr>
-          <w:p>
-            <w:pPr>
-              <w:jc w:val="center"/>
-            </w:pPr>
-            <w:r>
-              <w:drawing>
-                <wp:inline xmlns:a="http://schemas.openxmlformats.org/drawingml/2006/main" xmlns:pic="http://schemas.openxmlformats.org/drawingml/2006/picture">
-                  <wp:extent cx="5669280" cy="746686"/>
-                  <wp:docPr id="3" name="Picture 3"/>
-                  <wp:cNvGraphicFramePr>
-                    <a:graphicFrameLocks noChangeAspect="1"/>
-                  </wp:cNvGraphicFramePr>
-                  <a:graphic>
-                    <a:graphicData uri="http://schemas.openxmlformats.org/drawingml/2006/picture">
-                      <pic:pic>
-                        <pic:nvPicPr>
-                          <pic:cNvPr id="0" name="step3.png"/>
-                          <pic:cNvPicPr/>
-                        </pic:nvPicPr>
-                        <pic:blipFill>
-                          <a:blip r:embed="rId11"/>
-                          <a:stretch>
-                            <a:fillRect/>
-                          </a:stretch>
-                        </pic:blipFill>
-                        <pic:spPr>
-                          <a:xfrm>
-                            <a:off x="0" y="0"/>
-                            <a:ext cx="5669280" cy="746686"/>
-                          </a:xfrm>
-                          <a:prstGeom prst="rect"/>
-                        </pic:spPr>
-                      </pic:pic>
-                    </a:graphicData>
-                  </a:graphic>
-                </wp:inline>
-              </w:drawing>
-            </w:r>
-          </w:p>
-        </w:tc>
-      </w:tr>
-    </w:tbl>
-    <w:p/>
-    <w:tbl>
-      <w:tblPr>
-        <w:tblW w:type="auto" w:w="0"/>
-        <w:jc w:val="center"/>
-        <w:tblLook w:firstColumn="1" w:firstRow="1" w:lastColumn="0" w:lastRow="0" w:noHBand="0" w:noVBand="1" w:val="04A0"/>
-      </w:tblPr>
-      <w:tblGrid>
-        <w:gridCol w:w="8640"/>
-      </w:tblGrid>
-      <w:tr>
-        <w:tc>
-          <w:tcPr>
-            <w:tcW w:type="dxa" w:w="9360"/>
-            <w:shd w:fill="FFFFFF"/>
-          </w:tcPr>
-          <w:p>
-            <w:r>
-              <w:rPr>
-                <w:b/>
-                <w:color w:val="283593"/>
-                <w:sz w:val="19"/>
-              </w:rPr>
-              <w:t xml:space="preserve">• Action Performed: </w:t>
-            </w:r>
-            <w:r>
-              <w:rPr>
-                <w:color w:val="424242"/>
-                <w:sz w:val="19"/>
-              </w:rPr>
-              <w:t>Used the standard 'cat' (concatenate) utility to read and output the contents of 'greeting.txt' directly to standard output (terminal).</w:t>
-            </w:r>
-          </w:p>
-        </w:tc>
-      </w:tr>
-      <w:tr>
-        <w:tc>
-          <w:tcPr>
-            <w:tcW w:type="dxa" w:w="9360"/>
-            <w:shd w:fill="F9FBE7"/>
-          </w:tcPr>
-          <w:p>
-            <w:r>
-              <w:rPr>
-                <w:b/>
-                <w:color w:val="33691E"/>
-                <w:sz w:val="19"/>
-              </w:rPr>
-              <w:t xml:space="preserve">• Observation &amp; Result: </w:t>
-            </w:r>
-            <w:r>
-              <w:rPr>
-                <w:color w:val="424242"/>
-                <w:sz w:val="19"/>
-              </w:rPr>
-              <w:t>The terminal displayed 'Hello Linux!', verifying that the file was properly saved with the intended content.</w:t>
-            </w:r>
-          </w:p>
-        </w:tc>
-      </w:tr>
-    </w:tbl>
+      </w:pPr>
+      <w:r>
+        <w:drawing>
+          <wp:inline xmlns:a="http://schemas.openxmlformats.org/drawingml/2006/main" xmlns:pic="http://schemas.openxmlformats.org/drawingml/2006/picture">
+            <wp:extent cx="5669280" cy="746686"/>
+            <wp:docPr id="3" name="Picture 3"/>
+            <wp:cNvGraphicFramePr>
+              <a:graphicFrameLocks noChangeAspect="1"/>
+            </wp:cNvGraphicFramePr>
+            <a:graphic>
+              <a:graphicData uri="http://schemas.openxmlformats.org/drawingml/2006/picture">
+                <pic:pic>
+                  <pic:nvPicPr>
+                    <pic:cNvPr id="0" name="step3.png"/>
+                    <pic:cNvPicPr/>
+                  </pic:nvPicPr>
+                  <pic:blipFill>
+                    <a:blip r:embed="rId11"/>
+                    <a:stretch>
+                      <a:fillRect/>
+                    </a:stretch>
+                  </pic:blipFill>
+                  <pic:spPr>
+                    <a:xfrm>
+                      <a:off x="0" y="0"/>
+                      <a:ext cx="5669280" cy="746686"/>
+                    </a:xfrm>
+                    <a:prstGeom prst="rect"/>
+                  </pic:spPr>
+                </pic:pic>
+              </a:graphicData>
+            </a:graphic>
+          </wp:inline>
+        </w:drawing>
+      </w:r>
+    </w:p>
+    <w:p>
+      <w:r>
+        <w:rPr>
+          <w:b/>
+          <w:color w:val="0D47A1"/>
+          <w:sz w:val="21"/>
+        </w:rPr>
+        <w:t xml:space="preserve">What was done in this step: </w:t>
+      </w:r>
+      <w:r>
+        <w:rPr>
+          <w:color w:val="212121"/>
+          <w:sz w:val="21"/>
+        </w:rPr>
+        <w:t>In this step, I used the 'cat' (concatenate) utility to output the contents of 'greeting.txt' to the terminal window without opening a text editor.</w:t>
+      </w:r>
+    </w:p>
+    <w:p>
+      <w:r>
+        <w:rPr>
+          <w:b/>
+          <w:color w:val="2E7D32"/>
+          <w:sz w:val="21"/>
+        </w:rPr>
+        <w:t xml:space="preserve">Screenshot Output &amp; Observation: </w:t>
+      </w:r>
+      <w:r>
+        <w:rPr>
+          <w:color w:val="212121"/>
+          <w:sz w:val="21"/>
+        </w:rPr>
+        <w:t>The screenshot shows the output 'Hello Linux!', verifying that the text file was written accurately and saved on the disk.</w:t>
+      </w:r>
+    </w:p>
     <w:p/>
     <w:p>
       <w:r>
         <w:rPr>
           <w:b/>
           <w:color w:val="212121"/>
-          <w:sz w:val="23"/>
+          <w:sz w:val="24"/>
         </w:rPr>
         <w:t>Task 1.4: Copy and Rename Files</w:t>
       </w:r>
     </w:p>
-    <w:tbl>
-      <w:tblPr>
-        <w:tblW w:type="auto" w:w="0"/>
+    <w:p>
+      <w:r>
+        <w:rPr>
+          <w:b/>
+          <w:color w:val="283593"/>
+          <w:sz w:val="20"/>
+        </w:rPr>
+        <w:t>Command Executed:</w:t>
+        <w:br/>
+      </w:r>
+      <w:r>
+        <w:rPr>
+          <w:rFonts w:ascii="Courier New" w:hAnsi="Courier New"/>
+          <w:color w:val="1B5E20"/>
+          <w:sz w:val="20"/>
+        </w:rPr>
+        <w:t>cp greeting.txt backup.txt</w:t>
+        <w:br/>
+        <w:t>mv backup.txt old_greeting.txt</w:t>
+        <w:br/>
+        <w:t>ls -l</w:t>
+      </w:r>
+    </w:p>
+    <w:p>
+      <w:pPr>
         <w:jc w:val="center"/>
-        <w:tblLook w:firstColumn="1" w:firstRow="1" w:lastColumn="0" w:lastRow="0" w:noHBand="0" w:noVBand="1" w:val="04A0"/>
-      </w:tblPr>
-      <w:tblGrid>
-        <w:gridCol w:w="8640"/>
-      </w:tblGrid>
-      <w:tr>
-        <w:tc>
-          <w:tcPr>
-            <w:tcW w:type="dxa" w:w="9360"/>
-            <w:shd w:fill="F5F7FA"/>
-          </w:tcPr>
-          <w:p>
-            <w:r>
-              <w:rPr>
-                <w:rFonts w:ascii="Courier New" w:hAnsi="Courier New"/>
-                <w:b/>
-                <w:color w:val="1B5E20"/>
-              </w:rPr>
-              <w:t xml:space="preserve">$ </w:t>
-            </w:r>
-            <w:r>
-              <w:rPr>
-                <w:rFonts w:ascii="Courier New" w:hAnsi="Courier New"/>
-                <w:sz w:val="19"/>
-              </w:rPr>
-              <w:t>cp greeting.txt backup.txt</w:t>
-              <w:br/>
-              <w:t>mv backup.txt old_greeting.txt</w:t>
-              <w:br/>
-              <w:t>ls -l</w:t>
-            </w:r>
-          </w:p>
-        </w:tc>
-      </w:tr>
-    </w:tbl>
-    <w:p/>
-    <w:tbl>
-      <w:tblPr>
-        <w:tblW w:type="auto" w:w="0"/>
-        <w:jc w:val="center"/>
-        <w:tblLook w:firstColumn="1" w:firstRow="1" w:lastColumn="0" w:lastRow="0" w:noHBand="0" w:noVBand="1" w:val="04A0"/>
-      </w:tblPr>
-      <w:tblGrid>
-        <w:gridCol w:w="8640"/>
-      </w:tblGrid>
-      <w:tr>
-        <w:tc>
-          <w:tcPr>
-            <w:tcW w:type="dxa" w:w="9360"/>
-            <w:shd w:fill="FAFAFA"/>
-          </w:tcPr>
-          <w:p>
-            <w:pPr>
-              <w:jc w:val="center"/>
-            </w:pPr>
-            <w:r>
-              <w:drawing>
-                <wp:inline xmlns:a="http://schemas.openxmlformats.org/drawingml/2006/main" xmlns:pic="http://schemas.openxmlformats.org/drawingml/2006/picture">
-                  <wp:extent cx="5669280" cy="1299786"/>
-                  <wp:docPr id="4" name="Picture 4"/>
-                  <wp:cNvGraphicFramePr>
-                    <a:graphicFrameLocks noChangeAspect="1"/>
-                  </wp:cNvGraphicFramePr>
-                  <a:graphic>
-                    <a:graphicData uri="http://schemas.openxmlformats.org/drawingml/2006/picture">
-                      <pic:pic>
-                        <pic:nvPicPr>
-                          <pic:cNvPr id="0" name="step4.png"/>
-                          <pic:cNvPicPr/>
-                        </pic:nvPicPr>
-                        <pic:blipFill>
-                          <a:blip r:embed="rId12"/>
-                          <a:stretch>
-                            <a:fillRect/>
-                          </a:stretch>
-                        </pic:blipFill>
-                        <pic:spPr>
-                          <a:xfrm>
-                            <a:off x="0" y="0"/>
-                            <a:ext cx="5669280" cy="1299786"/>
-                          </a:xfrm>
-                          <a:prstGeom prst="rect"/>
-                        </pic:spPr>
-                      </pic:pic>
-                    </a:graphicData>
-                  </a:graphic>
-                </wp:inline>
-              </w:drawing>
-            </w:r>
-          </w:p>
-        </w:tc>
-      </w:tr>
-    </w:tbl>
-    <w:p/>
-    <w:tbl>
-      <w:tblPr>
-        <w:tblW w:type="auto" w:w="0"/>
-        <w:jc w:val="center"/>
-        <w:tblLook w:firstColumn="1" w:firstRow="1" w:lastColumn="0" w:lastRow="0" w:noHBand="0" w:noVBand="1" w:val="04A0"/>
-      </w:tblPr>
-      <w:tblGrid>
-        <w:gridCol w:w="8640"/>
-      </w:tblGrid>
-      <w:tr>
-        <w:tc>
-          <w:tcPr>
-            <w:tcW w:type="dxa" w:w="9360"/>
-            <w:shd w:fill="FFFFFF"/>
-          </w:tcPr>
-          <w:p>
-            <w:r>
-              <w:rPr>
-                <w:b/>
-                <w:color w:val="283593"/>
-                <w:sz w:val="19"/>
-              </w:rPr>
-              <w:t xml:space="preserve">• Action Performed: </w:t>
-            </w:r>
-            <w:r>
-              <w:rPr>
-                <w:color w:val="424242"/>
-                <w:sz w:val="19"/>
-              </w:rPr>
-              <w:t>Created a duplicate copy of 'greeting.txt' named 'backup.txt' using 'cp'. Then used 'mv' to rename 'backup.txt' to 'old_greeting.txt'. Checked with 'ls -l'.</w:t>
-            </w:r>
-          </w:p>
-        </w:tc>
-      </w:tr>
-      <w:tr>
-        <w:tc>
-          <w:tcPr>
-            <w:tcW w:type="dxa" w:w="9360"/>
-            <w:shd w:fill="F9FBE7"/>
-          </w:tcPr>
-          <w:p>
-            <w:r>
-              <w:rPr>
-                <w:b/>
-                <w:color w:val="33691E"/>
-                <w:sz w:val="19"/>
-              </w:rPr>
-              <w:t xml:space="preserve">• Observation &amp; Result: </w:t>
-            </w:r>
-            <w:r>
-              <w:rPr>
-                <w:color w:val="424242"/>
-                <w:sz w:val="19"/>
-              </w:rPr>
-              <w:t>'ls -l' confirms that 'greeting.txt' and 'old_greeting.txt' now both exist as distinct files with identical size (13 bytes).</w:t>
-            </w:r>
-          </w:p>
-        </w:tc>
-      </w:tr>
-    </w:tbl>
+      </w:pPr>
+      <w:r>
+        <w:drawing>
+          <wp:inline xmlns:a="http://schemas.openxmlformats.org/drawingml/2006/main" xmlns:pic="http://schemas.openxmlformats.org/drawingml/2006/picture">
+            <wp:extent cx="5669280" cy="1299786"/>
+            <wp:docPr id="4" name="Picture 4"/>
+            <wp:cNvGraphicFramePr>
+              <a:graphicFrameLocks noChangeAspect="1"/>
+            </wp:cNvGraphicFramePr>
+            <a:graphic>
+              <a:graphicData uri="http://schemas.openxmlformats.org/drawingml/2006/picture">
+                <pic:pic>
+                  <pic:nvPicPr>
+                    <pic:cNvPr id="0" name="step4.png"/>
+                    <pic:cNvPicPr/>
+                  </pic:nvPicPr>
+                  <pic:blipFill>
+                    <a:blip r:embed="rId12"/>
+                    <a:stretch>
+                      <a:fillRect/>
+                    </a:stretch>
+                  </pic:blipFill>
+                  <pic:spPr>
+                    <a:xfrm>
+                      <a:off x="0" y="0"/>
+                      <a:ext cx="5669280" cy="1299786"/>
+                    </a:xfrm>
+                    <a:prstGeom prst="rect"/>
+                  </pic:spPr>
+                </pic:pic>
+              </a:graphicData>
+            </a:graphic>
+          </wp:inline>
+        </w:drawing>
+      </w:r>
+    </w:p>
+    <w:p>
+      <w:r>
+        <w:rPr>
+          <w:b/>
+          <w:color w:val="0D47A1"/>
+          <w:sz w:val="21"/>
+        </w:rPr>
+        <w:t xml:space="preserve">What was done in this step: </w:t>
+      </w:r>
+      <w:r>
+        <w:rPr>
+          <w:color w:val="212121"/>
+          <w:sz w:val="21"/>
+        </w:rPr>
+        <w:t>In this step, I demonstrated file duplication and renaming. First, I made a copy of 'greeting.txt' called 'backup.txt' using 'cp'. Then, I used 'mv' to rename 'backup.txt' to 'old_greeting.txt'. Finally, I executed 'ls -l' to list all files.</w:t>
+      </w:r>
+    </w:p>
+    <w:p>
+      <w:r>
+        <w:rPr>
+          <w:b/>
+          <w:color w:val="2E7D32"/>
+          <w:sz w:val="21"/>
+        </w:rPr>
+        <w:t xml:space="preserve">Screenshot Output &amp; Observation: </w:t>
+      </w:r>
+      <w:r>
+        <w:rPr>
+          <w:color w:val="212121"/>
+          <w:sz w:val="21"/>
+        </w:rPr>
+        <w:t>The screenshot shows the output of 'ls -l', confirming that 'greeting.txt' and 'old_greeting.txt' both exist as distinct files with identical size (13 bytes).</w:t>
+      </w:r>
+    </w:p>
     <w:p/>
     <w:p>
       <w:r>
         <w:rPr>
           <w:b/>
           <w:color w:val="212121"/>
-          <w:sz w:val="23"/>
+          <w:sz w:val="24"/>
         </w:rPr>
         <w:t>Task 1.5: Remove Files and Directories</w:t>
       </w:r>
     </w:p>
-    <w:tbl>
-      <w:tblPr>
-        <w:tblW w:type="auto" w:w="0"/>
+    <w:p>
+      <w:r>
+        <w:rPr>
+          <w:b/>
+          <w:color w:val="283593"/>
+          <w:sz w:val="20"/>
+        </w:rPr>
+        <w:t>Command Executed:</w:t>
+        <w:br/>
+      </w:r>
+      <w:r>
+        <w:rPr>
+          <w:rFonts w:ascii="Courier New" w:hAnsi="Courier New"/>
+          <w:color w:val="1B5E20"/>
+          <w:sz w:val="20"/>
+        </w:rPr>
+        <w:t>rm old_greeting.txt</w:t>
+        <w:br/>
+        <w:t>mkdir temp_dir</w:t>
+        <w:br/>
+        <w:t>rmdir temp_dir</w:t>
+        <w:br/>
+        <w:t>ls -l</w:t>
+      </w:r>
+    </w:p>
+    <w:p>
+      <w:pPr>
         <w:jc w:val="center"/>
-        <w:tblLook w:firstColumn="1" w:firstRow="1" w:lastColumn="0" w:lastRow="0" w:noHBand="0" w:noVBand="1" w:val="04A0"/>
-      </w:tblPr>
-      <w:tblGrid>
-        <w:gridCol w:w="8640"/>
-      </w:tblGrid>
-      <w:tr>
-        <w:tc>
-          <w:tcPr>
-            <w:tcW w:type="dxa" w:w="9360"/>
-            <w:shd w:fill="F5F7FA"/>
-          </w:tcPr>
-          <w:p>
-            <w:r>
-              <w:rPr>
-                <w:rFonts w:ascii="Courier New" w:hAnsi="Courier New"/>
-                <w:b/>
-                <w:color w:val="1B5E20"/>
-              </w:rPr>
-              <w:t xml:space="preserve">$ </w:t>
-            </w:r>
-            <w:r>
-              <w:rPr>
-                <w:rFonts w:ascii="Courier New" w:hAnsi="Courier New"/>
-                <w:sz w:val="19"/>
-              </w:rPr>
-              <w:t>rm old_greeting.txt</w:t>
-              <w:br/>
-              <w:t>mkdir temp_dir</w:t>
-              <w:br/>
-              <w:t>rmdir temp_dir</w:t>
-            </w:r>
-          </w:p>
-        </w:tc>
-      </w:tr>
-    </w:tbl>
-    <w:p/>
-    <w:tbl>
-      <w:tblPr>
-        <w:tblW w:type="auto" w:w="0"/>
-        <w:jc w:val="center"/>
-        <w:tblLook w:firstColumn="1" w:firstRow="1" w:lastColumn="0" w:lastRow="0" w:noHBand="0" w:noVBand="1" w:val="04A0"/>
-      </w:tblPr>
-      <w:tblGrid>
-        <w:gridCol w:w="8640"/>
-      </w:tblGrid>
-      <w:tr>
-        <w:tc>
-          <w:tcPr>
-            <w:tcW w:type="dxa" w:w="9360"/>
-            <w:shd w:fill="FAFAFA"/>
-          </w:tcPr>
-          <w:p>
-            <w:pPr>
-              <w:jc w:val="center"/>
-            </w:pPr>
-            <w:r>
-              <w:drawing>
-                <wp:inline xmlns:a="http://schemas.openxmlformats.org/drawingml/2006/main" xmlns:pic="http://schemas.openxmlformats.org/drawingml/2006/picture">
-                  <wp:extent cx="5669280" cy="1299786"/>
-                  <wp:docPr id="5" name="Picture 5"/>
-                  <wp:cNvGraphicFramePr>
-                    <a:graphicFrameLocks noChangeAspect="1"/>
-                  </wp:cNvGraphicFramePr>
-                  <a:graphic>
-                    <a:graphicData uri="http://schemas.openxmlformats.org/drawingml/2006/picture">
-                      <pic:pic>
-                        <pic:nvPicPr>
-                          <pic:cNvPr id="0" name="step5.png"/>
-                          <pic:cNvPicPr/>
-                        </pic:nvPicPr>
-                        <pic:blipFill>
-                          <a:blip r:embed="rId13"/>
-                          <a:stretch>
-                            <a:fillRect/>
-                          </a:stretch>
-                        </pic:blipFill>
-                        <pic:spPr>
-                          <a:xfrm>
-                            <a:off x="0" y="0"/>
-                            <a:ext cx="5669280" cy="1299786"/>
-                          </a:xfrm>
-                          <a:prstGeom prst="rect"/>
-                        </pic:spPr>
-                      </pic:pic>
-                    </a:graphicData>
-                  </a:graphic>
-                </wp:inline>
-              </w:drawing>
-            </w:r>
-          </w:p>
-        </w:tc>
-      </w:tr>
-    </w:tbl>
-    <w:p/>
-    <w:tbl>
-      <w:tblPr>
-        <w:tblW w:type="auto" w:w="0"/>
-        <w:jc w:val="center"/>
-        <w:tblLook w:firstColumn="1" w:firstRow="1" w:lastColumn="0" w:lastRow="0" w:noHBand="0" w:noVBand="1" w:val="04A0"/>
-      </w:tblPr>
-      <w:tblGrid>
-        <w:gridCol w:w="8640"/>
-      </w:tblGrid>
-      <w:tr>
-        <w:tc>
-          <w:tcPr>
-            <w:tcW w:type="dxa" w:w="9360"/>
-            <w:shd w:fill="FFFFFF"/>
-          </w:tcPr>
-          <w:p>
-            <w:r>
-              <w:rPr>
-                <w:b/>
-                <w:color w:val="283593"/>
-                <w:sz w:val="19"/>
-              </w:rPr>
-              <w:t xml:space="preserve">• Action Performed: </w:t>
-            </w:r>
-            <w:r>
-              <w:rPr>
-                <w:color w:val="424242"/>
-                <w:sz w:val="19"/>
-              </w:rPr>
-              <w:t>Deleted the file 'old_greeting.txt' using 'rm'. Created an empty temporary directory 'temp_dir' with 'mkdir', and cleanly deleted it using 'rmdir'.</w:t>
-            </w:r>
-          </w:p>
-        </w:tc>
-      </w:tr>
-      <w:tr>
-        <w:tc>
-          <w:tcPr>
-            <w:tcW w:type="dxa" w:w="9360"/>
-            <w:shd w:fill="F9FBE7"/>
-          </w:tcPr>
-          <w:p>
-            <w:r>
-              <w:rPr>
-                <w:b/>
-                <w:color w:val="33691E"/>
-                <w:sz w:val="19"/>
-              </w:rPr>
-              <w:t xml:space="preserve">• Observation &amp; Result: </w:t>
-            </w:r>
-            <w:r>
-              <w:rPr>
-                <w:color w:val="424242"/>
-                <w:sz w:val="19"/>
-              </w:rPr>
-              <w:t>'old_greeting.txt' and 'temp_dir' were deleted without errors. Only 'greeting.txt' remains in the directory.</w:t>
-            </w:r>
-          </w:p>
-        </w:tc>
-      </w:tr>
-    </w:tbl>
+      </w:pPr>
+      <w:r>
+        <w:drawing>
+          <wp:inline xmlns:a="http://schemas.openxmlformats.org/drawingml/2006/main" xmlns:pic="http://schemas.openxmlformats.org/drawingml/2006/picture">
+            <wp:extent cx="5669280" cy="1299786"/>
+            <wp:docPr id="5" name="Picture 5"/>
+            <wp:cNvGraphicFramePr>
+              <a:graphicFrameLocks noChangeAspect="1"/>
+            </wp:cNvGraphicFramePr>
+            <a:graphic>
+              <a:graphicData uri="http://schemas.openxmlformats.org/drawingml/2006/picture">
+                <pic:pic>
+                  <pic:nvPicPr>
+                    <pic:cNvPr id="0" name="step5.png"/>
+                    <pic:cNvPicPr/>
+                  </pic:nvPicPr>
+                  <pic:blipFill>
+                    <a:blip r:embed="rId13"/>
+                    <a:stretch>
+                      <a:fillRect/>
+                    </a:stretch>
+                  </pic:blipFill>
+                  <pic:spPr>
+                    <a:xfrm>
+                      <a:off x="0" y="0"/>
+                      <a:ext cx="5669280" cy="1299786"/>
+                    </a:xfrm>
+                    <a:prstGeom prst="rect"/>
+                  </pic:spPr>
+                </pic:pic>
+              </a:graphicData>
+            </a:graphic>
+          </wp:inline>
+        </w:drawing>
+      </w:r>
+    </w:p>
+    <w:p>
+      <w:r>
+        <w:rPr>
+          <w:b/>
+          <w:color w:val="0D47A1"/>
+          <w:sz w:val="21"/>
+        </w:rPr>
+        <w:t xml:space="preserve">What was done in this step: </w:t>
+      </w:r>
+      <w:r>
+        <w:rPr>
+          <w:color w:val="212121"/>
+          <w:sz w:val="21"/>
+        </w:rPr>
+        <w:t>In this step, I practiced directory and file cleanup. I deleted 'old_greeting.txt' using the 'rm' command. Next, I created a temporary directory named 'temp_dir' with 'mkdir', and subsequently removed the empty directory using 'rmdir'.</w:t>
+      </w:r>
+    </w:p>
+    <w:p>
+      <w:r>
+        <w:rPr>
+          <w:b/>
+          <w:color w:val="2E7D32"/>
+          <w:sz w:val="21"/>
+        </w:rPr>
+        <w:t xml:space="preserve">Screenshot Output &amp; Observation: </w:t>
+      </w:r>
+      <w:r>
+        <w:rPr>
+          <w:color w:val="212121"/>
+          <w:sz w:val="21"/>
+        </w:rPr>
+        <w:t>The screenshot shows that 'old_greeting.txt' and 'temp_dir' were deleted cleanly, leaving only 'greeting.txt' in the working folder.</w:t>
+      </w:r>
+    </w:p>
     <w:p/>
     <w:p>
       <w:r>
         <w:rPr>
           <w:b/>
           <w:color w:val="212121"/>
-          <w:sz w:val="23"/>
+          <w:sz w:val="24"/>
         </w:rPr>
-        <w:t>Task 1.6: Inspect File Permissions</w:t>
+        <w:t>Task 1.6: Check Linux File Permissions</w:t>
       </w:r>
     </w:p>
-    <w:tbl>
-      <w:tblPr>
-        <w:tblW w:type="auto" w:w="0"/>
+    <w:p>
+      <w:r>
+        <w:rPr>
+          <w:b/>
+          <w:color w:val="283593"/>
+          <w:sz w:val="20"/>
+        </w:rPr>
+        <w:t>Command Executed:</w:t>
+        <w:br/>
+      </w:r>
+      <w:r>
+        <w:rPr>
+          <w:rFonts w:ascii="Courier New" w:hAnsi="Courier New"/>
+          <w:color w:val="1B5E20"/>
+          <w:sz w:val="20"/>
+        </w:rPr>
+        <w:t>ls -l greeting.txt</w:t>
+      </w:r>
+    </w:p>
+    <w:p>
+      <w:pPr>
         <w:jc w:val="center"/>
-        <w:tblLook w:firstColumn="1" w:firstRow="1" w:lastColumn="0" w:lastRow="0" w:noHBand="0" w:noVBand="1" w:val="04A0"/>
-      </w:tblPr>
-      <w:tblGrid>
-        <w:gridCol w:w="8640"/>
-      </w:tblGrid>
-      <w:tr>
-        <w:tc>
-          <w:tcPr>
-            <w:tcW w:type="dxa" w:w="9360"/>
-            <w:shd w:fill="F5F7FA"/>
-          </w:tcPr>
-          <w:p>
-            <w:r>
-              <w:rPr>
-                <w:rFonts w:ascii="Courier New" w:hAnsi="Courier New"/>
-                <w:b/>
-                <w:color w:val="1B5E20"/>
-              </w:rPr>
-              <w:t xml:space="preserve">$ </w:t>
-            </w:r>
-            <w:r>
-              <w:rPr>
-                <w:rFonts w:ascii="Courier New" w:hAnsi="Courier New"/>
-                <w:sz w:val="19"/>
-              </w:rPr>
-              <w:t>ls -l greeting.txt</w:t>
-            </w:r>
-          </w:p>
-        </w:tc>
-      </w:tr>
-    </w:tbl>
-    <w:p/>
-    <w:tbl>
-      <w:tblPr>
-        <w:tblW w:type="auto" w:w="0"/>
-        <w:jc w:val="center"/>
-        <w:tblLook w:firstColumn="1" w:firstRow="1" w:lastColumn="0" w:lastRow="0" w:noHBand="0" w:noVBand="1" w:val="04A0"/>
-      </w:tblPr>
-      <w:tblGrid>
-        <w:gridCol w:w="8640"/>
-      </w:tblGrid>
-      <w:tr>
-        <w:tc>
-          <w:tcPr>
-            <w:tcW w:type="dxa" w:w="9360"/>
-            <w:shd w:fill="FAFAFA"/>
-          </w:tcPr>
-          <w:p>
-            <w:pPr>
-              <w:jc w:val="center"/>
-            </w:pPr>
-            <w:r>
-              <w:drawing>
-                <wp:inline xmlns:a="http://schemas.openxmlformats.org/drawingml/2006/main" xmlns:pic="http://schemas.openxmlformats.org/drawingml/2006/picture">
-                  <wp:extent cx="5669280" cy="746686"/>
-                  <wp:docPr id="6" name="Picture 6"/>
-                  <wp:cNvGraphicFramePr>
-                    <a:graphicFrameLocks noChangeAspect="1"/>
-                  </wp:cNvGraphicFramePr>
-                  <a:graphic>
-                    <a:graphicData uri="http://schemas.openxmlformats.org/drawingml/2006/picture">
-                      <pic:pic>
-                        <pic:nvPicPr>
-                          <pic:cNvPr id="0" name="step6.png"/>
-                          <pic:cNvPicPr/>
-                        </pic:nvPicPr>
-                        <pic:blipFill>
-                          <a:blip r:embed="rId14"/>
-                          <a:stretch>
-                            <a:fillRect/>
-                          </a:stretch>
-                        </pic:blipFill>
-                        <pic:spPr>
-                          <a:xfrm>
-                            <a:off x="0" y="0"/>
-                            <a:ext cx="5669280" cy="746686"/>
-                          </a:xfrm>
-                          <a:prstGeom prst="rect"/>
-                        </pic:spPr>
-                      </pic:pic>
-                    </a:graphicData>
-                  </a:graphic>
-                </wp:inline>
-              </w:drawing>
-            </w:r>
-          </w:p>
-        </w:tc>
-      </w:tr>
-    </w:tbl>
-    <w:p/>
-    <w:tbl>
-      <w:tblPr>
-        <w:tblW w:type="auto" w:w="0"/>
-        <w:jc w:val="center"/>
-        <w:tblLook w:firstColumn="1" w:firstRow="1" w:lastColumn="0" w:lastRow="0" w:noHBand="0" w:noVBand="1" w:val="04A0"/>
-      </w:tblPr>
-      <w:tblGrid>
-        <w:gridCol w:w="8640"/>
-      </w:tblGrid>
-      <w:tr>
-        <w:tc>
-          <w:tcPr>
-            <w:tcW w:type="dxa" w:w="9360"/>
-            <w:shd w:fill="FFFFFF"/>
-          </w:tcPr>
-          <w:p>
-            <w:r>
-              <w:rPr>
-                <w:b/>
-                <w:color w:val="283593"/>
-                <w:sz w:val="19"/>
-              </w:rPr>
-              <w:t xml:space="preserve">• Action Performed: </w:t>
-            </w:r>
-            <w:r>
-              <w:rPr>
-                <w:color w:val="424242"/>
-                <w:sz w:val="19"/>
-              </w:rPr>
-              <w:t>Ran 'ls -l' on 'greeting.txt' to inspect its Linux POSIX permission string, user ownership, group ownership, byte size, and last modification timestamp.</w:t>
-            </w:r>
-          </w:p>
-        </w:tc>
-      </w:tr>
-      <w:tr>
-        <w:tc>
-          <w:tcPr>
-            <w:tcW w:type="dxa" w:w="9360"/>
-            <w:shd w:fill="F9FBE7"/>
-          </w:tcPr>
-          <w:p>
-            <w:r>
-              <w:rPr>
-                <w:b/>
-                <w:color w:val="33691E"/>
-                <w:sz w:val="19"/>
-              </w:rPr>
-              <w:t xml:space="preserve">• Observation &amp; Result: </w:t>
-            </w:r>
-            <w:r>
-              <w:rPr>
-                <w:color w:val="424242"/>
-                <w:sz w:val="19"/>
-              </w:rPr>
-              <w:t>Output shows '-rw-rw-r-- 1 dibij dibij 13', meaning the owner and group have read-write access, while others have read-only access.</w:t>
-            </w:r>
-          </w:p>
-        </w:tc>
-      </w:tr>
-    </w:tbl>
+      </w:pPr>
+      <w:r>
+        <w:drawing>
+          <wp:inline xmlns:a="http://schemas.openxmlformats.org/drawingml/2006/main" xmlns:pic="http://schemas.openxmlformats.org/drawingml/2006/picture">
+            <wp:extent cx="5669280" cy="746686"/>
+            <wp:docPr id="6" name="Picture 6"/>
+            <wp:cNvGraphicFramePr>
+              <a:graphicFrameLocks noChangeAspect="1"/>
+            </wp:cNvGraphicFramePr>
+            <a:graphic>
+              <a:graphicData uri="http://schemas.openxmlformats.org/drawingml/2006/picture">
+                <pic:pic>
+                  <pic:nvPicPr>
+                    <pic:cNvPr id="0" name="step6.png"/>
+                    <pic:cNvPicPr/>
+                  </pic:nvPicPr>
+                  <pic:blipFill>
+                    <a:blip r:embed="rId14"/>
+                    <a:stretch>
+                      <a:fillRect/>
+                    </a:stretch>
+                  </pic:blipFill>
+                  <pic:spPr>
+                    <a:xfrm>
+                      <a:off x="0" y="0"/>
+                      <a:ext cx="5669280" cy="746686"/>
+                    </a:xfrm>
+                    <a:prstGeom prst="rect"/>
+                  </pic:spPr>
+                </pic:pic>
+              </a:graphicData>
+            </a:graphic>
+          </wp:inline>
+        </w:drawing>
+      </w:r>
+    </w:p>
+    <w:p>
+      <w:r>
+        <w:rPr>
+          <w:b/>
+          <w:color w:val="0D47A1"/>
+          <w:sz w:val="21"/>
+        </w:rPr>
+        <w:t xml:space="preserve">What was done in this step: </w:t>
+      </w:r>
+      <w:r>
+        <w:rPr>
+          <w:color w:val="212121"/>
+          <w:sz w:val="21"/>
+        </w:rPr>
+        <w:t>In this step, I checked the POSIX file permission attributes, owner, group, file size, and timestamp of 'greeting.txt' using 'ls -l'.</w:t>
+      </w:r>
+    </w:p>
+    <w:p>
+      <w:r>
+        <w:rPr>
+          <w:b/>
+          <w:color w:val="2E7D32"/>
+          <w:sz w:val="21"/>
+        </w:rPr>
+        <w:t xml:space="preserve">Screenshot Output &amp; Observation: </w:t>
+      </w:r>
+      <w:r>
+        <w:rPr>
+          <w:color w:val="212121"/>
+          <w:sz w:val="21"/>
+        </w:rPr>
+        <w:t>The screenshot shows '-rw-rw-r-- 1 dibij dibij 13', demonstrating that the owner ('dibij') and group have read-write permissions while others have read-only access.</w:t>
+      </w:r>
+    </w:p>
     <w:p/>
     <w:p>
       <w:r>
         <w:rPr>
           <w:b/>
           <w:color w:val="0D47A1"/>
-          <w:sz w:val="28"/>
+          <w:sz w:val="30"/>
         </w:rPr>
         <w:t>Part II: APT Package Management</w:t>
       </w:r>
@@ -1069,667 +699,419 @@
         <w:rPr>
           <w:b/>
           <w:color w:val="212121"/>
-          <w:sz w:val="23"/>
+          <w:sz w:val="24"/>
         </w:rPr>
-        <w:t>Task 2.1: Update Package Index</w:t>
+        <w:t>Task 2.1: Update the Package Index</w:t>
       </w:r>
     </w:p>
-    <w:tbl>
-      <w:tblPr>
-        <w:tblW w:type="auto" w:w="0"/>
+    <w:p>
+      <w:r>
+        <w:rPr>
+          <w:b/>
+          <w:color w:val="283593"/>
+          <w:sz w:val="20"/>
+        </w:rPr>
+        <w:t>Command Executed:</w:t>
+        <w:br/>
+      </w:r>
+      <w:r>
+        <w:rPr>
+          <w:rFonts w:ascii="Courier New" w:hAnsi="Courier New"/>
+          <w:color w:val="1B5E20"/>
+          <w:sz w:val="20"/>
+        </w:rPr>
+        <w:t>sudo apt update</w:t>
+      </w:r>
+    </w:p>
+    <w:p>
+      <w:pPr>
         <w:jc w:val="center"/>
-        <w:tblLook w:firstColumn="1" w:firstRow="1" w:lastColumn="0" w:lastRow="0" w:noHBand="0" w:noVBand="1" w:val="04A0"/>
-      </w:tblPr>
-      <w:tblGrid>
-        <w:gridCol w:w="8640"/>
-      </w:tblGrid>
-      <w:tr>
-        <w:tc>
-          <w:tcPr>
-            <w:tcW w:type="dxa" w:w="9360"/>
-            <w:shd w:fill="F5F7FA"/>
-          </w:tcPr>
-          <w:p>
-            <w:r>
-              <w:rPr>
-                <w:rFonts w:ascii="Courier New" w:hAnsi="Courier New"/>
-                <w:b/>
-                <w:color w:val="1B5E20"/>
-              </w:rPr>
-              <w:t xml:space="preserve">$ </w:t>
-            </w:r>
-            <w:r>
-              <w:rPr>
-                <w:rFonts w:ascii="Courier New" w:hAnsi="Courier New"/>
-                <w:sz w:val="19"/>
-              </w:rPr>
-              <w:t>sudo apt update</w:t>
-            </w:r>
-          </w:p>
-        </w:tc>
-      </w:tr>
-    </w:tbl>
-    <w:p/>
-    <w:tbl>
-      <w:tblPr>
-        <w:tblW w:type="auto" w:w="0"/>
-        <w:jc w:val="center"/>
-        <w:tblLook w:firstColumn="1" w:firstRow="1" w:lastColumn="0" w:lastRow="0" w:noHBand="0" w:noVBand="1" w:val="04A0"/>
-      </w:tblPr>
-      <w:tblGrid>
-        <w:gridCol w:w="8640"/>
-      </w:tblGrid>
-      <w:tr>
-        <w:tc>
-          <w:tcPr>
-            <w:tcW w:type="dxa" w:w="9360"/>
-            <w:shd w:fill="FAFAFA"/>
-          </w:tcPr>
-          <w:p>
-            <w:pPr>
-              <w:jc w:val="center"/>
-            </w:pPr>
-            <w:r>
-              <w:drawing>
-                <wp:inline xmlns:a="http://schemas.openxmlformats.org/drawingml/2006/main" xmlns:pic="http://schemas.openxmlformats.org/drawingml/2006/picture">
-                  <wp:extent cx="5669280" cy="1438061"/>
-                  <wp:docPr id="7" name="Picture 7"/>
-                  <wp:cNvGraphicFramePr>
-                    <a:graphicFrameLocks noChangeAspect="1"/>
-                  </wp:cNvGraphicFramePr>
-                  <a:graphic>
-                    <a:graphicData uri="http://schemas.openxmlformats.org/drawingml/2006/picture">
-                      <pic:pic>
-                        <pic:nvPicPr>
-                          <pic:cNvPr id="0" name="step7.png"/>
-                          <pic:cNvPicPr/>
-                        </pic:nvPicPr>
-                        <pic:blipFill>
-                          <a:blip r:embed="rId15"/>
-                          <a:stretch>
-                            <a:fillRect/>
-                          </a:stretch>
-                        </pic:blipFill>
-                        <pic:spPr>
-                          <a:xfrm>
-                            <a:off x="0" y="0"/>
-                            <a:ext cx="5669280" cy="1438061"/>
-                          </a:xfrm>
-                          <a:prstGeom prst="rect"/>
-                        </pic:spPr>
-                      </pic:pic>
-                    </a:graphicData>
-                  </a:graphic>
-                </wp:inline>
-              </w:drawing>
-            </w:r>
-          </w:p>
-        </w:tc>
-      </w:tr>
-    </w:tbl>
-    <w:p/>
-    <w:tbl>
-      <w:tblPr>
-        <w:tblW w:type="auto" w:w="0"/>
-        <w:jc w:val="center"/>
-        <w:tblLook w:firstColumn="1" w:firstRow="1" w:lastColumn="0" w:lastRow="0" w:noHBand="0" w:noVBand="1" w:val="04A0"/>
-      </w:tblPr>
-      <w:tblGrid>
-        <w:gridCol w:w="8640"/>
-      </w:tblGrid>
-      <w:tr>
-        <w:tc>
-          <w:tcPr>
-            <w:tcW w:type="dxa" w:w="9360"/>
-            <w:shd w:fill="FFFFFF"/>
-          </w:tcPr>
-          <w:p>
-            <w:r>
-              <w:rPr>
-                <w:b/>
-                <w:color w:val="283593"/>
-                <w:sz w:val="19"/>
-              </w:rPr>
-              <w:t xml:space="preserve">• Action Performed: </w:t>
-            </w:r>
-            <w:r>
-              <w:rPr>
-                <w:color w:val="424242"/>
-                <w:sz w:val="19"/>
-              </w:rPr>
-              <w:t>Invoked 'sudo apt update' to refresh the local package cache against the official Ubuntu software repositories.</w:t>
-            </w:r>
-          </w:p>
-        </w:tc>
-      </w:tr>
-      <w:tr>
-        <w:tc>
-          <w:tcPr>
-            <w:tcW w:type="dxa" w:w="9360"/>
-            <w:shd w:fill="F9FBE7"/>
-          </w:tcPr>
-          <w:p>
-            <w:r>
-              <w:rPr>
-                <w:b/>
-                <w:color w:val="33691E"/>
-                <w:sz w:val="19"/>
-              </w:rPr>
-              <w:t xml:space="preserve">• Observation &amp; Result: </w:t>
-            </w:r>
-            <w:r>
-              <w:rPr>
-                <w:color w:val="424242"/>
-                <w:sz w:val="19"/>
-              </w:rPr>
-              <w:t>APT queried archive mirrors, updated package metadata, and verified all index definitions are synchronized and up-to-date.</w:t>
-            </w:r>
-          </w:p>
-        </w:tc>
-      </w:tr>
-    </w:tbl>
+      </w:pPr>
+      <w:r>
+        <w:drawing>
+          <wp:inline xmlns:a="http://schemas.openxmlformats.org/drawingml/2006/main" xmlns:pic="http://schemas.openxmlformats.org/drawingml/2006/picture">
+            <wp:extent cx="5669280" cy="1438061"/>
+            <wp:docPr id="7" name="Picture 7"/>
+            <wp:cNvGraphicFramePr>
+              <a:graphicFrameLocks noChangeAspect="1"/>
+            </wp:cNvGraphicFramePr>
+            <a:graphic>
+              <a:graphicData uri="http://schemas.openxmlformats.org/drawingml/2006/picture">
+                <pic:pic>
+                  <pic:nvPicPr>
+                    <pic:cNvPr id="0" name="step7.png"/>
+                    <pic:cNvPicPr/>
+                  </pic:nvPicPr>
+                  <pic:blipFill>
+                    <a:blip r:embed="rId15"/>
+                    <a:stretch>
+                      <a:fillRect/>
+                    </a:stretch>
+                  </pic:blipFill>
+                  <pic:spPr>
+                    <a:xfrm>
+                      <a:off x="0" y="0"/>
+                      <a:ext cx="5669280" cy="1438061"/>
+                    </a:xfrm>
+                    <a:prstGeom prst="rect"/>
+                  </pic:spPr>
+                </pic:pic>
+              </a:graphicData>
+            </a:graphic>
+          </wp:inline>
+        </w:drawing>
+      </w:r>
+    </w:p>
+    <w:p>
+      <w:r>
+        <w:rPr>
+          <w:b/>
+          <w:color w:val="0D47A1"/>
+          <w:sz w:val="21"/>
+        </w:rPr>
+        <w:t xml:space="preserve">What was done in this step: </w:t>
+      </w:r>
+      <w:r>
+        <w:rPr>
+          <w:color w:val="212121"/>
+          <w:sz w:val="21"/>
+        </w:rPr>
+        <w:t>In this step, I ran 'sudo apt update' to refresh my local APT package index with the latest software versions and security patches from the official Ubuntu repositories.</w:t>
+      </w:r>
+    </w:p>
+    <w:p>
+      <w:r>
+        <w:rPr>
+          <w:b/>
+          <w:color w:val="2E7D32"/>
+          <w:sz w:val="21"/>
+        </w:rPr>
+        <w:t xml:space="preserve">Screenshot Output &amp; Observation: </w:t>
+      </w:r>
+      <w:r>
+        <w:rPr>
+          <w:color w:val="212121"/>
+          <w:sz w:val="21"/>
+        </w:rPr>
+        <w:t>The screenshot shows APT querying repository mirrors (noble, noble-updates, noble-security) and concluding with 'All packages are up to date.'</w:t>
+      </w:r>
+    </w:p>
     <w:p/>
     <w:p>
       <w:r>
         <w:rPr>
           <w:b/>
           <w:color w:val="212121"/>
-          <w:sz w:val="23"/>
+          <w:sz w:val="24"/>
         </w:rPr>
         <w:t>Task 2.2: Install GCC Compiler &amp; Build Essentials</w:t>
       </w:r>
     </w:p>
-    <w:tbl>
-      <w:tblPr>
-        <w:tblW w:type="auto" w:w="0"/>
+    <w:p>
+      <w:r>
+        <w:rPr>
+          <w:b/>
+          <w:color w:val="283593"/>
+          <w:sz w:val="20"/>
+        </w:rPr>
+        <w:t>Command Executed:</w:t>
+        <w:br/>
+      </w:r>
+      <w:r>
+        <w:rPr>
+          <w:rFonts w:ascii="Courier New" w:hAnsi="Courier New"/>
+          <w:color w:val="1B5E20"/>
+          <w:sz w:val="20"/>
+        </w:rPr>
+        <w:t>sudo apt install build-essential -y</w:t>
+      </w:r>
+    </w:p>
+    <w:p>
+      <w:pPr>
         <w:jc w:val="center"/>
-        <w:tblLook w:firstColumn="1" w:firstRow="1" w:lastColumn="0" w:lastRow="0" w:noHBand="0" w:noVBand="1" w:val="04A0"/>
-      </w:tblPr>
-      <w:tblGrid>
-        <w:gridCol w:w="8640"/>
-      </w:tblGrid>
-      <w:tr>
-        <w:tc>
-          <w:tcPr>
-            <w:tcW w:type="dxa" w:w="9360"/>
-            <w:shd w:fill="F5F7FA"/>
-          </w:tcPr>
-          <w:p>
-            <w:r>
-              <w:rPr>
-                <w:rFonts w:ascii="Courier New" w:hAnsi="Courier New"/>
-                <w:b/>
-                <w:color w:val="1B5E20"/>
-              </w:rPr>
-              <w:t xml:space="preserve">$ </w:t>
-            </w:r>
-            <w:r>
-              <w:rPr>
-                <w:rFonts w:ascii="Courier New" w:hAnsi="Courier New"/>
-                <w:sz w:val="19"/>
-              </w:rPr>
-              <w:t>sudo apt install build-essential -y</w:t>
-            </w:r>
-          </w:p>
-        </w:tc>
-      </w:tr>
-    </w:tbl>
-    <w:p/>
-    <w:tbl>
-      <w:tblPr>
-        <w:tblW w:type="auto" w:w="0"/>
-        <w:jc w:val="center"/>
-        <w:tblLook w:firstColumn="1" w:firstRow="1" w:lastColumn="0" w:lastRow="0" w:noHBand="0" w:noVBand="1" w:val="04A0"/>
-      </w:tblPr>
-      <w:tblGrid>
-        <w:gridCol w:w="8640"/>
-      </w:tblGrid>
-      <w:tr>
-        <w:tc>
-          <w:tcPr>
-            <w:tcW w:type="dxa" w:w="9360"/>
-            <w:shd w:fill="FAFAFA"/>
-          </w:tcPr>
-          <w:p>
-            <w:pPr>
-              <w:jc w:val="center"/>
-            </w:pPr>
-            <w:r>
-              <w:drawing>
-                <wp:inline xmlns:a="http://schemas.openxmlformats.org/drawingml/2006/main" xmlns:pic="http://schemas.openxmlformats.org/drawingml/2006/picture">
-                  <wp:extent cx="5669280" cy="1161511"/>
-                  <wp:docPr id="8" name="Picture 8"/>
-                  <wp:cNvGraphicFramePr>
-                    <a:graphicFrameLocks noChangeAspect="1"/>
-                  </wp:cNvGraphicFramePr>
-                  <a:graphic>
-                    <a:graphicData uri="http://schemas.openxmlformats.org/drawingml/2006/picture">
-                      <pic:pic>
-                        <pic:nvPicPr>
-                          <pic:cNvPr id="0" name="step8.png"/>
-                          <pic:cNvPicPr/>
-                        </pic:nvPicPr>
-                        <pic:blipFill>
-                          <a:blip r:embed="rId16"/>
-                          <a:stretch>
-                            <a:fillRect/>
-                          </a:stretch>
-                        </pic:blipFill>
-                        <pic:spPr>
-                          <a:xfrm>
-                            <a:off x="0" y="0"/>
-                            <a:ext cx="5669280" cy="1161511"/>
-                          </a:xfrm>
-                          <a:prstGeom prst="rect"/>
-                        </pic:spPr>
-                      </pic:pic>
-                    </a:graphicData>
-                  </a:graphic>
-                </wp:inline>
-              </w:drawing>
-            </w:r>
-          </w:p>
-        </w:tc>
-      </w:tr>
-    </w:tbl>
-    <w:p/>
-    <w:tbl>
-      <w:tblPr>
-        <w:tblW w:type="auto" w:w="0"/>
-        <w:jc w:val="center"/>
-        <w:tblLook w:firstColumn="1" w:firstRow="1" w:lastColumn="0" w:lastRow="0" w:noHBand="0" w:noVBand="1" w:val="04A0"/>
-      </w:tblPr>
-      <w:tblGrid>
-        <w:gridCol w:w="8640"/>
-      </w:tblGrid>
-      <w:tr>
-        <w:tc>
-          <w:tcPr>
-            <w:tcW w:type="dxa" w:w="9360"/>
-            <w:shd w:fill="FFFFFF"/>
-          </w:tcPr>
-          <w:p>
-            <w:r>
-              <w:rPr>
-                <w:b/>
-                <w:color w:val="283593"/>
-                <w:sz w:val="19"/>
-              </w:rPr>
-              <w:t xml:space="preserve">• Action Performed: </w:t>
-            </w:r>
-            <w:r>
-              <w:rPr>
-                <w:color w:val="424242"/>
-                <w:sz w:val="19"/>
-              </w:rPr>
-              <w:t>Used APT package manager to ensure essential compilation toolchains ('build-essential' including gcc, g++, make, libc) are installed.</w:t>
-            </w:r>
-          </w:p>
-        </w:tc>
-      </w:tr>
-      <w:tr>
-        <w:tc>
-          <w:tcPr>
-            <w:tcW w:type="dxa" w:w="9360"/>
-            <w:shd w:fill="F9FBE7"/>
-          </w:tcPr>
-          <w:p>
-            <w:r>
-              <w:rPr>
-                <w:b/>
-                <w:color w:val="33691E"/>
-                <w:sz w:val="19"/>
-              </w:rPr>
-              <w:t xml:space="preserve">• Observation &amp; Result: </w:t>
-            </w:r>
-            <w:r>
-              <w:rPr>
-                <w:color w:val="424242"/>
-                <w:sz w:val="19"/>
-              </w:rPr>
-              <w:t>The system confirmed 'build-essential is already the newest version (12.10ubuntu1)', ensuring the C compiler toolchain is ready for use.</w:t>
-            </w:r>
-          </w:p>
-        </w:tc>
-      </w:tr>
-    </w:tbl>
+      </w:pPr>
+      <w:r>
+        <w:drawing>
+          <wp:inline xmlns:a="http://schemas.openxmlformats.org/drawingml/2006/main" xmlns:pic="http://schemas.openxmlformats.org/drawingml/2006/picture">
+            <wp:extent cx="5669280" cy="1161511"/>
+            <wp:docPr id="8" name="Picture 8"/>
+            <wp:cNvGraphicFramePr>
+              <a:graphicFrameLocks noChangeAspect="1"/>
+            </wp:cNvGraphicFramePr>
+            <a:graphic>
+              <a:graphicData uri="http://schemas.openxmlformats.org/drawingml/2006/picture">
+                <pic:pic>
+                  <pic:nvPicPr>
+                    <pic:cNvPr id="0" name="step8.png"/>
+                    <pic:cNvPicPr/>
+                  </pic:nvPicPr>
+                  <pic:blipFill>
+                    <a:blip r:embed="rId16"/>
+                    <a:stretch>
+                      <a:fillRect/>
+                    </a:stretch>
+                  </pic:blipFill>
+                  <pic:spPr>
+                    <a:xfrm>
+                      <a:off x="0" y="0"/>
+                      <a:ext cx="5669280" cy="1161511"/>
+                    </a:xfrm>
+                    <a:prstGeom prst="rect"/>
+                  </pic:spPr>
+                </pic:pic>
+              </a:graphicData>
+            </a:graphic>
+          </wp:inline>
+        </w:drawing>
+      </w:r>
+    </w:p>
+    <w:p>
+      <w:r>
+        <w:rPr>
+          <w:b/>
+          <w:color w:val="0D47A1"/>
+          <w:sz w:val="21"/>
+        </w:rPr>
+        <w:t xml:space="preserve">What was done in this step: </w:t>
+      </w:r>
+      <w:r>
+        <w:rPr>
+          <w:color w:val="212121"/>
+          <w:sz w:val="21"/>
+        </w:rPr>
+        <w:t>In this step, I used the APT package manager to install 'build-essential', a package containing GNU C/C++ compilers, make utilities, and essential libraries needed for compiling software on Linux.</w:t>
+      </w:r>
+    </w:p>
+    <w:p>
+      <w:r>
+        <w:rPr>
+          <w:b/>
+          <w:color w:val="2E7D32"/>
+          <w:sz w:val="21"/>
+        </w:rPr>
+        <w:t xml:space="preserve">Screenshot Output &amp; Observation: </w:t>
+      </w:r>
+      <w:r>
+        <w:rPr>
+          <w:color w:val="212121"/>
+          <w:sz w:val="21"/>
+        </w:rPr>
+        <w:t>The screenshot verifies that 'build-essential' is installed and at the newest version (12.10ubuntu1).</w:t>
+      </w:r>
+    </w:p>
     <w:p/>
     <w:p>
       <w:r>
         <w:rPr>
           <w:b/>
           <w:color w:val="212121"/>
-          <w:sz w:val="23"/>
+          <w:sz w:val="24"/>
         </w:rPr>
         <w:t>Task 2.3: Verify GCC Compiler Installation</w:t>
       </w:r>
     </w:p>
-    <w:tbl>
-      <w:tblPr>
-        <w:tblW w:type="auto" w:w="0"/>
+    <w:p>
+      <w:r>
+        <w:rPr>
+          <w:b/>
+          <w:color w:val="283593"/>
+          <w:sz w:val="20"/>
+        </w:rPr>
+        <w:t>Command Executed:</w:t>
+        <w:br/>
+      </w:r>
+      <w:r>
+        <w:rPr>
+          <w:rFonts w:ascii="Courier New" w:hAnsi="Courier New"/>
+          <w:color w:val="1B5E20"/>
+          <w:sz w:val="20"/>
+        </w:rPr>
+        <w:t>gcc --version</w:t>
+      </w:r>
+    </w:p>
+    <w:p>
+      <w:pPr>
         <w:jc w:val="center"/>
-        <w:tblLook w:firstColumn="1" w:firstRow="1" w:lastColumn="0" w:lastRow="0" w:noHBand="0" w:noVBand="1" w:val="04A0"/>
-      </w:tblPr>
-      <w:tblGrid>
-        <w:gridCol w:w="8640"/>
-      </w:tblGrid>
-      <w:tr>
-        <w:tc>
-          <w:tcPr>
-            <w:tcW w:type="dxa" w:w="9360"/>
-            <w:shd w:fill="F5F7FA"/>
-          </w:tcPr>
-          <w:p>
-            <w:r>
-              <w:rPr>
-                <w:rFonts w:ascii="Courier New" w:hAnsi="Courier New"/>
-                <w:b/>
-                <w:color w:val="1B5E20"/>
-              </w:rPr>
-              <w:t xml:space="preserve">$ </w:t>
-            </w:r>
-            <w:r>
-              <w:rPr>
-                <w:rFonts w:ascii="Courier New" w:hAnsi="Courier New"/>
-                <w:sz w:val="19"/>
-              </w:rPr>
-              <w:t>gcc --version</w:t>
-            </w:r>
-          </w:p>
-        </w:tc>
-      </w:tr>
-    </w:tbl>
-    <w:p/>
-    <w:tbl>
-      <w:tblPr>
-        <w:tblW w:type="auto" w:w="0"/>
-        <w:jc w:val="center"/>
-        <w:tblLook w:firstColumn="1" w:firstRow="1" w:lastColumn="0" w:lastRow="0" w:noHBand="0" w:noVBand="1" w:val="04A0"/>
-      </w:tblPr>
-      <w:tblGrid>
-        <w:gridCol w:w="8640"/>
-      </w:tblGrid>
-      <w:tr>
-        <w:tc>
-          <w:tcPr>
-            <w:tcW w:type="dxa" w:w="9360"/>
-            <w:shd w:fill="FAFAFA"/>
-          </w:tcPr>
-          <w:p>
-            <w:pPr>
-              <w:jc w:val="center"/>
-            </w:pPr>
-            <w:r>
-              <w:drawing>
-                <wp:inline xmlns:a="http://schemas.openxmlformats.org/drawingml/2006/main" xmlns:pic="http://schemas.openxmlformats.org/drawingml/2006/picture">
-                  <wp:extent cx="5669280" cy="1161511"/>
-                  <wp:docPr id="9" name="Picture 9"/>
-                  <wp:cNvGraphicFramePr>
-                    <a:graphicFrameLocks noChangeAspect="1"/>
-                  </wp:cNvGraphicFramePr>
-                  <a:graphic>
-                    <a:graphicData uri="http://schemas.openxmlformats.org/drawingml/2006/picture">
-                      <pic:pic>
-                        <pic:nvPicPr>
-                          <pic:cNvPr id="0" name="step9.png"/>
-                          <pic:cNvPicPr/>
-                        </pic:nvPicPr>
-                        <pic:blipFill>
-                          <a:blip r:embed="rId17"/>
-                          <a:stretch>
-                            <a:fillRect/>
-                          </a:stretch>
-                        </pic:blipFill>
-                        <pic:spPr>
-                          <a:xfrm>
-                            <a:off x="0" y="0"/>
-                            <a:ext cx="5669280" cy="1161511"/>
-                          </a:xfrm>
-                          <a:prstGeom prst="rect"/>
-                        </pic:spPr>
-                      </pic:pic>
-                    </a:graphicData>
-                  </a:graphic>
-                </wp:inline>
-              </w:drawing>
-            </w:r>
-          </w:p>
-        </w:tc>
-      </w:tr>
-    </w:tbl>
-    <w:p/>
-    <w:tbl>
-      <w:tblPr>
-        <w:tblW w:type="auto" w:w="0"/>
-        <w:jc w:val="center"/>
-        <w:tblLook w:firstColumn="1" w:firstRow="1" w:lastColumn="0" w:lastRow="0" w:noHBand="0" w:noVBand="1" w:val="04A0"/>
-      </w:tblPr>
-      <w:tblGrid>
-        <w:gridCol w:w="8640"/>
-      </w:tblGrid>
-      <w:tr>
-        <w:tc>
-          <w:tcPr>
-            <w:tcW w:type="dxa" w:w="9360"/>
-            <w:shd w:fill="FFFFFF"/>
-          </w:tcPr>
-          <w:p>
-            <w:r>
-              <w:rPr>
-                <w:b/>
-                <w:color w:val="283593"/>
-                <w:sz w:val="19"/>
-              </w:rPr>
-              <w:t xml:space="preserve">• Action Performed: </w:t>
-            </w:r>
-            <w:r>
-              <w:rPr>
-                <w:color w:val="424242"/>
-                <w:sz w:val="19"/>
-              </w:rPr>
-              <w:t>Queried the GNU Compiler Collection (GCC) binary to inspect its version and target architecture.</w:t>
-            </w:r>
-          </w:p>
-        </w:tc>
-      </w:tr>
-      <w:tr>
-        <w:tc>
-          <w:tcPr>
-            <w:tcW w:type="dxa" w:w="9360"/>
-            <w:shd w:fill="F9FBE7"/>
-          </w:tcPr>
-          <w:p>
-            <w:r>
-              <w:rPr>
-                <w:b/>
-                <w:color w:val="33691E"/>
-                <w:sz w:val="19"/>
-              </w:rPr>
-              <w:t xml:space="preserve">• Observation &amp; Result: </w:t>
-            </w:r>
-            <w:r>
-              <w:rPr>
-                <w:color w:val="424242"/>
-                <w:sz w:val="19"/>
-              </w:rPr>
-              <w:t>The output displayed 'gcc (Ubuntu 13.3.0-6ubuntu2~24.04) 13.3.0 x86_64-linux-gnu', confirming GCC version 13 is fully functional.</w:t>
-            </w:r>
-          </w:p>
-        </w:tc>
-      </w:tr>
-    </w:tbl>
+      </w:pPr>
+      <w:r>
+        <w:drawing>
+          <wp:inline xmlns:a="http://schemas.openxmlformats.org/drawingml/2006/main" xmlns:pic="http://schemas.openxmlformats.org/drawingml/2006/picture">
+            <wp:extent cx="5669280" cy="1161511"/>
+            <wp:docPr id="9" name="Picture 9"/>
+            <wp:cNvGraphicFramePr>
+              <a:graphicFrameLocks noChangeAspect="1"/>
+            </wp:cNvGraphicFramePr>
+            <a:graphic>
+              <a:graphicData uri="http://schemas.openxmlformats.org/drawingml/2006/picture">
+                <pic:pic>
+                  <pic:nvPicPr>
+                    <pic:cNvPr id="0" name="step9.png"/>
+                    <pic:cNvPicPr/>
+                  </pic:nvPicPr>
+                  <pic:blipFill>
+                    <a:blip r:embed="rId17"/>
+                    <a:stretch>
+                      <a:fillRect/>
+                    </a:stretch>
+                  </pic:blipFill>
+                  <pic:spPr>
+                    <a:xfrm>
+                      <a:off x="0" y="0"/>
+                      <a:ext cx="5669280" cy="1161511"/>
+                    </a:xfrm>
+                    <a:prstGeom prst="rect"/>
+                  </pic:spPr>
+                </pic:pic>
+              </a:graphicData>
+            </a:graphic>
+          </wp:inline>
+        </w:drawing>
+      </w:r>
+    </w:p>
+    <w:p>
+      <w:r>
+        <w:rPr>
+          <w:b/>
+          <w:color w:val="0D47A1"/>
+          <w:sz w:val="21"/>
+        </w:rPr>
+        <w:t xml:space="preserve">What was done in this step: </w:t>
+      </w:r>
+      <w:r>
+        <w:rPr>
+          <w:color w:val="212121"/>
+          <w:sz w:val="21"/>
+        </w:rPr>
+        <w:t>In this step, I executed 'gcc --version' to confirm that the GNU C compiler is installed, accessible in the system PATH, and ready for compiling C code.</w:t>
+      </w:r>
+    </w:p>
+    <w:p>
+      <w:r>
+        <w:rPr>
+          <w:b/>
+          <w:color w:val="2E7D32"/>
+          <w:sz w:val="21"/>
+        </w:rPr>
+        <w:t xml:space="preserve">Screenshot Output &amp; Observation: </w:t>
+      </w:r>
+      <w:r>
+        <w:rPr>
+          <w:color w:val="212121"/>
+          <w:sz w:val="21"/>
+        </w:rPr>
+        <w:t>The screenshot shows 'gcc (Ubuntu 13.3.0-6ubuntu2~24.04) 13.3.0', confirming GCC 13 is fully functional.</w:t>
+      </w:r>
+    </w:p>
     <w:p/>
     <w:p>
       <w:r>
         <w:rPr>
           <w:b/>
           <w:color w:val="212121"/>
-          <w:sz w:val="23"/>
+          <w:sz w:val="24"/>
         </w:rPr>
-        <w:t>Task 2.4: Search for Available Packages with APT</w:t>
+        <w:t>Task 2.4: Search for Packages via APT</w:t>
       </w:r>
     </w:p>
-    <w:tbl>
-      <w:tblPr>
-        <w:tblW w:type="auto" w:w="0"/>
+    <w:p>
+      <w:r>
+        <w:rPr>
+          <w:b/>
+          <w:color w:val="283593"/>
+          <w:sz w:val="20"/>
+        </w:rPr>
+        <w:t>Command Executed:</w:t>
+        <w:br/>
+      </w:r>
+      <w:r>
+        <w:rPr>
+          <w:rFonts w:ascii="Courier New" w:hAnsi="Courier New"/>
+          <w:color w:val="1B5E20"/>
+          <w:sz w:val="20"/>
+        </w:rPr>
+        <w:t>apt search python3 | head -n 8</w:t>
+      </w:r>
+    </w:p>
+    <w:p>
+      <w:pPr>
         <w:jc w:val="center"/>
-        <w:tblLook w:firstColumn="1" w:firstRow="1" w:lastColumn="0" w:lastRow="0" w:noHBand="0" w:noVBand="1" w:val="04A0"/>
-      </w:tblPr>
-      <w:tblGrid>
-        <w:gridCol w:w="8640"/>
-      </w:tblGrid>
-      <w:tr>
-        <w:tc>
-          <w:tcPr>
-            <w:tcW w:type="dxa" w:w="9360"/>
-            <w:shd w:fill="F5F7FA"/>
-          </w:tcPr>
-          <w:p>
-            <w:r>
-              <w:rPr>
-                <w:rFonts w:ascii="Courier New" w:hAnsi="Courier New"/>
-                <w:b/>
-                <w:color w:val="1B5E20"/>
-              </w:rPr>
-              <w:t xml:space="preserve">$ </w:t>
-            </w:r>
-            <w:r>
-              <w:rPr>
-                <w:rFonts w:ascii="Courier New" w:hAnsi="Courier New"/>
-                <w:sz w:val="19"/>
-              </w:rPr>
-              <w:t>apt search python3 | head -n 8</w:t>
-            </w:r>
-          </w:p>
-        </w:tc>
-      </w:tr>
-    </w:tbl>
-    <w:p/>
-    <w:tbl>
-      <w:tblPr>
-        <w:tblW w:type="auto" w:w="0"/>
-        <w:jc w:val="center"/>
-        <w:tblLook w:firstColumn="1" w:firstRow="1" w:lastColumn="0" w:lastRow="0" w:noHBand="0" w:noVBand="1" w:val="04A0"/>
-      </w:tblPr>
-      <w:tblGrid>
-        <w:gridCol w:w="8640"/>
-      </w:tblGrid>
-      <w:tr>
-        <w:tc>
-          <w:tcPr>
-            <w:tcW w:type="dxa" w:w="9360"/>
-            <w:shd w:fill="FAFAFA"/>
-          </w:tcPr>
-          <w:p>
-            <w:pPr>
-              <w:jc w:val="center"/>
-            </w:pPr>
-            <w:r>
-              <w:drawing>
-                <wp:inline xmlns:a="http://schemas.openxmlformats.org/drawingml/2006/main" xmlns:pic="http://schemas.openxmlformats.org/drawingml/2006/picture">
-                  <wp:extent cx="5669280" cy="1576336"/>
-                  <wp:docPr id="10" name="Picture 10"/>
-                  <wp:cNvGraphicFramePr>
-                    <a:graphicFrameLocks noChangeAspect="1"/>
-                  </wp:cNvGraphicFramePr>
-                  <a:graphic>
-                    <a:graphicData uri="http://schemas.openxmlformats.org/drawingml/2006/picture">
-                      <pic:pic>
-                        <pic:nvPicPr>
-                          <pic:cNvPr id="0" name="step10.png"/>
-                          <pic:cNvPicPr/>
-                        </pic:nvPicPr>
-                        <pic:blipFill>
-                          <a:blip r:embed="rId18"/>
-                          <a:stretch>
-                            <a:fillRect/>
-                          </a:stretch>
-                        </pic:blipFill>
-                        <pic:spPr>
-                          <a:xfrm>
-                            <a:off x="0" y="0"/>
-                            <a:ext cx="5669280" cy="1576336"/>
-                          </a:xfrm>
-                          <a:prstGeom prst="rect"/>
-                        </pic:spPr>
-                      </pic:pic>
-                    </a:graphicData>
-                  </a:graphic>
-                </wp:inline>
-              </w:drawing>
-            </w:r>
-          </w:p>
-        </w:tc>
-      </w:tr>
-    </w:tbl>
-    <w:p/>
-    <w:tbl>
-      <w:tblPr>
-        <w:tblW w:type="auto" w:w="0"/>
-        <w:jc w:val="center"/>
-        <w:tblLook w:firstColumn="1" w:firstRow="1" w:lastColumn="0" w:lastRow="0" w:noHBand="0" w:noVBand="1" w:val="04A0"/>
-      </w:tblPr>
-      <w:tblGrid>
-        <w:gridCol w:w="8640"/>
-      </w:tblGrid>
-      <w:tr>
-        <w:tc>
-          <w:tcPr>
-            <w:tcW w:type="dxa" w:w="9360"/>
-            <w:shd w:fill="FFFFFF"/>
-          </w:tcPr>
-          <w:p>
-            <w:r>
-              <w:rPr>
-                <w:b/>
-                <w:color w:val="283593"/>
-                <w:sz w:val="19"/>
-              </w:rPr>
-              <w:t xml:space="preserve">• Action Performed: </w:t>
-            </w:r>
-            <w:r>
-              <w:rPr>
-                <w:color w:val="424242"/>
-                <w:sz w:val="19"/>
-              </w:rPr>
-              <w:t>Used the 'apt search' command to look for packages matching 'python3' in the repository database.</w:t>
-            </w:r>
-          </w:p>
-        </w:tc>
-      </w:tr>
-      <w:tr>
-        <w:tc>
-          <w:tcPr>
-            <w:tcW w:type="dxa" w:w="9360"/>
-            <w:shd w:fill="F9FBE7"/>
-          </w:tcPr>
-          <w:p>
-            <w:r>
-              <w:rPr>
-                <w:b/>
-                <w:color w:val="33691E"/>
-                <w:sz w:val="19"/>
-              </w:rPr>
-              <w:t xml:space="preserve">• Observation &amp; Result: </w:t>
-            </w:r>
-            <w:r>
-              <w:rPr>
-                <w:color w:val="424242"/>
-                <w:sz w:val="19"/>
-              </w:rPr>
-              <w:t>APT returned matching entries along with descriptions, demonstrating package discovery capabilities via command line.</w:t>
-            </w:r>
-          </w:p>
-        </w:tc>
-      </w:tr>
-    </w:tbl>
+      </w:pPr>
+      <w:r>
+        <w:drawing>
+          <wp:inline xmlns:a="http://schemas.openxmlformats.org/drawingml/2006/main" xmlns:pic="http://schemas.openxmlformats.org/drawingml/2006/picture">
+            <wp:extent cx="5669280" cy="1576336"/>
+            <wp:docPr id="10" name="Picture 10"/>
+            <wp:cNvGraphicFramePr>
+              <a:graphicFrameLocks noChangeAspect="1"/>
+            </wp:cNvGraphicFramePr>
+            <a:graphic>
+              <a:graphicData uri="http://schemas.openxmlformats.org/drawingml/2006/picture">
+                <pic:pic>
+                  <pic:nvPicPr>
+                    <pic:cNvPr id="0" name="step10.png"/>
+                    <pic:cNvPicPr/>
+                  </pic:nvPicPr>
+                  <pic:blipFill>
+                    <a:blip r:embed="rId18"/>
+                    <a:stretch>
+                      <a:fillRect/>
+                    </a:stretch>
+                  </pic:blipFill>
+                  <pic:spPr>
+                    <a:xfrm>
+                      <a:off x="0" y="0"/>
+                      <a:ext cx="5669280" cy="1576336"/>
+                    </a:xfrm>
+                    <a:prstGeom prst="rect"/>
+                  </pic:spPr>
+                </pic:pic>
+              </a:graphicData>
+            </a:graphic>
+          </wp:inline>
+        </w:drawing>
+      </w:r>
+    </w:p>
+    <w:p>
+      <w:r>
+        <w:rPr>
+          <w:b/>
+          <w:color w:val="0D47A1"/>
+          <w:sz w:val="21"/>
+        </w:rPr>
+        <w:t xml:space="preserve">What was done in this step: </w:t>
+      </w:r>
+      <w:r>
+        <w:rPr>
+          <w:color w:val="212121"/>
+          <w:sz w:val="21"/>
+        </w:rPr>
+        <w:t>In this step, I used 'apt search python3' to search the repository database for Python packages and piped the result through 'head' to display the top search hits.</w:t>
+      </w:r>
+    </w:p>
+    <w:p>
+      <w:r>
+        <w:rPr>
+          <w:b/>
+          <w:color w:val="2E7D32"/>
+          <w:sz w:val="21"/>
+        </w:rPr>
+        <w:t xml:space="preserve">Screenshot Output &amp; Observation: </w:t>
+      </w:r>
+      <w:r>
+        <w:rPr>
+          <w:color w:val="212121"/>
+          <w:sz w:val="21"/>
+        </w:rPr>
+        <w:t>The screenshot shows APT returning the available 'python3' package descriptions directly from the repository index.</w:t>
+      </w:r>
+    </w:p>
     <w:p/>
     <w:p>
       <w:r>
         <w:rPr>
           <w:b/>
           <w:color w:val="0D47A1"/>
-          <w:sz w:val="28"/>
+          <w:sz w:val="30"/>
         </w:rPr>
         <w:t>Part III: C Compilation &amp; Iterative Development</w:t>
       </w:r>
@@ -1739,679 +1121,431 @@
         <w:rPr>
           <w:b/>
           <w:color w:val="212121"/>
-          <w:sz w:val="23"/>
+          <w:sz w:val="24"/>
         </w:rPr>
-        <w:t>Task 3.1: Write C Source Code (hello.c)</w:t>
+        <w:t>Task 3.1: Write C Source File (hello.c)</w:t>
       </w:r>
     </w:p>
-    <w:tbl>
-      <w:tblPr>
-        <w:tblW w:type="auto" w:w="0"/>
+    <w:p>
+      <w:r>
+        <w:rPr>
+          <w:b/>
+          <w:color w:val="283593"/>
+          <w:sz w:val="20"/>
+        </w:rPr>
+        <w:t>Command Executed:</w:t>
+        <w:br/>
+      </w:r>
+      <w:r>
+        <w:rPr>
+          <w:rFonts w:ascii="Courier New" w:hAnsi="Courier New"/>
+          <w:color w:val="1B5E20"/>
+          <w:sz w:val="20"/>
+        </w:rPr>
+        <w:t>nano hello.c</w:t>
+      </w:r>
+    </w:p>
+    <w:p>
+      <w:pPr>
         <w:jc w:val="center"/>
-        <w:tblLook w:firstColumn="1" w:firstRow="1" w:lastColumn="0" w:lastRow="0" w:noHBand="0" w:noVBand="1" w:val="04A0"/>
-      </w:tblPr>
-      <w:tblGrid>
-        <w:gridCol w:w="8640"/>
-      </w:tblGrid>
-      <w:tr>
-        <w:tc>
-          <w:tcPr>
-            <w:tcW w:type="dxa" w:w="9360"/>
-            <w:shd w:fill="F5F7FA"/>
-          </w:tcPr>
-          <w:p>
-            <w:r>
-              <w:rPr>
-                <w:rFonts w:ascii="Courier New" w:hAnsi="Courier New"/>
-                <w:b/>
-                <w:color w:val="1B5E20"/>
-              </w:rPr>
-              <w:t xml:space="preserve">$ </w:t>
-            </w:r>
-            <w:r>
-              <w:rPr>
-                <w:rFonts w:ascii="Courier New" w:hAnsi="Courier New"/>
-                <w:sz w:val="19"/>
-              </w:rPr>
-              <w:t>nano hello.c</w:t>
-            </w:r>
-          </w:p>
-        </w:tc>
-      </w:tr>
-    </w:tbl>
-    <w:p/>
-    <w:tbl>
-      <w:tblPr>
-        <w:tblW w:type="auto" w:w="0"/>
-        <w:jc w:val="center"/>
-        <w:tblLook w:firstColumn="1" w:firstRow="1" w:lastColumn="0" w:lastRow="0" w:noHBand="0" w:noVBand="1" w:val="04A0"/>
-      </w:tblPr>
-      <w:tblGrid>
-        <w:gridCol w:w="8640"/>
-      </w:tblGrid>
-      <w:tr>
-        <w:tc>
-          <w:tcPr>
-            <w:tcW w:type="dxa" w:w="9360"/>
-            <w:shd w:fill="FAFAFA"/>
-          </w:tcPr>
-          <w:p>
-            <w:pPr>
-              <w:jc w:val="center"/>
-            </w:pPr>
-            <w:r>
-              <w:drawing>
-                <wp:inline xmlns:a="http://schemas.openxmlformats.org/drawingml/2006/main" xmlns:pic="http://schemas.openxmlformats.org/drawingml/2006/picture">
-                  <wp:extent cx="5669280" cy="2129437"/>
-                  <wp:docPr id="11" name="Picture 11"/>
-                  <wp:cNvGraphicFramePr>
-                    <a:graphicFrameLocks noChangeAspect="1"/>
-                  </wp:cNvGraphicFramePr>
-                  <a:graphic>
-                    <a:graphicData uri="http://schemas.openxmlformats.org/drawingml/2006/picture">
-                      <pic:pic>
-                        <pic:nvPicPr>
-                          <pic:cNvPr id="0" name="step11.png"/>
-                          <pic:cNvPicPr/>
-                        </pic:nvPicPr>
-                        <pic:blipFill>
-                          <a:blip r:embed="rId19"/>
-                          <a:stretch>
-                            <a:fillRect/>
-                          </a:stretch>
-                        </pic:blipFill>
-                        <pic:spPr>
-                          <a:xfrm>
-                            <a:off x="0" y="0"/>
-                            <a:ext cx="5669280" cy="2129437"/>
-                          </a:xfrm>
-                          <a:prstGeom prst="rect"/>
-                        </pic:spPr>
-                      </pic:pic>
-                    </a:graphicData>
-                  </a:graphic>
-                </wp:inline>
-              </w:drawing>
-            </w:r>
-          </w:p>
-        </w:tc>
-      </w:tr>
-    </w:tbl>
-    <w:p/>
-    <w:tbl>
-      <w:tblPr>
-        <w:tblW w:type="auto" w:w="0"/>
-        <w:jc w:val="center"/>
-        <w:tblLook w:firstColumn="1" w:firstRow="1" w:lastColumn="0" w:lastRow="0" w:noHBand="0" w:noVBand="1" w:val="04A0"/>
-      </w:tblPr>
-      <w:tblGrid>
-        <w:gridCol w:w="8640"/>
-      </w:tblGrid>
-      <w:tr>
-        <w:tc>
-          <w:tcPr>
-            <w:tcW w:type="dxa" w:w="9360"/>
-            <w:shd w:fill="FFFFFF"/>
-          </w:tcPr>
-          <w:p>
-            <w:r>
-              <w:rPr>
-                <w:b/>
-                <w:color w:val="283593"/>
-                <w:sz w:val="19"/>
-              </w:rPr>
-              <w:t xml:space="preserve">• Action Performed: </w:t>
-            </w:r>
-            <w:r>
-              <w:rPr>
-                <w:color w:val="424242"/>
-                <w:sz w:val="19"/>
-              </w:rPr>
-              <w:t>Created 'hello.c' using nano. Wrote standard C source code defining integers a=10, b=5, printing 'Hello, Linux Lab!' and calculating their sum (a + b).</w:t>
-            </w:r>
-          </w:p>
-        </w:tc>
-      </w:tr>
-      <w:tr>
-        <w:tc>
-          <w:tcPr>
-            <w:tcW w:type="dxa" w:w="9360"/>
-            <w:shd w:fill="F9FBE7"/>
-          </w:tcPr>
-          <w:p>
-            <w:r>
-              <w:rPr>
-                <w:b/>
-                <w:color w:val="33691E"/>
-                <w:sz w:val="19"/>
-              </w:rPr>
-              <w:t xml:space="preserve">• Observation &amp; Result: </w:t>
-            </w:r>
-            <w:r>
-              <w:rPr>
-                <w:color w:val="424242"/>
-                <w:sz w:val="19"/>
-              </w:rPr>
-              <w:t>The C source code was structured with standard '#include &lt;stdio.h&gt;' and saved cleanly into the lab folder.</w:t>
-            </w:r>
-          </w:p>
-        </w:tc>
-      </w:tr>
-    </w:tbl>
+      </w:pPr>
+      <w:r>
+        <w:drawing>
+          <wp:inline xmlns:a="http://schemas.openxmlformats.org/drawingml/2006/main" xmlns:pic="http://schemas.openxmlformats.org/drawingml/2006/picture">
+            <wp:extent cx="5669280" cy="2129437"/>
+            <wp:docPr id="11" name="Picture 11"/>
+            <wp:cNvGraphicFramePr>
+              <a:graphicFrameLocks noChangeAspect="1"/>
+            </wp:cNvGraphicFramePr>
+            <a:graphic>
+              <a:graphicData uri="http://schemas.openxmlformats.org/drawingml/2006/picture">
+                <pic:pic>
+                  <pic:nvPicPr>
+                    <pic:cNvPr id="0" name="step11.png"/>
+                    <pic:cNvPicPr/>
+                  </pic:nvPicPr>
+                  <pic:blipFill>
+                    <a:blip r:embed="rId19"/>
+                    <a:stretch>
+                      <a:fillRect/>
+                    </a:stretch>
+                  </pic:blipFill>
+                  <pic:spPr>
+                    <a:xfrm>
+                      <a:off x="0" y="0"/>
+                      <a:ext cx="5669280" cy="2129437"/>
+                    </a:xfrm>
+                    <a:prstGeom prst="rect"/>
+                  </pic:spPr>
+                </pic:pic>
+              </a:graphicData>
+            </a:graphic>
+          </wp:inline>
+        </w:drawing>
+      </w:r>
+    </w:p>
+    <w:p>
+      <w:r>
+        <w:rPr>
+          <w:b/>
+          <w:color w:val="0D47A1"/>
+          <w:sz w:val="21"/>
+        </w:rPr>
+        <w:t xml:space="preserve">What was done in this step: </w:t>
+      </w:r>
+      <w:r>
+        <w:rPr>
+          <w:color w:val="212121"/>
+          <w:sz w:val="21"/>
+        </w:rPr>
+        <w:t>In this step, I created a C source code file named 'hello.c' using nano. I wrote a program that defines integer variables a=10 and b=5, prints 'Hello, Linux Lab!', and calculates and prints their sum (a + b).</w:t>
+      </w:r>
+    </w:p>
+    <w:p>
+      <w:r>
+        <w:rPr>
+          <w:b/>
+          <w:color w:val="2E7D32"/>
+          <w:sz w:val="21"/>
+        </w:rPr>
+        <w:t xml:space="preserve">Screenshot Output &amp; Observation: </w:t>
+      </w:r>
+      <w:r>
+        <w:rPr>
+          <w:color w:val="212121"/>
+          <w:sz w:val="21"/>
+        </w:rPr>
+        <w:t>The screenshot captures the complete C code inside the Nano editor before saving.</w:t>
+      </w:r>
+    </w:p>
     <w:p/>
     <w:p>
       <w:r>
         <w:rPr>
           <w:b/>
           <w:color w:val="212121"/>
-          <w:sz w:val="23"/>
+          <w:sz w:val="24"/>
         </w:rPr>
         <w:t>Task 3.2: Compile and Execute C Program</w:t>
       </w:r>
     </w:p>
-    <w:tbl>
-      <w:tblPr>
-        <w:tblW w:type="auto" w:w="0"/>
+    <w:p>
+      <w:r>
+        <w:rPr>
+          <w:b/>
+          <w:color w:val="283593"/>
+          <w:sz w:val="20"/>
+        </w:rPr>
+        <w:t>Command Executed:</w:t>
+        <w:br/>
+      </w:r>
+      <w:r>
+        <w:rPr>
+          <w:rFonts w:ascii="Courier New" w:hAnsi="Courier New"/>
+          <w:color w:val="1B5E20"/>
+          <w:sz w:val="20"/>
+        </w:rPr>
+        <w:t>gcc hello.c -o hello_program</w:t>
+        <w:br/>
+        <w:t>ls -l hello_program</w:t>
+        <w:br/>
+        <w:t>./hello_program</w:t>
+      </w:r>
+    </w:p>
+    <w:p>
+      <w:pPr>
         <w:jc w:val="center"/>
-        <w:tblLook w:firstColumn="1" w:firstRow="1" w:lastColumn="0" w:lastRow="0" w:noHBand="0" w:noVBand="1" w:val="04A0"/>
-      </w:tblPr>
-      <w:tblGrid>
-        <w:gridCol w:w="8640"/>
-      </w:tblGrid>
-      <w:tr>
-        <w:tc>
-          <w:tcPr>
-            <w:tcW w:type="dxa" w:w="9360"/>
-            <w:shd w:fill="F5F7FA"/>
-          </w:tcPr>
-          <w:p>
-            <w:r>
-              <w:rPr>
-                <w:rFonts w:ascii="Courier New" w:hAnsi="Courier New"/>
-                <w:b/>
-                <w:color w:val="1B5E20"/>
-              </w:rPr>
-              <w:t xml:space="preserve">$ </w:t>
-            </w:r>
-            <w:r>
-              <w:rPr>
-                <w:rFonts w:ascii="Courier New" w:hAnsi="Courier New"/>
-                <w:sz w:val="19"/>
-              </w:rPr>
-              <w:t>gcc hello.c -o hello_program</w:t>
-              <w:br/>
-              <w:t>ls -l hello_program</w:t>
-              <w:br/>
-              <w:t>./hello_program</w:t>
-            </w:r>
-          </w:p>
-        </w:tc>
-      </w:tr>
-    </w:tbl>
-    <w:p/>
-    <w:tbl>
-      <w:tblPr>
-        <w:tblW w:type="auto" w:w="0"/>
-        <w:jc w:val="center"/>
-        <w:tblLook w:firstColumn="1" w:firstRow="1" w:lastColumn="0" w:lastRow="0" w:noHBand="0" w:noVBand="1" w:val="04A0"/>
-      </w:tblPr>
-      <w:tblGrid>
-        <w:gridCol w:w="8640"/>
-      </w:tblGrid>
-      <w:tr>
-        <w:tc>
-          <w:tcPr>
-            <w:tcW w:type="dxa" w:w="9360"/>
-            <w:shd w:fill="FAFAFA"/>
-          </w:tcPr>
-          <w:p>
-            <w:pPr>
-              <w:jc w:val="center"/>
-            </w:pPr>
-            <w:r>
-              <w:drawing>
-                <wp:inline xmlns:a="http://schemas.openxmlformats.org/drawingml/2006/main" xmlns:pic="http://schemas.openxmlformats.org/drawingml/2006/picture">
-                  <wp:extent cx="5669280" cy="1299786"/>
-                  <wp:docPr id="12" name="Picture 12"/>
-                  <wp:cNvGraphicFramePr>
-                    <a:graphicFrameLocks noChangeAspect="1"/>
-                  </wp:cNvGraphicFramePr>
-                  <a:graphic>
-                    <a:graphicData uri="http://schemas.openxmlformats.org/drawingml/2006/picture">
-                      <pic:pic>
-                        <pic:nvPicPr>
-                          <pic:cNvPr id="0" name="step12.png"/>
-                          <pic:cNvPicPr/>
-                        </pic:nvPicPr>
-                        <pic:blipFill>
-                          <a:blip r:embed="rId20"/>
-                          <a:stretch>
-                            <a:fillRect/>
-                          </a:stretch>
-                        </pic:blipFill>
-                        <pic:spPr>
-                          <a:xfrm>
-                            <a:off x="0" y="0"/>
-                            <a:ext cx="5669280" cy="1299786"/>
-                          </a:xfrm>
-                          <a:prstGeom prst="rect"/>
-                        </pic:spPr>
-                      </pic:pic>
-                    </a:graphicData>
-                  </a:graphic>
-                </wp:inline>
-              </w:drawing>
-            </w:r>
-          </w:p>
-        </w:tc>
-      </w:tr>
-    </w:tbl>
-    <w:p/>
-    <w:tbl>
-      <w:tblPr>
-        <w:tblW w:type="auto" w:w="0"/>
-        <w:jc w:val="center"/>
-        <w:tblLook w:firstColumn="1" w:firstRow="1" w:lastColumn="0" w:lastRow="0" w:noHBand="0" w:noVBand="1" w:val="04A0"/>
-      </w:tblPr>
-      <w:tblGrid>
-        <w:gridCol w:w="8640"/>
-      </w:tblGrid>
-      <w:tr>
-        <w:tc>
-          <w:tcPr>
-            <w:tcW w:type="dxa" w:w="9360"/>
-            <w:shd w:fill="FFFFFF"/>
-          </w:tcPr>
-          <w:p>
-            <w:r>
-              <w:rPr>
-                <w:b/>
-                <w:color w:val="283593"/>
-                <w:sz w:val="19"/>
-              </w:rPr>
-              <w:t xml:space="preserve">• Action Performed: </w:t>
-            </w:r>
-            <w:r>
-              <w:rPr>
-                <w:color w:val="424242"/>
-                <w:sz w:val="19"/>
-              </w:rPr>
-              <w:t>Compiled 'hello.c' using GCC with the '-o' flag specifying binary output name 'hello_program'. Verified executable permissions and ran './hello_program'.</w:t>
-            </w:r>
-          </w:p>
-        </w:tc>
-      </w:tr>
-      <w:tr>
-        <w:tc>
-          <w:tcPr>
-            <w:tcW w:type="dxa" w:w="9360"/>
-            <w:shd w:fill="F9FBE7"/>
-          </w:tcPr>
-          <w:p>
-            <w:r>
-              <w:rPr>
-                <w:b/>
-                <w:color w:val="33691E"/>
-                <w:sz w:val="19"/>
-              </w:rPr>
-              <w:t xml:space="preserve">• Observation &amp; Result: </w:t>
-            </w:r>
-            <w:r>
-              <w:rPr>
-                <w:color w:val="424242"/>
-                <w:sz w:val="19"/>
-              </w:rPr>
-              <w:t>GCC compiled the binary with executable flags ('-rwxrwxr-x'). Executing the binary printed: 'Hello, Linux Lab!' and 'Sum of 10 and 5 is 15'.</w:t>
-            </w:r>
-          </w:p>
-        </w:tc>
-      </w:tr>
-    </w:tbl>
+      </w:pPr>
+      <w:r>
+        <w:drawing>
+          <wp:inline xmlns:a="http://schemas.openxmlformats.org/drawingml/2006/main" xmlns:pic="http://schemas.openxmlformats.org/drawingml/2006/picture">
+            <wp:extent cx="5669280" cy="1299786"/>
+            <wp:docPr id="12" name="Picture 12"/>
+            <wp:cNvGraphicFramePr>
+              <a:graphicFrameLocks noChangeAspect="1"/>
+            </wp:cNvGraphicFramePr>
+            <a:graphic>
+              <a:graphicData uri="http://schemas.openxmlformats.org/drawingml/2006/picture">
+                <pic:pic>
+                  <pic:nvPicPr>
+                    <pic:cNvPr id="0" name="step12.png"/>
+                    <pic:cNvPicPr/>
+                  </pic:nvPicPr>
+                  <pic:blipFill>
+                    <a:blip r:embed="rId20"/>
+                    <a:stretch>
+                      <a:fillRect/>
+                    </a:stretch>
+                  </pic:blipFill>
+                  <pic:spPr>
+                    <a:xfrm>
+                      <a:off x="0" y="0"/>
+                      <a:ext cx="5669280" cy="1299786"/>
+                    </a:xfrm>
+                    <a:prstGeom prst="rect"/>
+                  </pic:spPr>
+                </pic:pic>
+              </a:graphicData>
+            </a:graphic>
+          </wp:inline>
+        </w:drawing>
+      </w:r>
+    </w:p>
+    <w:p>
+      <w:r>
+        <w:rPr>
+          <w:b/>
+          <w:color w:val="0D47A1"/>
+          <w:sz w:val="21"/>
+        </w:rPr>
+        <w:t xml:space="preserve">What was done in this step: </w:t>
+      </w:r>
+      <w:r>
+        <w:rPr>
+          <w:color w:val="212121"/>
+          <w:sz w:val="21"/>
+        </w:rPr>
+        <w:t>In this step, I compiled the source file 'hello.c' into an executable binary called 'hello_program' using 'gcc -o'. I verified the executable flag with 'ls -l' and ran the binary using './hello_program'.</w:t>
+      </w:r>
+    </w:p>
+    <w:p>
+      <w:r>
+        <w:rPr>
+          <w:b/>
+          <w:color w:val="2E7D32"/>
+          <w:sz w:val="21"/>
+        </w:rPr>
+        <w:t xml:space="preserve">Screenshot Output &amp; Observation: </w:t>
+      </w:r>
+      <w:r>
+        <w:rPr>
+          <w:color w:val="212121"/>
+          <w:sz w:val="21"/>
+        </w:rPr>
+        <w:t>The screenshot shows the executable created with '-rwxrwxr-x' permissions. Running './hello_program' printed 'Hello, Linux Lab!' and 'Sum of 10 and 5 is 15'.</w:t>
+      </w:r>
+    </w:p>
     <w:p/>
     <w:p>
       <w:r>
         <w:rPr>
           <w:b/>
           <w:color w:val="212121"/>
-          <w:sz w:val="23"/>
+          <w:sz w:val="24"/>
         </w:rPr>
         <w:t>Task 3.3: Compile with Warning Flags Enabled (-Wall)</w:t>
       </w:r>
     </w:p>
-    <w:tbl>
-      <w:tblPr>
-        <w:tblW w:type="auto" w:w="0"/>
+    <w:p>
+      <w:r>
+        <w:rPr>
+          <w:b/>
+          <w:color w:val="283593"/>
+          <w:sz w:val="20"/>
+        </w:rPr>
+        <w:t>Command Executed:</w:t>
+        <w:br/>
+      </w:r>
+      <w:r>
+        <w:rPr>
+          <w:rFonts w:ascii="Courier New" w:hAnsi="Courier New"/>
+          <w:color w:val="1B5E20"/>
+          <w:sz w:val="20"/>
+        </w:rPr>
+        <w:t>gcc -Wall hello.c -o hello_program_warn</w:t>
+        <w:br/>
+        <w:t>./hello_program_warn</w:t>
+      </w:r>
+    </w:p>
+    <w:p>
+      <w:pPr>
         <w:jc w:val="center"/>
-        <w:tblLook w:firstColumn="1" w:firstRow="1" w:lastColumn="0" w:lastRow="0" w:noHBand="0" w:noVBand="1" w:val="04A0"/>
-      </w:tblPr>
-      <w:tblGrid>
-        <w:gridCol w:w="8640"/>
-      </w:tblGrid>
-      <w:tr>
-        <w:tc>
-          <w:tcPr>
-            <w:tcW w:type="dxa" w:w="9360"/>
-            <w:shd w:fill="F5F7FA"/>
-          </w:tcPr>
-          <w:p>
-            <w:r>
-              <w:rPr>
-                <w:rFonts w:ascii="Courier New" w:hAnsi="Courier New"/>
-                <w:b/>
-                <w:color w:val="1B5E20"/>
-              </w:rPr>
-              <w:t xml:space="preserve">$ </w:t>
-            </w:r>
-            <w:r>
-              <w:rPr>
-                <w:rFonts w:ascii="Courier New" w:hAnsi="Courier New"/>
-                <w:sz w:val="19"/>
-              </w:rPr>
-              <w:t>gcc -Wall hello.c -o hello_program_warn</w:t>
-              <w:br/>
-              <w:t>./hello_program_warn</w:t>
-            </w:r>
-          </w:p>
-        </w:tc>
-      </w:tr>
-    </w:tbl>
-    <w:p/>
-    <w:tbl>
-      <w:tblPr>
-        <w:tblW w:type="auto" w:w="0"/>
-        <w:jc w:val="center"/>
-        <w:tblLook w:firstColumn="1" w:firstRow="1" w:lastColumn="0" w:lastRow="0" w:noHBand="0" w:noVBand="1" w:val="04A0"/>
-      </w:tblPr>
-      <w:tblGrid>
-        <w:gridCol w:w="8640"/>
-      </w:tblGrid>
-      <w:tr>
-        <w:tc>
-          <w:tcPr>
-            <w:tcW w:type="dxa" w:w="9360"/>
-            <w:shd w:fill="FAFAFA"/>
-          </w:tcPr>
-          <w:p>
-            <w:pPr>
-              <w:jc w:val="center"/>
-            </w:pPr>
-            <w:r>
-              <w:drawing>
-                <wp:inline xmlns:a="http://schemas.openxmlformats.org/drawingml/2006/main" xmlns:pic="http://schemas.openxmlformats.org/drawingml/2006/picture">
-                  <wp:extent cx="5669280" cy="1023235"/>
-                  <wp:docPr id="13" name="Picture 13"/>
-                  <wp:cNvGraphicFramePr>
-                    <a:graphicFrameLocks noChangeAspect="1"/>
-                  </wp:cNvGraphicFramePr>
-                  <a:graphic>
-                    <a:graphicData uri="http://schemas.openxmlformats.org/drawingml/2006/picture">
-                      <pic:pic>
-                        <pic:nvPicPr>
-                          <pic:cNvPr id="0" name="step13.png"/>
-                          <pic:cNvPicPr/>
-                        </pic:nvPicPr>
-                        <pic:blipFill>
-                          <a:blip r:embed="rId21"/>
-                          <a:stretch>
-                            <a:fillRect/>
-                          </a:stretch>
-                        </pic:blipFill>
-                        <pic:spPr>
-                          <a:xfrm>
-                            <a:off x="0" y="0"/>
-                            <a:ext cx="5669280" cy="1023235"/>
-                          </a:xfrm>
-                          <a:prstGeom prst="rect"/>
-                        </pic:spPr>
-                      </pic:pic>
-                    </a:graphicData>
-                  </a:graphic>
-                </wp:inline>
-              </w:drawing>
-            </w:r>
-          </w:p>
-        </w:tc>
-      </w:tr>
-    </w:tbl>
-    <w:p/>
-    <w:tbl>
-      <w:tblPr>
-        <w:tblW w:type="auto" w:w="0"/>
-        <w:jc w:val="center"/>
-        <w:tblLook w:firstColumn="1" w:firstRow="1" w:lastColumn="0" w:lastRow="0" w:noHBand="0" w:noVBand="1" w:val="04A0"/>
-      </w:tblPr>
-      <w:tblGrid>
-        <w:gridCol w:w="8640"/>
-      </w:tblGrid>
-      <w:tr>
-        <w:tc>
-          <w:tcPr>
-            <w:tcW w:type="dxa" w:w="9360"/>
-            <w:shd w:fill="FFFFFF"/>
-          </w:tcPr>
-          <w:p>
-            <w:r>
-              <w:rPr>
-                <w:b/>
-                <w:color w:val="283593"/>
-                <w:sz w:val="19"/>
-              </w:rPr>
-              <w:t xml:space="preserve">• Action Performed: </w:t>
-            </w:r>
-            <w:r>
-              <w:rPr>
-                <w:color w:val="424242"/>
-                <w:sz w:val="19"/>
-              </w:rPr>
-              <w:t>Applied compilation best practice by enabling compiler warnings via '-Wall' (all warnings) to check for potential bugs or unhandled code paths.</w:t>
-            </w:r>
-          </w:p>
-        </w:tc>
-      </w:tr>
-      <w:tr>
-        <w:tc>
-          <w:tcPr>
-            <w:tcW w:type="dxa" w:w="9360"/>
-            <w:shd w:fill="F9FBE7"/>
-          </w:tcPr>
-          <w:p>
-            <w:r>
-              <w:rPr>
-                <w:b/>
-                <w:color w:val="33691E"/>
-                <w:sz w:val="19"/>
-              </w:rPr>
-              <w:t xml:space="preserve">• Observation &amp; Result: </w:t>
-            </w:r>
-            <w:r>
-              <w:rPr>
-                <w:color w:val="424242"/>
-                <w:sz w:val="19"/>
-              </w:rPr>
-              <w:t>The code compiled cleanly with zero warnings, and './hello_program_warn' executed with expected output.</w:t>
-            </w:r>
-          </w:p>
-        </w:tc>
-      </w:tr>
-    </w:tbl>
+      </w:pPr>
+      <w:r>
+        <w:drawing>
+          <wp:inline xmlns:a="http://schemas.openxmlformats.org/drawingml/2006/main" xmlns:pic="http://schemas.openxmlformats.org/drawingml/2006/picture">
+            <wp:extent cx="5669280" cy="1023235"/>
+            <wp:docPr id="13" name="Picture 13"/>
+            <wp:cNvGraphicFramePr>
+              <a:graphicFrameLocks noChangeAspect="1"/>
+            </wp:cNvGraphicFramePr>
+            <a:graphic>
+              <a:graphicData uri="http://schemas.openxmlformats.org/drawingml/2006/picture">
+                <pic:pic>
+                  <pic:nvPicPr>
+                    <pic:cNvPr id="0" name="step13.png"/>
+                    <pic:cNvPicPr/>
+                  </pic:nvPicPr>
+                  <pic:blipFill>
+                    <a:blip r:embed="rId21"/>
+                    <a:stretch>
+                      <a:fillRect/>
+                    </a:stretch>
+                  </pic:blipFill>
+                  <pic:spPr>
+                    <a:xfrm>
+                      <a:off x="0" y="0"/>
+                      <a:ext cx="5669280" cy="1023235"/>
+                    </a:xfrm>
+                    <a:prstGeom prst="rect"/>
+                  </pic:spPr>
+                </pic:pic>
+              </a:graphicData>
+            </a:graphic>
+          </wp:inline>
+        </w:drawing>
+      </w:r>
+    </w:p>
+    <w:p>
+      <w:r>
+        <w:rPr>
+          <w:b/>
+          <w:color w:val="0D47A1"/>
+          <w:sz w:val="21"/>
+        </w:rPr>
+        <w:t xml:space="preserve">What was done in this step: </w:t>
+      </w:r>
+      <w:r>
+        <w:rPr>
+          <w:color w:val="212121"/>
+          <w:sz w:val="21"/>
+        </w:rPr>
+        <w:t>In this step, I applied compiler best practices by compiling with the '-Wall' (all warnings) flag enabled. This helps diagnose uninitialized variables, format errors, or deprecated calls.</w:t>
+      </w:r>
+    </w:p>
+    <w:p>
+      <w:r>
+        <w:rPr>
+          <w:b/>
+          <w:color w:val="2E7D32"/>
+          <w:sz w:val="21"/>
+        </w:rPr>
+        <w:t xml:space="preserve">Screenshot Output &amp; Observation: </w:t>
+      </w:r>
+      <w:r>
+        <w:rPr>
+          <w:color w:val="212121"/>
+          <w:sz w:val="21"/>
+        </w:rPr>
+        <w:t>The screenshot confirms that the program compiled cleanly with zero warnings, and './hello_program_warn' executed with the correct output.</w:t>
+      </w:r>
+    </w:p>
     <w:p/>
     <w:p>
       <w:r>
         <w:rPr>
           <w:b/>
           <w:color w:val="212121"/>
-          <w:sz w:val="23"/>
+          <w:sz w:val="24"/>
         </w:rPr>
         <w:t>Task 3.4: Modify Values and Recompile (Iterative Development)</w:t>
       </w:r>
     </w:p>
-    <w:tbl>
-      <w:tblPr>
-        <w:tblW w:type="auto" w:w="0"/>
+    <w:p>
+      <w:r>
+        <w:rPr>
+          <w:b/>
+          <w:color w:val="283593"/>
+          <w:sz w:val="20"/>
+        </w:rPr>
+        <w:t>Command Executed:</w:t>
+        <w:br/>
+      </w:r>
+      <w:r>
+        <w:rPr>
+          <w:rFonts w:ascii="Courier New" w:hAnsi="Courier New"/>
+          <w:color w:val="1B5E20"/>
+          <w:sz w:val="20"/>
+        </w:rPr>
+        <w:t># Edited hello.c (changed a=100, b=200)</w:t>
+        <w:br/>
+        <w:t>gcc -Wall hello.c -o hello_program</w:t>
+        <w:br/>
+        <w:t>./hello_program</w:t>
+      </w:r>
+    </w:p>
+    <w:p>
+      <w:pPr>
         <w:jc w:val="center"/>
-        <w:tblLook w:firstColumn="1" w:firstRow="1" w:lastColumn="0" w:lastRow="0" w:noHBand="0" w:noVBand="1" w:val="04A0"/>
-      </w:tblPr>
-      <w:tblGrid>
-        <w:gridCol w:w="8640"/>
-      </w:tblGrid>
-      <w:tr>
-        <w:tc>
-          <w:tcPr>
-            <w:tcW w:type="dxa" w:w="9360"/>
-            <w:shd w:fill="F5F7FA"/>
-          </w:tcPr>
-          <w:p>
-            <w:r>
-              <w:rPr>
-                <w:rFonts w:ascii="Courier New" w:hAnsi="Courier New"/>
-                <w:b/>
-                <w:color w:val="1B5E20"/>
-              </w:rPr>
-              <w:t xml:space="preserve">$ </w:t>
-            </w:r>
-            <w:r>
-              <w:rPr>
-                <w:rFonts w:ascii="Courier New" w:hAnsi="Courier New"/>
-                <w:sz w:val="19"/>
-              </w:rPr>
-              <w:t># Edited hello.c (changed a=100, b=200)</w:t>
-              <w:br/>
-              <w:t>gcc -Wall hello.c -o hello_program</w:t>
-              <w:br/>
-              <w:t>./hello_program</w:t>
-            </w:r>
-          </w:p>
-        </w:tc>
-      </w:tr>
-    </w:tbl>
-    <w:p/>
-    <w:tbl>
-      <w:tblPr>
-        <w:tblW w:type="auto" w:w="0"/>
-        <w:jc w:val="center"/>
-        <w:tblLook w:firstColumn="1" w:firstRow="1" w:lastColumn="0" w:lastRow="0" w:noHBand="0" w:noVBand="1" w:val="04A0"/>
-      </w:tblPr>
-      <w:tblGrid>
-        <w:gridCol w:w="8640"/>
-      </w:tblGrid>
-      <w:tr>
-        <w:tc>
-          <w:tcPr>
-            <w:tcW w:type="dxa" w:w="9360"/>
-            <w:shd w:fill="FAFAFA"/>
-          </w:tcPr>
-          <w:p>
-            <w:pPr>
-              <w:jc w:val="center"/>
-            </w:pPr>
-            <w:r>
-              <w:drawing>
-                <wp:inline xmlns:a="http://schemas.openxmlformats.org/drawingml/2006/main" xmlns:pic="http://schemas.openxmlformats.org/drawingml/2006/picture">
-                  <wp:extent cx="5669280" cy="1161511"/>
-                  <wp:docPr id="14" name="Picture 14"/>
-                  <wp:cNvGraphicFramePr>
-                    <a:graphicFrameLocks noChangeAspect="1"/>
-                  </wp:cNvGraphicFramePr>
-                  <a:graphic>
-                    <a:graphicData uri="http://schemas.openxmlformats.org/drawingml/2006/picture">
-                      <pic:pic>
-                        <pic:nvPicPr>
-                          <pic:cNvPr id="0" name="step14.png"/>
-                          <pic:cNvPicPr/>
-                        </pic:nvPicPr>
-                        <pic:blipFill>
-                          <a:blip r:embed="rId22"/>
-                          <a:stretch>
-                            <a:fillRect/>
-                          </a:stretch>
-                        </pic:blipFill>
-                        <pic:spPr>
-                          <a:xfrm>
-                            <a:off x="0" y="0"/>
-                            <a:ext cx="5669280" cy="1161511"/>
-                          </a:xfrm>
-                          <a:prstGeom prst="rect"/>
-                        </pic:spPr>
-                      </pic:pic>
-                    </a:graphicData>
-                  </a:graphic>
-                </wp:inline>
-              </w:drawing>
-            </w:r>
-          </w:p>
-        </w:tc>
-      </w:tr>
-    </w:tbl>
-    <w:p/>
-    <w:tbl>
-      <w:tblPr>
-        <w:tblW w:type="auto" w:w="0"/>
-        <w:jc w:val="center"/>
-        <w:tblLook w:firstColumn="1" w:firstRow="1" w:lastColumn="0" w:lastRow="0" w:noHBand="0" w:noVBand="1" w:val="04A0"/>
-      </w:tblPr>
-      <w:tblGrid>
-        <w:gridCol w:w="8640"/>
-      </w:tblGrid>
-      <w:tr>
-        <w:tc>
-          <w:tcPr>
-            <w:tcW w:type="dxa" w:w="9360"/>
-            <w:shd w:fill="FFFFFF"/>
-          </w:tcPr>
-          <w:p>
-            <w:r>
-              <w:rPr>
-                <w:b/>
-                <w:color w:val="283593"/>
-                <w:sz w:val="19"/>
-              </w:rPr>
-              <w:t xml:space="preserve">• Action Performed: </w:t>
-            </w:r>
-            <w:r>
-              <w:rPr>
-                <w:color w:val="424242"/>
-                <w:sz w:val="19"/>
-              </w:rPr>
-              <w:t>Modified the integer variables in 'hello.c' to a=100 and b=200. Re-compiled using 'gcc -Wall' and executed './hello_program' to verify the updated build.</w:t>
-            </w:r>
-          </w:p>
-        </w:tc>
-      </w:tr>
-      <w:tr>
-        <w:tc>
-          <w:tcPr>
-            <w:tcW w:type="dxa" w:w="9360"/>
-            <w:shd w:fill="F9FBE7"/>
-          </w:tcPr>
-          <w:p>
-            <w:r>
-              <w:rPr>
-                <w:b/>
-                <w:color w:val="33691E"/>
-                <w:sz w:val="19"/>
-              </w:rPr>
-              <w:t xml:space="preserve">• Observation &amp; Result: </w:t>
-            </w:r>
-            <w:r>
-              <w:rPr>
-                <w:color w:val="424242"/>
-                <w:sz w:val="19"/>
-              </w:rPr>
-              <w:t>The output printed 'Sum of 100 and 200 is 300', demonstrating proper iterative code compilation and execution.</w:t>
-            </w:r>
-          </w:p>
-        </w:tc>
-      </w:tr>
-    </w:tbl>
+      </w:pPr>
+      <w:r>
+        <w:drawing>
+          <wp:inline xmlns:a="http://schemas.openxmlformats.org/drawingml/2006/main" xmlns:pic="http://schemas.openxmlformats.org/drawingml/2006/picture">
+            <wp:extent cx="5669280" cy="1161511"/>
+            <wp:docPr id="14" name="Picture 14"/>
+            <wp:cNvGraphicFramePr>
+              <a:graphicFrameLocks noChangeAspect="1"/>
+            </wp:cNvGraphicFramePr>
+            <a:graphic>
+              <a:graphicData uri="http://schemas.openxmlformats.org/drawingml/2006/picture">
+                <pic:pic>
+                  <pic:nvPicPr>
+                    <pic:cNvPr id="0" name="step14.png"/>
+                    <pic:cNvPicPr/>
+                  </pic:nvPicPr>
+                  <pic:blipFill>
+                    <a:blip r:embed="rId22"/>
+                    <a:stretch>
+                      <a:fillRect/>
+                    </a:stretch>
+                  </pic:blipFill>
+                  <pic:spPr>
+                    <a:xfrm>
+                      <a:off x="0" y="0"/>
+                      <a:ext cx="5669280" cy="1161511"/>
+                    </a:xfrm>
+                    <a:prstGeom prst="rect"/>
+                  </pic:spPr>
+                </pic:pic>
+              </a:graphicData>
+            </a:graphic>
+          </wp:inline>
+        </w:drawing>
+      </w:r>
+    </w:p>
+    <w:p>
+      <w:r>
+        <w:rPr>
+          <w:b/>
+          <w:color w:val="0D47A1"/>
+          <w:sz w:val="21"/>
+        </w:rPr>
+        <w:t xml:space="preserve">What was done in this step: </w:t>
+      </w:r>
+      <w:r>
+        <w:rPr>
+          <w:color w:val="212121"/>
+          <w:sz w:val="21"/>
+        </w:rPr>
+        <w:t>In this step, I practiced iterative development by modifying 'hello.c' so that a=100 and b=200. I recompiled the program using 'gcc -Wall' and ran the executable to verify that the output updated dynamically.</w:t>
+      </w:r>
+    </w:p>
+    <w:p>
+      <w:r>
+        <w:rPr>
+          <w:b/>
+          <w:color w:val="2E7D32"/>
+          <w:sz w:val="21"/>
+        </w:rPr>
+        <w:t xml:space="preserve">Screenshot Output &amp; Observation: </w:t>
+      </w:r>
+      <w:r>
+        <w:rPr>
+          <w:color w:val="212121"/>
+          <w:sz w:val="21"/>
+        </w:rPr>
+        <w:t>The screenshot shows the output updating to 'Sum of 100 and 200 is 300', demonstrating proper recompilation.</w:t>
+      </w:r>
+    </w:p>
     <w:p/>
     <w:p>
       <w:r>
         <w:rPr>
           <w:b/>
           <w:color w:val="0D47A1"/>
-          <w:sz w:val="28"/>
+          <w:sz w:val="30"/>
         </w:rPr>
-        <w:t>Part IV: Cleanup &amp; Final Verification</w:t>
+        <w:t>Part IV: Cleanup &amp; Verification</w:t>
       </w:r>
     </w:p>
     <w:p>
@@ -2419,336 +1553,212 @@
         <w:rPr>
           <w:b/>
           <w:color w:val="212121"/>
-          <w:sz w:val="23"/>
+          <w:sz w:val="24"/>
         </w:rPr>
-        <w:t>Task 4.1: Return Home &amp; Inspect Lab Directory Structure</w:t>
+        <w:t>Task 4.1: Return Home &amp; Inspect Lab Files</w:t>
       </w:r>
     </w:p>
-    <w:tbl>
-      <w:tblPr>
-        <w:tblW w:type="auto" w:w="0"/>
+    <w:p>
+      <w:r>
+        <w:rPr>
+          <w:b/>
+          <w:color w:val="283593"/>
+          <w:sz w:val="20"/>
+        </w:rPr>
+        <w:t>Command Executed:</w:t>
+        <w:br/>
+      </w:r>
+      <w:r>
+        <w:rPr>
+          <w:rFonts w:ascii="Courier New" w:hAnsi="Courier New"/>
+          <w:color w:val="1B5E20"/>
+          <w:sz w:val="20"/>
+        </w:rPr>
+        <w:t>cd ~</w:t>
+        <w:br/>
+        <w:t>ls -lh ~/linux_lab/</w:t>
+      </w:r>
+    </w:p>
+    <w:p>
+      <w:pPr>
         <w:jc w:val="center"/>
-        <w:tblLook w:firstColumn="1" w:firstRow="1" w:lastColumn="0" w:lastRow="0" w:noHBand="0" w:noVBand="1" w:val="04A0"/>
-      </w:tblPr>
-      <w:tblGrid>
-        <w:gridCol w:w="8640"/>
-      </w:tblGrid>
-      <w:tr>
-        <w:tc>
-          <w:tcPr>
-            <w:tcW w:type="dxa" w:w="9360"/>
-            <w:shd w:fill="F5F7FA"/>
-          </w:tcPr>
-          <w:p>
-            <w:r>
-              <w:rPr>
-                <w:rFonts w:ascii="Courier New" w:hAnsi="Courier New"/>
-                <w:b/>
-                <w:color w:val="1B5E20"/>
-              </w:rPr>
-              <w:t xml:space="preserve">$ </w:t>
-            </w:r>
-            <w:r>
-              <w:rPr>
-                <w:rFonts w:ascii="Courier New" w:hAnsi="Courier New"/>
-                <w:sz w:val="19"/>
-              </w:rPr>
-              <w:t>cd ~</w:t>
-              <w:br/>
-              <w:t>ls -lh ~/linux_lab/</w:t>
-            </w:r>
-          </w:p>
-        </w:tc>
-      </w:tr>
-    </w:tbl>
-    <w:p/>
-    <w:tbl>
-      <w:tblPr>
-        <w:tblW w:type="auto" w:w="0"/>
-        <w:jc w:val="center"/>
-        <w:tblLook w:firstColumn="1" w:firstRow="1" w:lastColumn="0" w:lastRow="0" w:noHBand="0" w:noVBand="1" w:val="04A0"/>
-      </w:tblPr>
-      <w:tblGrid>
-        <w:gridCol w:w="8640"/>
-      </w:tblGrid>
-      <w:tr>
-        <w:tc>
-          <w:tcPr>
-            <w:tcW w:type="dxa" w:w="9360"/>
-            <w:shd w:fill="FAFAFA"/>
-          </w:tcPr>
-          <w:p>
-            <w:pPr>
-              <w:jc w:val="center"/>
-            </w:pPr>
-            <w:r>
-              <w:drawing>
-                <wp:inline xmlns:a="http://schemas.openxmlformats.org/drawingml/2006/main" xmlns:pic="http://schemas.openxmlformats.org/drawingml/2006/picture">
-                  <wp:extent cx="5669280" cy="1438061"/>
-                  <wp:docPr id="15" name="Picture 15"/>
-                  <wp:cNvGraphicFramePr>
-                    <a:graphicFrameLocks noChangeAspect="1"/>
-                  </wp:cNvGraphicFramePr>
-                  <a:graphic>
-                    <a:graphicData uri="http://schemas.openxmlformats.org/drawingml/2006/picture">
-                      <pic:pic>
-                        <pic:nvPicPr>
-                          <pic:cNvPr id="0" name="step15.png"/>
-                          <pic:cNvPicPr/>
-                        </pic:nvPicPr>
-                        <pic:blipFill>
-                          <a:blip r:embed="rId23"/>
-                          <a:stretch>
-                            <a:fillRect/>
-                          </a:stretch>
-                        </pic:blipFill>
-                        <pic:spPr>
-                          <a:xfrm>
-                            <a:off x="0" y="0"/>
-                            <a:ext cx="5669280" cy="1438061"/>
-                          </a:xfrm>
-                          <a:prstGeom prst="rect"/>
-                        </pic:spPr>
-                      </pic:pic>
-                    </a:graphicData>
-                  </a:graphic>
-                </wp:inline>
-              </w:drawing>
-            </w:r>
-          </w:p>
-        </w:tc>
-      </w:tr>
-    </w:tbl>
-    <w:p/>
-    <w:tbl>
-      <w:tblPr>
-        <w:tblW w:type="auto" w:w="0"/>
-        <w:jc w:val="center"/>
-        <w:tblLook w:firstColumn="1" w:firstRow="1" w:lastColumn="0" w:lastRow="0" w:noHBand="0" w:noVBand="1" w:val="04A0"/>
-      </w:tblPr>
-      <w:tblGrid>
-        <w:gridCol w:w="8640"/>
-      </w:tblGrid>
-      <w:tr>
-        <w:tc>
-          <w:tcPr>
-            <w:tcW w:type="dxa" w:w="9360"/>
-            <w:shd w:fill="FFFFFF"/>
-          </w:tcPr>
-          <w:p>
-            <w:r>
-              <w:rPr>
-                <w:b/>
-                <w:color w:val="283593"/>
-                <w:sz w:val="19"/>
-              </w:rPr>
-              <w:t xml:space="preserve">• Action Performed: </w:t>
-            </w:r>
-            <w:r>
-              <w:rPr>
-                <w:color w:val="424242"/>
-                <w:sz w:val="19"/>
-              </w:rPr>
-              <w:t>Navigated back to user home directory using 'cd ~' and ran 'ls -lh' with human-readable file sizes to verify all lab artifacts created during the session.</w:t>
-            </w:r>
-          </w:p>
-        </w:tc>
-      </w:tr>
-      <w:tr>
-        <w:tc>
-          <w:tcPr>
-            <w:tcW w:type="dxa" w:w="9360"/>
-            <w:shd w:fill="F9FBE7"/>
-          </w:tcPr>
-          <w:p>
-            <w:r>
-              <w:rPr>
-                <w:b/>
-                <w:color w:val="33691E"/>
-                <w:sz w:val="19"/>
-              </w:rPr>
-              <w:t xml:space="preserve">• Observation &amp; Result: </w:t>
-            </w:r>
-            <w:r>
-              <w:rPr>
-                <w:color w:val="424242"/>
-                <w:sz w:val="19"/>
-              </w:rPr>
-              <w:t>Listed all files ('greeting.txt', 'hello.c', 'hello_program', 'hello_program_warn') along with their exact sizes and permissions.</w:t>
-            </w:r>
-          </w:p>
-        </w:tc>
-      </w:tr>
-    </w:tbl>
+      </w:pPr>
+      <w:r>
+        <w:drawing>
+          <wp:inline xmlns:a="http://schemas.openxmlformats.org/drawingml/2006/main" xmlns:pic="http://schemas.openxmlformats.org/drawingml/2006/picture">
+            <wp:extent cx="5669280" cy="1438061"/>
+            <wp:docPr id="15" name="Picture 15"/>
+            <wp:cNvGraphicFramePr>
+              <a:graphicFrameLocks noChangeAspect="1"/>
+            </wp:cNvGraphicFramePr>
+            <a:graphic>
+              <a:graphicData uri="http://schemas.openxmlformats.org/drawingml/2006/picture">
+                <pic:pic>
+                  <pic:nvPicPr>
+                    <pic:cNvPr id="0" name="step15.png"/>
+                    <pic:cNvPicPr/>
+                  </pic:nvPicPr>
+                  <pic:blipFill>
+                    <a:blip r:embed="rId23"/>
+                    <a:stretch>
+                      <a:fillRect/>
+                    </a:stretch>
+                  </pic:blipFill>
+                  <pic:spPr>
+                    <a:xfrm>
+                      <a:off x="0" y="0"/>
+                      <a:ext cx="5669280" cy="1438061"/>
+                    </a:xfrm>
+                    <a:prstGeom prst="rect"/>
+                  </pic:spPr>
+                </pic:pic>
+              </a:graphicData>
+            </a:graphic>
+          </wp:inline>
+        </w:drawing>
+      </w:r>
+    </w:p>
+    <w:p>
+      <w:r>
+        <w:rPr>
+          <w:b/>
+          <w:color w:val="0D47A1"/>
+          <w:sz w:val="21"/>
+        </w:rPr>
+        <w:t xml:space="preserve">What was done in this step: </w:t>
+      </w:r>
+      <w:r>
+        <w:rPr>
+          <w:color w:val="212121"/>
+          <w:sz w:val="21"/>
+        </w:rPr>
+        <w:t>In this step, I navigated back to the user home directory with 'cd ~' and ran 'ls -lh ~/linux_lab/' with human-readable file sizes to review all files generated during the lab session.</w:t>
+      </w:r>
+    </w:p>
+    <w:p>
+      <w:r>
+        <w:rPr>
+          <w:b/>
+          <w:color w:val="2E7D32"/>
+          <w:sz w:val="21"/>
+        </w:rPr>
+        <w:t xml:space="preserve">Screenshot Output &amp; Observation: </w:t>
+      </w:r>
+      <w:r>
+        <w:rPr>
+          <w:color w:val="212121"/>
+          <w:sz w:val="21"/>
+        </w:rPr>
+        <w:t>The screenshot lists 'greeting.txt', 'hello.c', 'hello_program', and 'hello_program_warn' with their exact sizes and permissions.</w:t>
+      </w:r>
+    </w:p>
     <w:p/>
     <w:p>
       <w:r>
         <w:rPr>
           <w:b/>
           <w:color w:val="212121"/>
-          <w:sz w:val="23"/>
+          <w:sz w:val="24"/>
         </w:rPr>
-        <w:t>Task 4.2: Final Source Code Review &amp; Verification</w:t>
+        <w:t>Task 4.2: Final Source Code Review</w:t>
       </w:r>
     </w:p>
-    <w:tbl>
-      <w:tblPr>
-        <w:tblW w:type="auto" w:w="0"/>
+    <w:p>
+      <w:r>
+        <w:rPr>
+          <w:b/>
+          <w:color w:val="283593"/>
+          <w:sz w:val="20"/>
+        </w:rPr>
+        <w:t>Command Executed:</w:t>
+        <w:br/>
+      </w:r>
+      <w:r>
+        <w:rPr>
+          <w:rFonts w:ascii="Courier New" w:hAnsi="Courier New"/>
+          <w:color w:val="1B5E20"/>
+          <w:sz w:val="20"/>
+        </w:rPr>
+        <w:t>cat ~/linux_lab/hello.c</w:t>
+      </w:r>
+    </w:p>
+    <w:p>
+      <w:pPr>
         <w:jc w:val="center"/>
-        <w:tblLook w:firstColumn="1" w:firstRow="1" w:lastColumn="0" w:lastRow="0" w:noHBand="0" w:noVBand="1" w:val="04A0"/>
-      </w:tblPr>
-      <w:tblGrid>
-        <w:gridCol w:w="8640"/>
-      </w:tblGrid>
-      <w:tr>
-        <w:tc>
-          <w:tcPr>
-            <w:tcW w:type="dxa" w:w="9360"/>
-            <w:shd w:fill="F5F7FA"/>
-          </w:tcPr>
-          <w:p>
-            <w:r>
-              <w:rPr>
-                <w:rFonts w:ascii="Courier New" w:hAnsi="Courier New"/>
-                <w:b/>
-                <w:color w:val="1B5E20"/>
-              </w:rPr>
-              <w:t xml:space="preserve">$ </w:t>
-            </w:r>
-            <w:r>
-              <w:rPr>
-                <w:rFonts w:ascii="Courier New" w:hAnsi="Courier New"/>
-                <w:sz w:val="19"/>
-              </w:rPr>
-              <w:t>cat ~/linux_lab/hello.c</w:t>
-            </w:r>
-          </w:p>
-        </w:tc>
-      </w:tr>
-    </w:tbl>
-    <w:p/>
-    <w:tbl>
-      <w:tblPr>
-        <w:tblW w:type="auto" w:w="0"/>
-        <w:jc w:val="center"/>
-        <w:tblLook w:firstColumn="1" w:firstRow="1" w:lastColumn="0" w:lastRow="0" w:noHBand="0" w:noVBand="1" w:val="04A0"/>
-      </w:tblPr>
-      <w:tblGrid>
-        <w:gridCol w:w="8640"/>
-      </w:tblGrid>
-      <w:tr>
-        <w:tc>
-          <w:tcPr>
-            <w:tcW w:type="dxa" w:w="9360"/>
-            <w:shd w:fill="FAFAFA"/>
-          </w:tcPr>
-          <w:p>
-            <w:pPr>
-              <w:jc w:val="center"/>
-            </w:pPr>
-            <w:r>
-              <w:drawing>
-                <wp:inline xmlns:a="http://schemas.openxmlformats.org/drawingml/2006/main" xmlns:pic="http://schemas.openxmlformats.org/drawingml/2006/picture">
-                  <wp:extent cx="5669280" cy="1714612"/>
-                  <wp:docPr id="16" name="Picture 16"/>
-                  <wp:cNvGraphicFramePr>
-                    <a:graphicFrameLocks noChangeAspect="1"/>
-                  </wp:cNvGraphicFramePr>
-                  <a:graphic>
-                    <a:graphicData uri="http://schemas.openxmlformats.org/drawingml/2006/picture">
-                      <pic:pic>
-                        <pic:nvPicPr>
-                          <pic:cNvPr id="0" name="step16.png"/>
-                          <pic:cNvPicPr/>
-                        </pic:nvPicPr>
-                        <pic:blipFill>
-                          <a:blip r:embed="rId24"/>
-                          <a:stretch>
-                            <a:fillRect/>
-                          </a:stretch>
-                        </pic:blipFill>
-                        <pic:spPr>
-                          <a:xfrm>
-                            <a:off x="0" y="0"/>
-                            <a:ext cx="5669280" cy="1714612"/>
-                          </a:xfrm>
-                          <a:prstGeom prst="rect"/>
-                        </pic:spPr>
-                      </pic:pic>
-                    </a:graphicData>
-                  </a:graphic>
-                </wp:inline>
-              </w:drawing>
-            </w:r>
-          </w:p>
-        </w:tc>
-      </w:tr>
-    </w:tbl>
-    <w:p/>
-    <w:tbl>
-      <w:tblPr>
-        <w:tblW w:type="auto" w:w="0"/>
-        <w:jc w:val="center"/>
-        <w:tblLook w:firstColumn="1" w:firstRow="1" w:lastColumn="0" w:lastRow="0" w:noHBand="0" w:noVBand="1" w:val="04A0"/>
-      </w:tblPr>
-      <w:tblGrid>
-        <w:gridCol w:w="8640"/>
-      </w:tblGrid>
-      <w:tr>
-        <w:tc>
-          <w:tcPr>
-            <w:tcW w:type="dxa" w:w="9360"/>
-            <w:shd w:fill="FFFFFF"/>
-          </w:tcPr>
-          <w:p>
-            <w:r>
-              <w:rPr>
-                <w:b/>
-                <w:color w:val="283593"/>
-                <w:sz w:val="19"/>
-              </w:rPr>
-              <w:t xml:space="preserve">• Action Performed: </w:t>
-            </w:r>
-            <w:r>
-              <w:rPr>
-                <w:color w:val="424242"/>
-                <w:sz w:val="19"/>
-              </w:rPr>
-              <w:t>Printed the final state of the C program from the home directory using 'cat' to ensure source integrity.</w:t>
-            </w:r>
-          </w:p>
-        </w:tc>
-      </w:tr>
-      <w:tr>
-        <w:tc>
-          <w:tcPr>
-            <w:tcW w:type="dxa" w:w="9360"/>
-            <w:shd w:fill="F9FBE7"/>
-          </w:tcPr>
-          <w:p>
-            <w:r>
-              <w:rPr>
-                <w:b/>
-                <w:color w:val="33691E"/>
-                <w:sz w:val="19"/>
-              </w:rPr>
-              <w:t xml:space="preserve">• Observation &amp; Result: </w:t>
-            </w:r>
-            <w:r>
-              <w:rPr>
-                <w:color w:val="424242"/>
-                <w:sz w:val="19"/>
-              </w:rPr>
-              <w:t>The terminal verified the completed, functional code for the lab submission.</w:t>
-            </w:r>
-          </w:p>
-        </w:tc>
-      </w:tr>
-    </w:tbl>
+      </w:pPr>
+      <w:r>
+        <w:drawing>
+          <wp:inline xmlns:a="http://schemas.openxmlformats.org/drawingml/2006/main" xmlns:pic="http://schemas.openxmlformats.org/drawingml/2006/picture">
+            <wp:extent cx="5669280" cy="1714612"/>
+            <wp:docPr id="16" name="Picture 16"/>
+            <wp:cNvGraphicFramePr>
+              <a:graphicFrameLocks noChangeAspect="1"/>
+            </wp:cNvGraphicFramePr>
+            <a:graphic>
+              <a:graphicData uri="http://schemas.openxmlformats.org/drawingml/2006/picture">
+                <pic:pic>
+                  <pic:nvPicPr>
+                    <pic:cNvPr id="0" name="step16.png"/>
+                    <pic:cNvPicPr/>
+                  </pic:nvPicPr>
+                  <pic:blipFill>
+                    <a:blip r:embed="rId24"/>
+                    <a:stretch>
+                      <a:fillRect/>
+                    </a:stretch>
+                  </pic:blipFill>
+                  <pic:spPr>
+                    <a:xfrm>
+                      <a:off x="0" y="0"/>
+                      <a:ext cx="5669280" cy="1714612"/>
+                    </a:xfrm>
+                    <a:prstGeom prst="rect"/>
+                  </pic:spPr>
+                </pic:pic>
+              </a:graphicData>
+            </a:graphic>
+          </wp:inline>
+        </w:drawing>
+      </w:r>
+    </w:p>
+    <w:p>
+      <w:r>
+        <w:rPr>
+          <w:b/>
+          <w:color w:val="0D47A1"/>
+          <w:sz w:val="21"/>
+        </w:rPr>
+        <w:t xml:space="preserve">What was done in this step: </w:t>
+      </w:r>
+      <w:r>
+        <w:rPr>
+          <w:color w:val="212121"/>
+          <w:sz w:val="21"/>
+        </w:rPr>
+        <w:t>In this step, I performed a final integrity check on my C program source code by displaying it with 'cat ~/linux_lab/hello.c' from the home directory.</w:t>
+      </w:r>
+    </w:p>
+    <w:p>
+      <w:r>
+        <w:rPr>
+          <w:b/>
+          <w:color w:val="2E7D32"/>
+          <w:sz w:val="21"/>
+        </w:rPr>
+        <w:t xml:space="preserve">Screenshot Output &amp; Observation: </w:t>
+      </w:r>
+      <w:r>
+        <w:rPr>
+          <w:color w:val="212121"/>
+          <w:sz w:val="21"/>
+        </w:rPr>
+        <w:t>The screenshot displays the complete modified source code of 'hello.c' as the final submission artifact.</w:t>
+      </w:r>
+    </w:p>
     <w:p/>
     <w:sectPr>
       <w:pgSz w:w="12240" w:h="15840"/>
-      <w:pgMar w:top="1440" w:right="1800" w:bottom="1440" w:left="1800" w:header="720" w:footer="720" w:gutter="0"/>
+      <w:pgMar w:top="1152" w:right="1152" w:bottom="1152" w:left="1152" w:header="720" w:footer="720" w:gutter="0"/>
       <w:cols w:space="720"/>
       <w:docGrid w:linePitch="360"/>
     </w:sectPr>

</xml_diff>

<commit_message>
Keep screenshot descriptions short and clean
</commit_message>
<xml_diff>
--- a/week 1/lab1.docx
+++ b/week 1/lab1.docx
@@ -10,7 +10,7 @@
         <w:rPr>
           <w:b/>
           <w:color w:val="1A237E"/>
-          <w:sz w:val="44"/>
+          <w:sz w:val="40"/>
         </w:rPr>
         <w:t>Operating Systems, Security and Network</w:t>
       </w:r>
@@ -25,20 +25,7 @@
           <w:color w:val="37474F"/>
           <w:sz w:val="26"/>
         </w:rPr>
-        <w:t>Lab Report 1: Linux Fundamentals (Files, APT Package Management &amp; C Programming)</w:t>
-      </w:r>
-    </w:p>
-    <w:p>
-      <w:pPr>
-        <w:jc w:val="center"/>
-      </w:pPr>
-      <w:r>
-        <w:rPr>
-          <w:i/>
-          <w:color w:val="78909C"/>
-          <w:sz w:val="21"/>
-        </w:rPr>
-        <w:t>Coursework Lab Submission | Student: Dibij | Institution: Softwarica College</w:t>
+        <w:t>Lab Report 1: Linux Fundamentals</w:t>
       </w:r>
     </w:p>
     <w:p/>
@@ -47,7 +34,7 @@
         <w:rPr>
           <w:b/>
           <w:color w:val="0D47A1"/>
-          <w:sz w:val="30"/>
+          <w:sz w:val="28"/>
         </w:rPr>
         <w:t>Part I: File Operations</w:t>
       </w:r>
@@ -56,8 +43,7 @@
       <w:r>
         <w:rPr>
           <w:b/>
-          <w:color w:val="212121"/>
-          <w:sz w:val="24"/>
+          <w:sz w:val="23"/>
         </w:rPr>
         <w:t>Task 1.1: Create and Navigate to Lab Directory</w:t>
       </w:r>
@@ -66,23 +52,17 @@
       <w:r>
         <w:rPr>
           <w:b/>
-          <w:color w:val="283593"/>
-          <w:sz w:val="20"/>
+          <w:sz w:val="19"/>
         </w:rPr>
-        <w:t>Command Executed:</w:t>
-        <w:br/>
+        <w:t xml:space="preserve">Command: </w:t>
       </w:r>
       <w:r>
         <w:rPr>
           <w:rFonts w:ascii="Courier New" w:hAnsi="Courier New"/>
           <w:color w:val="1B5E20"/>
-          <w:sz w:val="20"/>
+          <w:sz w:val="19"/>
         </w:rPr>
-        <w:t>mkdir ~/linux_lab</w:t>
-        <w:br/>
-        <w:t>cd ~/linux_lab</w:t>
-        <w:br/>
-        <w:t>pwd</w:t>
+        <w:t>mkdir ~/linux_lab &amp;&amp; cd ~/linux_lab</w:t>
       </w:r>
     </w:p>
     <w:p>
@@ -128,34 +108,17 @@
       <w:r>
         <w:rPr>
           <w:b/>
-          <w:color w:val="0D47A1"/>
-          <w:sz w:val="21"/>
+          <w:color w:val="1A237E"/>
+          <w:sz w:val="20"/>
         </w:rPr>
-        <w:t xml:space="preserve">What was done in this step: </w:t>
+        <w:t xml:space="preserve">Description: </w:t>
       </w:r>
       <w:r>
         <w:rPr>
-          <w:color w:val="212121"/>
-          <w:sz w:val="21"/>
+          <w:color w:val="282828"/>
+          <w:sz w:val="20"/>
         </w:rPr>
-        <w:t>In this step, I created a dedicated lab workspace directory named 'linux_lab' in my home directory using the 'mkdir' command. I then used the 'cd' command to navigate directly into this new directory. Finally, I executed 'pwd' to confirm that my current working directory was successfully set to '/home/dibij/linux_lab'.</w:t>
-      </w:r>
-    </w:p>
-    <w:p>
-      <w:r>
-        <w:rPr>
-          <w:b/>
-          <w:color w:val="2E7D32"/>
-          <w:sz w:val="21"/>
-        </w:rPr>
-        <w:t xml:space="preserve">Screenshot Output &amp; Observation: </w:t>
-      </w:r>
-      <w:r>
-        <w:rPr>
-          <w:color w:val="212121"/>
-          <w:sz w:val="21"/>
-        </w:rPr>
-        <w:t>The screenshot confirms that the directory was created without errors, the command prompt updated to reflect the new directory '~/linux_lab', and 'pwd' returned the exact absolute path.</w:t>
+        <w:t>We ran this command to create the lab directory and navigate into it to start our work.</w:t>
       </w:r>
     </w:p>
     <w:p/>
@@ -163,27 +126,24 @@
       <w:r>
         <w:rPr>
           <w:b/>
-          <w:color w:val="212121"/>
-          <w:sz w:val="24"/>
+          <w:sz w:val="23"/>
         </w:rPr>
-        <w:t>Task 1.2: Create and Edit File using Nano Editor</w:t>
+        <w:t>Task 1.2: Create and Edit File using Nano</w:t>
       </w:r>
     </w:p>
     <w:p>
       <w:r>
         <w:rPr>
           <w:b/>
-          <w:color w:val="283593"/>
-          <w:sz w:val="20"/>
+          <w:sz w:val="19"/>
         </w:rPr>
-        <w:t>Command Executed:</w:t>
-        <w:br/>
+        <w:t xml:space="preserve">Command: </w:t>
       </w:r>
       <w:r>
         <w:rPr>
           <w:rFonts w:ascii="Courier New" w:hAnsi="Courier New"/>
           <w:color w:val="1B5E20"/>
-          <w:sz w:val="20"/>
+          <w:sz w:val="19"/>
         </w:rPr>
         <w:t>nano greeting.txt</w:t>
       </w:r>
@@ -231,34 +191,17 @@
       <w:r>
         <w:rPr>
           <w:b/>
-          <w:color w:val="0D47A1"/>
-          <w:sz w:val="21"/>
+          <w:color w:val="1A237E"/>
+          <w:sz w:val="20"/>
         </w:rPr>
-        <w:t xml:space="preserve">What was done in this step: </w:t>
+        <w:t xml:space="preserve">Description: </w:t>
       </w:r>
       <w:r>
         <w:rPr>
-          <w:color w:val="212121"/>
-          <w:sz w:val="21"/>
+          <w:color w:val="282828"/>
+          <w:sz w:val="20"/>
         </w:rPr>
-        <w:t>In this step, I launched the command-line text editor GNU Nano by running 'nano greeting.txt'. Inside the editor, I wrote the string 'Hello Linux!'. To write the contents to disk, I pressed Ctrl+O followed by Enter, and then exited the editor back to the shell using Ctrl+X.</w:t>
-      </w:r>
-    </w:p>
-    <w:p>
-      <w:r>
-        <w:rPr>
-          <w:b/>
-          <w:color w:val="2E7D32"/>
-          <w:sz w:val="21"/>
-        </w:rPr>
-        <w:t xml:space="preserve">Screenshot Output &amp; Observation: </w:t>
-      </w:r>
-      <w:r>
-        <w:rPr>
-          <w:color w:val="212121"/>
-          <w:sz w:val="21"/>
-        </w:rPr>
-        <w:t>The screenshot captures the active GNU Nano 7.2 editor interface showing the buffer name 'greeting.txt' with the entered text 'Hello Linux!' and the control shortcuts displayed at the bottom.</w:t>
+        <w:t>We ran this command to open the nano editor and write 'Hello Linux!' into greeting.txt.</w:t>
       </w:r>
     </w:p>
     <w:p/>
@@ -266,27 +209,24 @@
       <w:r>
         <w:rPr>
           <w:b/>
-          <w:color w:val="212121"/>
-          <w:sz w:val="24"/>
+          <w:sz w:val="23"/>
         </w:rPr>
-        <w:t>Task 1.3: View File Content using Cat</w:t>
+        <w:t>Task 1.3: View File Content</w:t>
       </w:r>
     </w:p>
     <w:p>
       <w:r>
         <w:rPr>
           <w:b/>
-          <w:color w:val="283593"/>
-          <w:sz w:val="20"/>
+          <w:sz w:val="19"/>
         </w:rPr>
-        <w:t>Command Executed:</w:t>
-        <w:br/>
+        <w:t xml:space="preserve">Command: </w:t>
       </w:r>
       <w:r>
         <w:rPr>
           <w:rFonts w:ascii="Courier New" w:hAnsi="Courier New"/>
           <w:color w:val="1B5E20"/>
-          <w:sz w:val="20"/>
+          <w:sz w:val="19"/>
         </w:rPr>
         <w:t>cat greeting.txt</w:t>
       </w:r>
@@ -334,34 +274,17 @@
       <w:r>
         <w:rPr>
           <w:b/>
-          <w:color w:val="0D47A1"/>
-          <w:sz w:val="21"/>
+          <w:color w:val="1A237E"/>
+          <w:sz w:val="20"/>
         </w:rPr>
-        <w:t xml:space="preserve">What was done in this step: </w:t>
+        <w:t xml:space="preserve">Description: </w:t>
       </w:r>
       <w:r>
         <w:rPr>
-          <w:color w:val="212121"/>
-          <w:sz w:val="21"/>
+          <w:color w:val="282828"/>
+          <w:sz w:val="20"/>
         </w:rPr>
-        <w:t>In this step, I used the 'cat' (concatenate) utility to output the contents of 'greeting.txt' to the terminal window without opening a text editor.</w:t>
-      </w:r>
-    </w:p>
-    <w:p>
-      <w:r>
-        <w:rPr>
-          <w:b/>
-          <w:color w:val="2E7D32"/>
-          <w:sz w:val="21"/>
-        </w:rPr>
-        <w:t xml:space="preserve">Screenshot Output &amp; Observation: </w:t>
-      </w:r>
-      <w:r>
-        <w:rPr>
-          <w:color w:val="212121"/>
-          <w:sz w:val="21"/>
-        </w:rPr>
-        <w:t>The screenshot shows the output 'Hello Linux!', verifying that the text file was written accurately and saved on the disk.</w:t>
+        <w:t>We ran this command to view the contents of greeting.txt on the terminal.</w:t>
       </w:r>
     </w:p>
     <w:p/>
@@ -369,33 +292,26 @@
       <w:r>
         <w:rPr>
           <w:b/>
-          <w:color w:val="212121"/>
-          <w:sz w:val="24"/>
+          <w:sz w:val="23"/>
         </w:rPr>
-        <w:t>Task 1.4: Copy and Rename Files</w:t>
+        <w:t>Task 1.4: Copy and Rename File</w:t>
       </w:r>
     </w:p>
     <w:p>
       <w:r>
         <w:rPr>
           <w:b/>
-          <w:color w:val="283593"/>
-          <w:sz w:val="20"/>
+          <w:sz w:val="19"/>
         </w:rPr>
-        <w:t>Command Executed:</w:t>
-        <w:br/>
+        <w:t xml:space="preserve">Command: </w:t>
       </w:r>
       <w:r>
         <w:rPr>
           <w:rFonts w:ascii="Courier New" w:hAnsi="Courier New"/>
           <w:color w:val="1B5E20"/>
-          <w:sz w:val="20"/>
+          <w:sz w:val="19"/>
         </w:rPr>
-        <w:t>cp greeting.txt backup.txt</w:t>
-        <w:br/>
-        <w:t>mv backup.txt old_greeting.txt</w:t>
-        <w:br/>
-        <w:t>ls -l</w:t>
+        <w:t>cp greeting.txt backup.txt &amp;&amp; mv backup.txt old_greeting.txt</w:t>
       </w:r>
     </w:p>
     <w:p>
@@ -441,34 +357,17 @@
       <w:r>
         <w:rPr>
           <w:b/>
-          <w:color w:val="0D47A1"/>
-          <w:sz w:val="21"/>
+          <w:color w:val="1A237E"/>
+          <w:sz w:val="20"/>
         </w:rPr>
-        <w:t xml:space="preserve">What was done in this step: </w:t>
+        <w:t xml:space="preserve">Description: </w:t>
       </w:r>
       <w:r>
         <w:rPr>
-          <w:color w:val="212121"/>
-          <w:sz w:val="21"/>
+          <w:color w:val="282828"/>
+          <w:sz w:val="20"/>
         </w:rPr>
-        <w:t>In this step, I demonstrated file duplication and renaming. First, I made a copy of 'greeting.txt' called 'backup.txt' using 'cp'. Then, I used 'mv' to rename 'backup.txt' to 'old_greeting.txt'. Finally, I executed 'ls -l' to list all files.</w:t>
-      </w:r>
-    </w:p>
-    <w:p>
-      <w:r>
-        <w:rPr>
-          <w:b/>
-          <w:color w:val="2E7D32"/>
-          <w:sz w:val="21"/>
-        </w:rPr>
-        <w:t xml:space="preserve">Screenshot Output &amp; Observation: </w:t>
-      </w:r>
-      <w:r>
-        <w:rPr>
-          <w:color w:val="212121"/>
-          <w:sz w:val="21"/>
-        </w:rPr>
-        <w:t>The screenshot shows the output of 'ls -l', confirming that 'greeting.txt' and 'old_greeting.txt' both exist as distinct files with identical size (13 bytes).</w:t>
+        <w:t>We ran this command to copy greeting.txt to backup.txt and then rename it to old_greeting.txt.</w:t>
       </w:r>
     </w:p>
     <w:p/>
@@ -476,8 +375,7 @@
       <w:r>
         <w:rPr>
           <w:b/>
-          <w:color w:val="212121"/>
-          <w:sz w:val="24"/>
+          <w:sz w:val="23"/>
         </w:rPr>
         <w:t>Task 1.5: Remove Files and Directories</w:t>
       </w:r>
@@ -486,25 +384,17 @@
       <w:r>
         <w:rPr>
           <w:b/>
-          <w:color w:val="283593"/>
-          <w:sz w:val="20"/>
+          <w:sz w:val="19"/>
         </w:rPr>
-        <w:t>Command Executed:</w:t>
-        <w:br/>
+        <w:t xml:space="preserve">Command: </w:t>
       </w:r>
       <w:r>
         <w:rPr>
           <w:rFonts w:ascii="Courier New" w:hAnsi="Courier New"/>
           <w:color w:val="1B5E20"/>
-          <w:sz w:val="20"/>
+          <w:sz w:val="19"/>
         </w:rPr>
-        <w:t>rm old_greeting.txt</w:t>
-        <w:br/>
-        <w:t>mkdir temp_dir</w:t>
-        <w:br/>
-        <w:t>rmdir temp_dir</w:t>
-        <w:br/>
-        <w:t>ls -l</w:t>
+        <w:t>rm old_greeting.txt &amp;&amp; mkdir temp_dir &amp;&amp; rmdir temp_dir</w:t>
       </w:r>
     </w:p>
     <w:p>
@@ -550,34 +440,17 @@
       <w:r>
         <w:rPr>
           <w:b/>
-          <w:color w:val="0D47A1"/>
-          <w:sz w:val="21"/>
+          <w:color w:val="1A237E"/>
+          <w:sz w:val="20"/>
         </w:rPr>
-        <w:t xml:space="preserve">What was done in this step: </w:t>
+        <w:t xml:space="preserve">Description: </w:t>
       </w:r>
       <w:r>
         <w:rPr>
-          <w:color w:val="212121"/>
-          <w:sz w:val="21"/>
+          <w:color w:val="282828"/>
+          <w:sz w:val="20"/>
         </w:rPr>
-        <w:t>In this step, I practiced directory and file cleanup. I deleted 'old_greeting.txt' using the 'rm' command. Next, I created a temporary directory named 'temp_dir' with 'mkdir', and subsequently removed the empty directory using 'rmdir'.</w:t>
-      </w:r>
-    </w:p>
-    <w:p>
-      <w:r>
-        <w:rPr>
-          <w:b/>
-          <w:color w:val="2E7D32"/>
-          <w:sz w:val="21"/>
-        </w:rPr>
-        <w:t xml:space="preserve">Screenshot Output &amp; Observation: </w:t>
-      </w:r>
-      <w:r>
-        <w:rPr>
-          <w:color w:val="212121"/>
-          <w:sz w:val="21"/>
-        </w:rPr>
-        <w:t>The screenshot shows that 'old_greeting.txt' and 'temp_dir' were deleted cleanly, leaving only 'greeting.txt' in the working folder.</w:t>
+        <w:t>We ran this command to remove old_greeting.txt and test creating and removing an empty directory.</w:t>
       </w:r>
     </w:p>
     <w:p/>
@@ -585,27 +458,24 @@
       <w:r>
         <w:rPr>
           <w:b/>
-          <w:color w:val="212121"/>
-          <w:sz w:val="24"/>
+          <w:sz w:val="23"/>
         </w:rPr>
-        <w:t>Task 1.6: Check Linux File Permissions</w:t>
+        <w:t>Task 1.6: Check Permissions</w:t>
       </w:r>
     </w:p>
     <w:p>
       <w:r>
         <w:rPr>
           <w:b/>
-          <w:color w:val="283593"/>
-          <w:sz w:val="20"/>
+          <w:sz w:val="19"/>
         </w:rPr>
-        <w:t>Command Executed:</w:t>
-        <w:br/>
+        <w:t xml:space="preserve">Command: </w:t>
       </w:r>
       <w:r>
         <w:rPr>
           <w:rFonts w:ascii="Courier New" w:hAnsi="Courier New"/>
           <w:color w:val="1B5E20"/>
-          <w:sz w:val="20"/>
+          <w:sz w:val="19"/>
         </w:rPr>
         <w:t>ls -l greeting.txt</w:t>
       </w:r>
@@ -653,34 +523,17 @@
       <w:r>
         <w:rPr>
           <w:b/>
-          <w:color w:val="0D47A1"/>
-          <w:sz w:val="21"/>
+          <w:color w:val="1A237E"/>
+          <w:sz w:val="20"/>
         </w:rPr>
-        <w:t xml:space="preserve">What was done in this step: </w:t>
+        <w:t xml:space="preserve">Description: </w:t>
       </w:r>
       <w:r>
         <w:rPr>
-          <w:color w:val="212121"/>
-          <w:sz w:val="21"/>
+          <w:color w:val="282828"/>
+          <w:sz w:val="20"/>
         </w:rPr>
-        <w:t>In this step, I checked the POSIX file permission attributes, owner, group, file size, and timestamp of 'greeting.txt' using 'ls -l'.</w:t>
-      </w:r>
-    </w:p>
-    <w:p>
-      <w:r>
-        <w:rPr>
-          <w:b/>
-          <w:color w:val="2E7D32"/>
-          <w:sz w:val="21"/>
-        </w:rPr>
-        <w:t xml:space="preserve">Screenshot Output &amp; Observation: </w:t>
-      </w:r>
-      <w:r>
-        <w:rPr>
-          <w:color w:val="212121"/>
-          <w:sz w:val="21"/>
-        </w:rPr>
-        <w:t>The screenshot shows '-rw-rw-r-- 1 dibij dibij 13', demonstrating that the owner ('dibij') and group have read-write permissions while others have read-only access.</w:t>
+        <w:t>We ran this command to view the file permissions and ownership of greeting.txt.</w:t>
       </w:r>
     </w:p>
     <w:p/>
@@ -689,7 +542,7 @@
         <w:rPr>
           <w:b/>
           <w:color w:val="0D47A1"/>
-          <w:sz w:val="30"/>
+          <w:sz w:val="28"/>
         </w:rPr>
         <w:t>Part II: APT Package Management</w:t>
       </w:r>
@@ -698,27 +551,24 @@
       <w:r>
         <w:rPr>
           <w:b/>
-          <w:color w:val="212121"/>
-          <w:sz w:val="24"/>
+          <w:sz w:val="23"/>
         </w:rPr>
-        <w:t>Task 2.1: Update the Package Index</w:t>
+        <w:t>Task 2.1: Update Package List</w:t>
       </w:r>
     </w:p>
     <w:p>
       <w:r>
         <w:rPr>
           <w:b/>
-          <w:color w:val="283593"/>
-          <w:sz w:val="20"/>
+          <w:sz w:val="19"/>
         </w:rPr>
-        <w:t>Command Executed:</w:t>
-        <w:br/>
+        <w:t xml:space="preserve">Command: </w:t>
       </w:r>
       <w:r>
         <w:rPr>
           <w:rFonts w:ascii="Courier New" w:hAnsi="Courier New"/>
           <w:color w:val="1B5E20"/>
-          <w:sz w:val="20"/>
+          <w:sz w:val="19"/>
         </w:rPr>
         <w:t>sudo apt update</w:t>
       </w:r>
@@ -766,34 +616,17 @@
       <w:r>
         <w:rPr>
           <w:b/>
-          <w:color w:val="0D47A1"/>
-          <w:sz w:val="21"/>
+          <w:color w:val="1A237E"/>
+          <w:sz w:val="20"/>
         </w:rPr>
-        <w:t xml:space="preserve">What was done in this step: </w:t>
+        <w:t xml:space="preserve">Description: </w:t>
       </w:r>
       <w:r>
         <w:rPr>
-          <w:color w:val="212121"/>
-          <w:sz w:val="21"/>
+          <w:color w:val="282828"/>
+          <w:sz w:val="20"/>
         </w:rPr>
-        <w:t>In this step, I ran 'sudo apt update' to refresh my local APT package index with the latest software versions and security patches from the official Ubuntu repositories.</w:t>
-      </w:r>
-    </w:p>
-    <w:p>
-      <w:r>
-        <w:rPr>
-          <w:b/>
-          <w:color w:val="2E7D32"/>
-          <w:sz w:val="21"/>
-        </w:rPr>
-        <w:t xml:space="preserve">Screenshot Output &amp; Observation: </w:t>
-      </w:r>
-      <w:r>
-        <w:rPr>
-          <w:color w:val="212121"/>
-          <w:sz w:val="21"/>
-        </w:rPr>
-        <w:t>The screenshot shows APT querying repository mirrors (noble, noble-updates, noble-security) and concluding with 'All packages are up to date.'</w:t>
+        <w:t>We ran this command to update the package list from the repositories.</w:t>
       </w:r>
     </w:p>
     <w:p/>
@@ -801,27 +634,24 @@
       <w:r>
         <w:rPr>
           <w:b/>
-          <w:color w:val="212121"/>
-          <w:sz w:val="24"/>
+          <w:sz w:val="23"/>
         </w:rPr>
-        <w:t>Task 2.2: Install GCC Compiler &amp; Build Essentials</w:t>
+        <w:t>Task 2.2: Install GCC Compiler</w:t>
       </w:r>
     </w:p>
     <w:p>
       <w:r>
         <w:rPr>
           <w:b/>
-          <w:color w:val="283593"/>
-          <w:sz w:val="20"/>
+          <w:sz w:val="19"/>
         </w:rPr>
-        <w:t>Command Executed:</w:t>
-        <w:br/>
+        <w:t xml:space="preserve">Command: </w:t>
       </w:r>
       <w:r>
         <w:rPr>
           <w:rFonts w:ascii="Courier New" w:hAnsi="Courier New"/>
           <w:color w:val="1B5E20"/>
-          <w:sz w:val="20"/>
+          <w:sz w:val="19"/>
         </w:rPr>
         <w:t>sudo apt install build-essential -y</w:t>
       </w:r>
@@ -869,34 +699,17 @@
       <w:r>
         <w:rPr>
           <w:b/>
-          <w:color w:val="0D47A1"/>
-          <w:sz w:val="21"/>
+          <w:color w:val="1A237E"/>
+          <w:sz w:val="20"/>
         </w:rPr>
-        <w:t xml:space="preserve">What was done in this step: </w:t>
+        <w:t xml:space="preserve">Description: </w:t>
       </w:r>
       <w:r>
         <w:rPr>
-          <w:color w:val="212121"/>
-          <w:sz w:val="21"/>
+          <w:color w:val="282828"/>
+          <w:sz w:val="20"/>
         </w:rPr>
-        <w:t>In this step, I used the APT package manager to install 'build-essential', a package containing GNU C/C++ compilers, make utilities, and essential libraries needed for compiling software on Linux.</w:t>
-      </w:r>
-    </w:p>
-    <w:p>
-      <w:r>
-        <w:rPr>
-          <w:b/>
-          <w:color w:val="2E7D32"/>
-          <w:sz w:val="21"/>
-        </w:rPr>
-        <w:t xml:space="preserve">Screenshot Output &amp; Observation: </w:t>
-      </w:r>
-      <w:r>
-        <w:rPr>
-          <w:color w:val="212121"/>
-          <w:sz w:val="21"/>
-        </w:rPr>
-        <w:t>The screenshot verifies that 'build-essential' is installed and at the newest version (12.10ubuntu1).</w:t>
+        <w:t>We ran this command to install the build-essential package containing the GCC compiler.</w:t>
       </w:r>
     </w:p>
     <w:p/>
@@ -904,27 +717,24 @@
       <w:r>
         <w:rPr>
           <w:b/>
-          <w:color w:val="212121"/>
-          <w:sz w:val="24"/>
+          <w:sz w:val="23"/>
         </w:rPr>
-        <w:t>Task 2.3: Verify GCC Compiler Installation</w:t>
+        <w:t>Task 2.3: Verify GCC Installation</w:t>
       </w:r>
     </w:p>
     <w:p>
       <w:r>
         <w:rPr>
           <w:b/>
-          <w:color w:val="283593"/>
-          <w:sz w:val="20"/>
+          <w:sz w:val="19"/>
         </w:rPr>
-        <w:t>Command Executed:</w:t>
-        <w:br/>
+        <w:t xml:space="preserve">Command: </w:t>
       </w:r>
       <w:r>
         <w:rPr>
           <w:rFonts w:ascii="Courier New" w:hAnsi="Courier New"/>
           <w:color w:val="1B5E20"/>
-          <w:sz w:val="20"/>
+          <w:sz w:val="19"/>
         </w:rPr>
         <w:t>gcc --version</w:t>
       </w:r>
@@ -972,34 +782,17 @@
       <w:r>
         <w:rPr>
           <w:b/>
-          <w:color w:val="0D47A1"/>
-          <w:sz w:val="21"/>
+          <w:color w:val="1A237E"/>
+          <w:sz w:val="20"/>
         </w:rPr>
-        <w:t xml:space="preserve">What was done in this step: </w:t>
+        <w:t xml:space="preserve">Description: </w:t>
       </w:r>
       <w:r>
         <w:rPr>
-          <w:color w:val="212121"/>
-          <w:sz w:val="21"/>
+          <w:color w:val="282828"/>
+          <w:sz w:val="20"/>
         </w:rPr>
-        <w:t>In this step, I executed 'gcc --version' to confirm that the GNU C compiler is installed, accessible in the system PATH, and ready for compiling C code.</w:t>
-      </w:r>
-    </w:p>
-    <w:p>
-      <w:r>
-        <w:rPr>
-          <w:b/>
-          <w:color w:val="2E7D32"/>
-          <w:sz w:val="21"/>
-        </w:rPr>
-        <w:t xml:space="preserve">Screenshot Output &amp; Observation: </w:t>
-      </w:r>
-      <w:r>
-        <w:rPr>
-          <w:color w:val="212121"/>
-          <w:sz w:val="21"/>
-        </w:rPr>
-        <w:t>The screenshot shows 'gcc (Ubuntu 13.3.0-6ubuntu2~24.04) 13.3.0', confirming GCC 13 is fully functional.</w:t>
+        <w:t>We ran this command to verify that the GCC compiler is successfully installed.</w:t>
       </w:r>
     </w:p>
     <w:p/>
@@ -1007,29 +800,26 @@
       <w:r>
         <w:rPr>
           <w:b/>
-          <w:color w:val="212121"/>
-          <w:sz w:val="24"/>
+          <w:sz w:val="23"/>
         </w:rPr>
-        <w:t>Task 2.4: Search for Packages via APT</w:t>
+        <w:t>Task 2.4: Search for Packages</w:t>
       </w:r>
     </w:p>
     <w:p>
       <w:r>
         <w:rPr>
           <w:b/>
-          <w:color w:val="283593"/>
-          <w:sz w:val="20"/>
+          <w:sz w:val="19"/>
         </w:rPr>
-        <w:t>Command Executed:</w:t>
-        <w:br/>
+        <w:t xml:space="preserve">Command: </w:t>
       </w:r>
       <w:r>
         <w:rPr>
           <w:rFonts w:ascii="Courier New" w:hAnsi="Courier New"/>
           <w:color w:val="1B5E20"/>
-          <w:sz w:val="20"/>
+          <w:sz w:val="19"/>
         </w:rPr>
-        <w:t>apt search python3 | head -n 8</w:t>
+        <w:t>apt search python3</w:t>
       </w:r>
     </w:p>
     <w:p>
@@ -1075,34 +865,17 @@
       <w:r>
         <w:rPr>
           <w:b/>
-          <w:color w:val="0D47A1"/>
-          <w:sz w:val="21"/>
+          <w:color w:val="1A237E"/>
+          <w:sz w:val="20"/>
         </w:rPr>
-        <w:t xml:space="preserve">What was done in this step: </w:t>
+        <w:t xml:space="preserve">Description: </w:t>
       </w:r>
       <w:r>
         <w:rPr>
-          <w:color w:val="212121"/>
-          <w:sz w:val="21"/>
+          <w:color w:val="282828"/>
+          <w:sz w:val="20"/>
         </w:rPr>
-        <w:t>In this step, I used 'apt search python3' to search the repository database for Python packages and piped the result through 'head' to display the top search hits.</w:t>
-      </w:r>
-    </w:p>
-    <w:p>
-      <w:r>
-        <w:rPr>
-          <w:b/>
-          <w:color w:val="2E7D32"/>
-          <w:sz w:val="21"/>
-        </w:rPr>
-        <w:t xml:space="preserve">Screenshot Output &amp; Observation: </w:t>
-      </w:r>
-      <w:r>
-        <w:rPr>
-          <w:color w:val="212121"/>
-          <w:sz w:val="21"/>
-        </w:rPr>
-        <w:t>The screenshot shows APT returning the available 'python3' package descriptions directly from the repository index.</w:t>
+        <w:t>We ran this command to search for python3 packages available in the repository.</w:t>
       </w:r>
     </w:p>
     <w:p/>
@@ -1111,36 +884,33 @@
         <w:rPr>
           <w:b/>
           <w:color w:val="0D47A1"/>
-          <w:sz w:val="30"/>
+          <w:sz w:val="28"/>
         </w:rPr>
-        <w:t>Part III: C Compilation &amp; Iterative Development</w:t>
+        <w:t>Part III: C Compilation</w:t>
       </w:r>
     </w:p>
     <w:p>
       <w:r>
         <w:rPr>
           <w:b/>
-          <w:color w:val="212121"/>
-          <w:sz w:val="24"/>
+          <w:sz w:val="23"/>
         </w:rPr>
-        <w:t>Task 3.1: Write C Source File (hello.c)</w:t>
+        <w:t>Task 3.1: Write C Source Code</w:t>
       </w:r>
     </w:p>
     <w:p>
       <w:r>
         <w:rPr>
           <w:b/>
-          <w:color w:val="283593"/>
-          <w:sz w:val="20"/>
+          <w:sz w:val="19"/>
         </w:rPr>
-        <w:t>Command Executed:</w:t>
-        <w:br/>
+        <w:t xml:space="preserve">Command: </w:t>
       </w:r>
       <w:r>
         <w:rPr>
           <w:rFonts w:ascii="Courier New" w:hAnsi="Courier New"/>
           <w:color w:val="1B5E20"/>
-          <w:sz w:val="20"/>
+          <w:sz w:val="19"/>
         </w:rPr>
         <w:t>nano hello.c</w:t>
       </w:r>
@@ -1188,34 +958,17 @@
       <w:r>
         <w:rPr>
           <w:b/>
-          <w:color w:val="0D47A1"/>
-          <w:sz w:val="21"/>
+          <w:color w:val="1A237E"/>
+          <w:sz w:val="20"/>
         </w:rPr>
-        <w:t xml:space="preserve">What was done in this step: </w:t>
+        <w:t xml:space="preserve">Description: </w:t>
       </w:r>
       <w:r>
         <w:rPr>
-          <w:color w:val="212121"/>
-          <w:sz w:val="21"/>
+          <w:color w:val="282828"/>
+          <w:sz w:val="20"/>
         </w:rPr>
-        <w:t>In this step, I created a C source code file named 'hello.c' using nano. I wrote a program that defines integer variables a=10 and b=5, prints 'Hello, Linux Lab!', and calculates and prints their sum (a + b).</w:t>
-      </w:r>
-    </w:p>
-    <w:p>
-      <w:r>
-        <w:rPr>
-          <w:b/>
-          <w:color w:val="2E7D32"/>
-          <w:sz w:val="21"/>
-        </w:rPr>
-        <w:t xml:space="preserve">Screenshot Output &amp; Observation: </w:t>
-      </w:r>
-      <w:r>
-        <w:rPr>
-          <w:color w:val="212121"/>
-          <w:sz w:val="21"/>
-        </w:rPr>
-        <w:t>The screenshot captures the complete C code inside the Nano editor before saving.</w:t>
+        <w:t>We ran this command to write the hello.c source code calculating the sum of two numbers.</w:t>
       </w:r>
     </w:p>
     <w:p/>
@@ -1223,33 +976,26 @@
       <w:r>
         <w:rPr>
           <w:b/>
-          <w:color w:val="212121"/>
-          <w:sz w:val="24"/>
+          <w:sz w:val="23"/>
         </w:rPr>
-        <w:t>Task 3.2: Compile and Execute C Program</w:t>
+        <w:t>Task 3.2: Compile and Run Program</w:t>
       </w:r>
     </w:p>
     <w:p>
       <w:r>
         <w:rPr>
           <w:b/>
-          <w:color w:val="283593"/>
-          <w:sz w:val="20"/>
+          <w:sz w:val="19"/>
         </w:rPr>
-        <w:t>Command Executed:</w:t>
-        <w:br/>
+        <w:t xml:space="preserve">Command: </w:t>
       </w:r>
       <w:r>
         <w:rPr>
           <w:rFonts w:ascii="Courier New" w:hAnsi="Courier New"/>
           <w:color w:val="1B5E20"/>
-          <w:sz w:val="20"/>
+          <w:sz w:val="19"/>
         </w:rPr>
-        <w:t>gcc hello.c -o hello_program</w:t>
-        <w:br/>
-        <w:t>ls -l hello_program</w:t>
-        <w:br/>
-        <w:t>./hello_program</w:t>
+        <w:t>gcc hello.c -o hello_program &amp;&amp; ./hello_program</w:t>
       </w:r>
     </w:p>
     <w:p>
@@ -1295,34 +1041,17 @@
       <w:r>
         <w:rPr>
           <w:b/>
-          <w:color w:val="0D47A1"/>
-          <w:sz w:val="21"/>
+          <w:color w:val="1A237E"/>
+          <w:sz w:val="20"/>
         </w:rPr>
-        <w:t xml:space="preserve">What was done in this step: </w:t>
+        <w:t xml:space="preserve">Description: </w:t>
       </w:r>
       <w:r>
         <w:rPr>
-          <w:color w:val="212121"/>
-          <w:sz w:val="21"/>
+          <w:color w:val="282828"/>
+          <w:sz w:val="20"/>
         </w:rPr>
-        <w:t>In this step, I compiled the source file 'hello.c' into an executable binary called 'hello_program' using 'gcc -o'. I verified the executable flag with 'ls -l' and ran the binary using './hello_program'.</w:t>
-      </w:r>
-    </w:p>
-    <w:p>
-      <w:r>
-        <w:rPr>
-          <w:b/>
-          <w:color w:val="2E7D32"/>
-          <w:sz w:val="21"/>
-        </w:rPr>
-        <w:t xml:space="preserve">Screenshot Output &amp; Observation: </w:t>
-      </w:r>
-      <w:r>
-        <w:rPr>
-          <w:color w:val="212121"/>
-          <w:sz w:val="21"/>
-        </w:rPr>
-        <w:t>The screenshot shows the executable created with '-rwxrwxr-x' permissions. Running './hello_program' printed 'Hello, Linux Lab!' and 'Sum of 10 and 5 is 15'.</w:t>
+        <w:t>We ran this command to compile hello.c into an executable and run it to see the output.</w:t>
       </w:r>
     </w:p>
     <w:p/>
@@ -1330,31 +1059,26 @@
       <w:r>
         <w:rPr>
           <w:b/>
-          <w:color w:val="212121"/>
-          <w:sz w:val="24"/>
+          <w:sz w:val="23"/>
         </w:rPr>
-        <w:t>Task 3.3: Compile with Warning Flags Enabled (-Wall)</w:t>
+        <w:t>Task 3.3: Compile with Warnings Enabled</w:t>
       </w:r>
     </w:p>
     <w:p>
       <w:r>
         <w:rPr>
           <w:b/>
-          <w:color w:val="283593"/>
-          <w:sz w:val="20"/>
+          <w:sz w:val="19"/>
         </w:rPr>
-        <w:t>Command Executed:</w:t>
-        <w:br/>
+        <w:t xml:space="preserve">Command: </w:t>
       </w:r>
       <w:r>
         <w:rPr>
           <w:rFonts w:ascii="Courier New" w:hAnsi="Courier New"/>
           <w:color w:val="1B5E20"/>
-          <w:sz w:val="20"/>
+          <w:sz w:val="19"/>
         </w:rPr>
-        <w:t>gcc -Wall hello.c -o hello_program_warn</w:t>
-        <w:br/>
-        <w:t>./hello_program_warn</w:t>
+        <w:t>gcc -Wall hello.c -o hello_program_warn &amp;&amp; ./hello_program_warn</w:t>
       </w:r>
     </w:p>
     <w:p>
@@ -1400,34 +1124,17 @@
       <w:r>
         <w:rPr>
           <w:b/>
-          <w:color w:val="0D47A1"/>
-          <w:sz w:val="21"/>
+          <w:color w:val="1A237E"/>
+          <w:sz w:val="20"/>
         </w:rPr>
-        <w:t xml:space="preserve">What was done in this step: </w:t>
+        <w:t xml:space="preserve">Description: </w:t>
       </w:r>
       <w:r>
         <w:rPr>
-          <w:color w:val="212121"/>
-          <w:sz w:val="21"/>
+          <w:color w:val="282828"/>
+          <w:sz w:val="20"/>
         </w:rPr>
-        <w:t>In this step, I applied compiler best practices by compiling with the '-Wall' (all warnings) flag enabled. This helps diagnose uninitialized variables, format errors, or deprecated calls.</w:t>
-      </w:r>
-    </w:p>
-    <w:p>
-      <w:r>
-        <w:rPr>
-          <w:b/>
-          <w:color w:val="2E7D32"/>
-          <w:sz w:val="21"/>
-        </w:rPr>
-        <w:t xml:space="preserve">Screenshot Output &amp; Observation: </w:t>
-      </w:r>
-      <w:r>
-        <w:rPr>
-          <w:color w:val="212121"/>
-          <w:sz w:val="21"/>
-        </w:rPr>
-        <w:t>The screenshot confirms that the program compiled cleanly with zero warnings, and './hello_program_warn' executed with the correct output.</w:t>
+        <w:t>We ran this command to compile with all compiler warnings enabled to ensure code safety.</w:t>
       </w:r>
     </w:p>
     <w:p/>
@@ -1435,33 +1142,26 @@
       <w:r>
         <w:rPr>
           <w:b/>
-          <w:color w:val="212121"/>
-          <w:sz w:val="24"/>
+          <w:sz w:val="23"/>
         </w:rPr>
-        <w:t>Task 3.4: Modify Values and Recompile (Iterative Development)</w:t>
+        <w:t>Task 3.4: Modify and Recompile</w:t>
       </w:r>
     </w:p>
     <w:p>
       <w:r>
         <w:rPr>
           <w:b/>
-          <w:color w:val="283593"/>
-          <w:sz w:val="20"/>
+          <w:sz w:val="19"/>
         </w:rPr>
-        <w:t>Command Executed:</w:t>
-        <w:br/>
+        <w:t xml:space="preserve">Command: </w:t>
       </w:r>
       <w:r>
         <w:rPr>
           <w:rFonts w:ascii="Courier New" w:hAnsi="Courier New"/>
           <w:color w:val="1B5E20"/>
-          <w:sz w:val="20"/>
+          <w:sz w:val="19"/>
         </w:rPr>
-        <w:t># Edited hello.c (changed a=100, b=200)</w:t>
-        <w:br/>
-        <w:t>gcc -Wall hello.c -o hello_program</w:t>
-        <w:br/>
-        <w:t>./hello_program</w:t>
+        <w:t>gcc -Wall hello.c -o hello_program &amp;&amp; ./hello_program</w:t>
       </w:r>
     </w:p>
     <w:p>
@@ -1507,34 +1207,17 @@
       <w:r>
         <w:rPr>
           <w:b/>
-          <w:color w:val="0D47A1"/>
-          <w:sz w:val="21"/>
+          <w:color w:val="1A237E"/>
+          <w:sz w:val="20"/>
         </w:rPr>
-        <w:t xml:space="preserve">What was done in this step: </w:t>
+        <w:t xml:space="preserve">Description: </w:t>
       </w:r>
       <w:r>
         <w:rPr>
-          <w:color w:val="212121"/>
-          <w:sz w:val="21"/>
+          <w:color w:val="282828"/>
+          <w:sz w:val="20"/>
         </w:rPr>
-        <w:t>In this step, I practiced iterative development by modifying 'hello.c' so that a=100 and b=200. I recompiled the program using 'gcc -Wall' and ran the executable to verify that the output updated dynamically.</w:t>
-      </w:r>
-    </w:p>
-    <w:p>
-      <w:r>
-        <w:rPr>
-          <w:b/>
-          <w:color w:val="2E7D32"/>
-          <w:sz w:val="21"/>
-        </w:rPr>
-        <w:t xml:space="preserve">Screenshot Output &amp; Observation: </w:t>
-      </w:r>
-      <w:r>
-        <w:rPr>
-          <w:color w:val="212121"/>
-          <w:sz w:val="21"/>
-        </w:rPr>
-        <w:t>The screenshot shows the output updating to 'Sum of 100 and 200 is 300', demonstrating proper recompilation.</w:t>
+        <w:t>We ran this command to recompile and run the program after updating the variables to 100 and 200.</w:t>
       </w:r>
     </w:p>
     <w:p/>
@@ -1543,7 +1226,7 @@
         <w:rPr>
           <w:b/>
           <w:color w:val="0D47A1"/>
-          <w:sz w:val="30"/>
+          <w:sz w:val="28"/>
         </w:rPr>
         <w:t>Part IV: Cleanup &amp; Verification</w:t>
       </w:r>
@@ -1552,31 +1235,26 @@
       <w:r>
         <w:rPr>
           <w:b/>
-          <w:color w:val="212121"/>
-          <w:sz w:val="24"/>
+          <w:sz w:val="23"/>
         </w:rPr>
-        <w:t>Task 4.1: Return Home &amp; Inspect Lab Files</w:t>
+        <w:t>Task 4.1: List Directory Files with Details</w:t>
       </w:r>
     </w:p>
     <w:p>
       <w:r>
         <w:rPr>
           <w:b/>
-          <w:color w:val="283593"/>
-          <w:sz w:val="20"/>
+          <w:sz w:val="19"/>
         </w:rPr>
-        <w:t>Command Executed:</w:t>
-        <w:br/>
+        <w:t xml:space="preserve">Command: </w:t>
       </w:r>
       <w:r>
         <w:rPr>
           <w:rFonts w:ascii="Courier New" w:hAnsi="Courier New"/>
           <w:color w:val="1B5E20"/>
-          <w:sz w:val="20"/>
+          <w:sz w:val="19"/>
         </w:rPr>
-        <w:t>cd ~</w:t>
-        <w:br/>
-        <w:t>ls -lh ~/linux_lab/</w:t>
+        <w:t>cd ~ &amp;&amp; ls -lh ~/linux_lab/</w:t>
       </w:r>
     </w:p>
     <w:p>
@@ -1622,34 +1300,17 @@
       <w:r>
         <w:rPr>
           <w:b/>
-          <w:color w:val="0D47A1"/>
-          <w:sz w:val="21"/>
+          <w:color w:val="1A237E"/>
+          <w:sz w:val="20"/>
         </w:rPr>
-        <w:t xml:space="preserve">What was done in this step: </w:t>
+        <w:t xml:space="preserve">Description: </w:t>
       </w:r>
       <w:r>
         <w:rPr>
-          <w:color w:val="212121"/>
-          <w:sz w:val="21"/>
+          <w:color w:val="282828"/>
+          <w:sz w:val="20"/>
         </w:rPr>
-        <w:t>In this step, I navigated back to the user home directory with 'cd ~' and ran 'ls -lh ~/linux_lab/' with human-readable file sizes to review all files generated during the lab session.</w:t>
-      </w:r>
-    </w:p>
-    <w:p>
-      <w:r>
-        <w:rPr>
-          <w:b/>
-          <w:color w:val="2E7D32"/>
-          <w:sz w:val="21"/>
-        </w:rPr>
-        <w:t xml:space="preserve">Screenshot Output &amp; Observation: </w:t>
-      </w:r>
-      <w:r>
-        <w:rPr>
-          <w:color w:val="212121"/>
-          <w:sz w:val="21"/>
-        </w:rPr>
-        <w:t>The screenshot lists 'greeting.txt', 'hello.c', 'hello_program', and 'hello_program_warn' with their exact sizes and permissions.</w:t>
+        <w:t>We ran this command to list all files created in the lab directory with their details.</w:t>
       </w:r>
     </w:p>
     <w:p/>
@@ -1657,27 +1318,24 @@
       <w:r>
         <w:rPr>
           <w:b/>
-          <w:color w:val="212121"/>
-          <w:sz w:val="24"/>
+          <w:sz w:val="23"/>
         </w:rPr>
-        <w:t>Task 4.2: Final Source Code Review</w:t>
+        <w:t>Task 4.2: View Final C File Content</w:t>
       </w:r>
     </w:p>
     <w:p>
       <w:r>
         <w:rPr>
           <w:b/>
-          <w:color w:val="283593"/>
-          <w:sz w:val="20"/>
+          <w:sz w:val="19"/>
         </w:rPr>
-        <w:t>Command Executed:</w:t>
-        <w:br/>
+        <w:t xml:space="preserve">Command: </w:t>
       </w:r>
       <w:r>
         <w:rPr>
           <w:rFonts w:ascii="Courier New" w:hAnsi="Courier New"/>
           <w:color w:val="1B5E20"/>
-          <w:sz w:val="20"/>
+          <w:sz w:val="19"/>
         </w:rPr>
         <w:t>cat ~/linux_lab/hello.c</w:t>
       </w:r>
@@ -1725,34 +1383,17 @@
       <w:r>
         <w:rPr>
           <w:b/>
-          <w:color w:val="0D47A1"/>
-          <w:sz w:val="21"/>
+          <w:color w:val="1A237E"/>
+          <w:sz w:val="20"/>
         </w:rPr>
-        <w:t xml:space="preserve">What was done in this step: </w:t>
+        <w:t xml:space="preserve">Description: </w:t>
       </w:r>
       <w:r>
         <w:rPr>
-          <w:color w:val="212121"/>
-          <w:sz w:val="21"/>
+          <w:color w:val="282828"/>
+          <w:sz w:val="20"/>
         </w:rPr>
-        <w:t>In this step, I performed a final integrity check on my C program source code by displaying it with 'cat ~/linux_lab/hello.c' from the home directory.</w:t>
-      </w:r>
-    </w:p>
-    <w:p>
-      <w:r>
-        <w:rPr>
-          <w:b/>
-          <w:color w:val="2E7D32"/>
-          <w:sz w:val="21"/>
-        </w:rPr>
-        <w:t xml:space="preserve">Screenshot Output &amp; Observation: </w:t>
-      </w:r>
-      <w:r>
-        <w:rPr>
-          <w:color w:val="212121"/>
-          <w:sz w:val="21"/>
-        </w:rPr>
-        <w:t>The screenshot displays the complete modified source code of 'hello.c' as the final submission artifact.</w:t>
+        <w:t>We ran this command to view the final source code of hello.c.</w:t>
       </w:r>
     </w:p>
     <w:p/>

</xml_diff>